<commit_message>
Redesign REBA Word report template
</commit_message>
<xml_diff>
--- a/templates/근골격계_유해요인조사표_법정서식_템플릿.docx
+++ b/templates/근골격계_유해요인조사표_법정서식_템플릿.docx
@@ -4,41 +4,45 @@
   <w:body>
     <w:p>
       <w:pPr>
-        <w:spacing w:before="120" w:after="20" w:line="240" w:lineRule="auto"/>
+        <w:spacing w:before="0" w:after="60" w:line="300" w:lineRule="auto"/>
         <w:jc w:val="center"/>
       </w:pPr>
       <w:r>
         <w:rPr>
-          <w:rFonts w:ascii="NanumSquare" w:hAnsi="NanumSquare" w:eastAsia="NanumSquare"/>
+          <w:rFonts w:ascii="맑은 고딕" w:hAnsi="맑은 고딕" w:eastAsia="맑은 고딕"/>
           <w:b/>
-          <w:sz w:val="40"/>
+          <w:color w:val="222222"/>
+          <w:sz w:val="18"/>
         </w:rPr>
         <w:t>근 골 격 계  유 해 요 인 조 사 표</w:t>
       </w:r>
     </w:p>
     <w:p>
       <w:pPr>
-        <w:spacing w:before="0" w:after="180" w:line="240" w:lineRule="auto"/>
+        <w:spacing w:before="0" w:after="60" w:line="300" w:lineRule="auto"/>
         <w:jc w:val="center"/>
       </w:pPr>
       <w:r>
         <w:rPr>
-          <w:rFonts w:ascii="NanumSquare" w:hAnsi="NanumSquare" w:eastAsia="NanumSquare"/>
+          <w:rFonts w:ascii="맑은 고딕" w:hAnsi="맑은 고딕" w:eastAsia="맑은 고딕"/>
           <w:b/>
-          <w:sz w:val="19"/>
+          <w:color w:val="222222"/>
+          <w:sz w:val="18"/>
         </w:rPr>
         <w:t>[ 별지 제1호서식 ]</w:t>
       </w:r>
     </w:p>
     <w:p>
       <w:pPr>
-        <w:spacing w:before="80" w:after="80" w:line="240" w:lineRule="auto"/>
+        <w:keepNext/>
+        <w:spacing w:before="180" w:after="100" w:line="300" w:lineRule="auto"/>
       </w:pPr>
       <w:r>
         <w:rPr>
-          <w:rFonts w:ascii="NanumSquare" w:hAnsi="NanumSquare" w:eastAsia="NanumSquare"/>
+          <w:rFonts w:ascii="맑은 고딕" w:hAnsi="맑은 고딕" w:eastAsia="맑은 고딕"/>
           <w:b/>
-          <w:sz w:val="21"/>
+          <w:color w:val="24477E"/>
+          <w:sz w:val="22"/>
         </w:rPr>
         <w:t>가. 조사 개요</w:t>
       </w:r>
@@ -69,25 +73,35 @@
               <w:end w:w="70" w:type="dxa"/>
             </w:tcMar>
             <w:tcBorders>
-              <w:top w:val="single" w:sz="8" w:space="0" w:color="666666"/>
+              <w:top w:val="single" w:sz="4" w:space="0" w:color="B5C1CC"/>
               <w:start w:val="single" w:sz="8" w:space="0" w:color="666666"/>
-              <w:bottom w:val="single" w:sz="8" w:space="0" w:color="666666"/>
+              <w:bottom w:val="single" w:sz="4" w:space="0" w:color="B5C1CC"/>
               <w:end w:val="single" w:sz="8" w:space="0" w:color="666666"/>
               <w:insideH w:val="single" w:sz="8" w:space="0" w:color="666666"/>
               <w:insideV w:val="single" w:sz="8" w:space="0" w:color="666666"/>
+              <w:left w:val="single" w:sz="4" w:color="B5C1CC"/>
+              <w:right w:val="single" w:sz="4" w:color="B5C1CC"/>
             </w:tcBorders>
-            <w:shd w:fill="D9E1EC"/>
+            <w:shd w:fill="E8EFF6"/>
           </w:tcPr>
           <w:p>
             <w:pPr>
-              <w:spacing w:before="0" w:after="0" w:line="240" w:lineRule="auto"/>
+              <w:spacing w:before="40" w:after="40" w:line="276" w:lineRule="auto"/>
               <w:jc w:val="center"/>
             </w:pPr>
-            <w:r/>
             <w:r>
               <w:rPr>
-                <w:rFonts w:ascii="NanumSquare" w:hAnsi="NanumSquare" w:eastAsia="NanumSquare"/>
+                <w:rFonts w:ascii="맑은 고딕" w:hAnsi="맑은 고딕" w:eastAsia="맑은 고딕"/>
                 <w:b/>
+                <w:color w:val="24477E"/>
+                <w:sz w:val="17"/>
+              </w:rPr>
+            </w:r>
+            <w:r>
+              <w:rPr>
+                <w:rFonts w:ascii="맑은 고딕" w:hAnsi="맑은 고딕" w:eastAsia="맑은 고딕"/>
+                <w:b/>
+                <w:color w:val="24477E"/>
                 <w:sz w:val="17"/>
               </w:rPr>
               <w:t>조사구분</w:t>
@@ -105,24 +119,35 @@
               <w:end w:w="70" w:type="dxa"/>
             </w:tcMar>
             <w:tcBorders>
-              <w:top w:val="single" w:sz="8" w:space="0" w:color="666666"/>
+              <w:top w:val="single" w:sz="4" w:space="0" w:color="B5C1CC"/>
               <w:start w:val="single" w:sz="8" w:space="0" w:color="666666"/>
-              <w:bottom w:val="single" w:sz="8" w:space="0" w:color="666666"/>
+              <w:bottom w:val="single" w:sz="4" w:space="0" w:color="B5C1CC"/>
               <w:end w:val="single" w:sz="8" w:space="0" w:color="666666"/>
               <w:insideH w:val="single" w:sz="8" w:space="0" w:color="666666"/>
               <w:insideV w:val="single" w:sz="8" w:space="0" w:color="666666"/>
+              <w:left w:val="single" w:sz="4" w:color="B5C1CC"/>
+              <w:right w:val="single" w:sz="4" w:color="B5C1CC"/>
             </w:tcBorders>
+            <w:shd w:fill="E8EFF6"/>
           </w:tcPr>
           <w:p>
             <w:pPr>
-              <w:spacing w:before="0" w:after="0" w:line="240" w:lineRule="auto"/>
+              <w:spacing w:before="40" w:after="40" w:line="276" w:lineRule="auto"/>
               <w:jc w:val="left"/>
             </w:pPr>
-            <w:r/>
             <w:r>
               <w:rPr>
-                <w:rFonts w:ascii="NanumSquare" w:hAnsi="NanumSquare" w:eastAsia="NanumSquare"/>
-                <w:b w:val="0"/>
+                <w:rFonts w:ascii="맑은 고딕" w:hAnsi="맑은 고딕" w:eastAsia="맑은 고딕"/>
+                <w:b/>
+                <w:color w:val="24477E"/>
+                <w:sz w:val="17"/>
+              </w:rPr>
+            </w:r>
+            <w:r>
+              <w:rPr>
+                <w:rFonts w:ascii="맑은 고딕" w:hAnsi="맑은 고딕" w:eastAsia="맑은 고딕"/>
+                <w:b/>
+                <w:color w:val="24477E"/>
                 <w:sz w:val="17"/>
               </w:rPr>
               <w:t>{{조사구분}}</w:t>
@@ -140,25 +165,35 @@
               <w:end w:w="70" w:type="dxa"/>
             </w:tcMar>
             <w:tcBorders>
-              <w:top w:val="single" w:sz="8" w:space="0" w:color="666666"/>
+              <w:top w:val="single" w:sz="4" w:space="0" w:color="B5C1CC"/>
               <w:start w:val="single" w:sz="8" w:space="0" w:color="666666"/>
-              <w:bottom w:val="single" w:sz="8" w:space="0" w:color="666666"/>
+              <w:bottom w:val="single" w:sz="4" w:space="0" w:color="B5C1CC"/>
               <w:end w:val="single" w:sz="8" w:space="0" w:color="666666"/>
               <w:insideH w:val="single" w:sz="8" w:space="0" w:color="666666"/>
               <w:insideV w:val="single" w:sz="8" w:space="0" w:color="666666"/>
+              <w:left w:val="single" w:sz="4" w:color="B5C1CC"/>
+              <w:right w:val="single" w:sz="4" w:color="B5C1CC"/>
             </w:tcBorders>
-            <w:shd w:fill="D9E1EC"/>
+            <w:shd w:fill="E8EFF6"/>
           </w:tcPr>
           <w:p>
             <w:pPr>
-              <w:spacing w:before="0" w:after="0" w:line="240" w:lineRule="auto"/>
+              <w:spacing w:before="40" w:after="40" w:line="276" w:lineRule="auto"/>
               <w:jc w:val="center"/>
             </w:pPr>
-            <w:r/>
             <w:r>
               <w:rPr>
-                <w:rFonts w:ascii="NanumSquare" w:hAnsi="NanumSquare" w:eastAsia="NanumSquare"/>
+                <w:rFonts w:ascii="맑은 고딕" w:hAnsi="맑은 고딕" w:eastAsia="맑은 고딕"/>
                 <w:b/>
+                <w:color w:val="24477E"/>
+                <w:sz w:val="17"/>
+              </w:rPr>
+            </w:r>
+            <w:r>
+              <w:rPr>
+                <w:rFonts w:ascii="맑은 고딕" w:hAnsi="맑은 고딕" w:eastAsia="맑은 고딕"/>
+                <w:b/>
+                <w:color w:val="24477E"/>
                 <w:sz w:val="17"/>
               </w:rPr>
               <w:t>조사일시</w:t>
@@ -176,24 +211,35 @@
               <w:end w:w="70" w:type="dxa"/>
             </w:tcMar>
             <w:tcBorders>
-              <w:top w:val="single" w:sz="8" w:space="0" w:color="666666"/>
+              <w:top w:val="single" w:sz="4" w:space="0" w:color="B5C1CC"/>
               <w:start w:val="single" w:sz="8" w:space="0" w:color="666666"/>
-              <w:bottom w:val="single" w:sz="8" w:space="0" w:color="666666"/>
+              <w:bottom w:val="single" w:sz="4" w:space="0" w:color="B5C1CC"/>
               <w:end w:val="single" w:sz="8" w:space="0" w:color="666666"/>
               <w:insideH w:val="single" w:sz="8" w:space="0" w:color="666666"/>
               <w:insideV w:val="single" w:sz="8" w:space="0" w:color="666666"/>
+              <w:left w:val="single" w:sz="4" w:color="B5C1CC"/>
+              <w:right w:val="single" w:sz="4" w:color="B5C1CC"/>
             </w:tcBorders>
+            <w:shd w:fill="E8EFF6"/>
           </w:tcPr>
           <w:p>
             <w:pPr>
-              <w:spacing w:before="0" w:after="0" w:line="240" w:lineRule="auto"/>
+              <w:spacing w:before="40" w:after="40" w:line="276" w:lineRule="auto"/>
               <w:jc w:val="left"/>
             </w:pPr>
-            <w:r/>
             <w:r>
               <w:rPr>
-                <w:rFonts w:ascii="NanumSquare" w:hAnsi="NanumSquare" w:eastAsia="NanumSquare"/>
-                <w:b w:val="0"/>
+                <w:rFonts w:ascii="맑은 고딕" w:hAnsi="맑은 고딕" w:eastAsia="맑은 고딕"/>
+                <w:b/>
+                <w:color w:val="24477E"/>
+                <w:sz w:val="17"/>
+              </w:rPr>
+            </w:r>
+            <w:r>
+              <w:rPr>
+                <w:rFonts w:ascii="맑은 고딕" w:hAnsi="맑은 고딕" w:eastAsia="맑은 고딕"/>
+                <w:b/>
+                <w:color w:val="24477E"/>
                 <w:sz w:val="17"/>
               </w:rPr>
               <w:t>{{조사일시}}</w:t>
@@ -213,25 +259,35 @@
               <w:end w:w="70" w:type="dxa"/>
             </w:tcMar>
             <w:tcBorders>
-              <w:top w:val="single" w:sz="8" w:space="0" w:color="666666"/>
+              <w:top w:val="single" w:sz="4" w:space="0" w:color="B5C1CC"/>
               <w:start w:val="single" w:sz="8" w:space="0" w:color="666666"/>
-              <w:bottom w:val="single" w:sz="8" w:space="0" w:color="666666"/>
+              <w:bottom w:val="single" w:sz="4" w:space="0" w:color="B5C1CC"/>
               <w:end w:val="single" w:sz="8" w:space="0" w:color="666666"/>
               <w:insideH w:val="single" w:sz="8" w:space="0" w:color="666666"/>
               <w:insideV w:val="single" w:sz="8" w:space="0" w:color="666666"/>
+              <w:left w:val="single" w:sz="4" w:color="B5C1CC"/>
+              <w:right w:val="single" w:sz="4" w:color="B5C1CC"/>
             </w:tcBorders>
-            <w:shd w:fill="D9E1EC"/>
+            <w:shd w:fill="F2F5F8"/>
           </w:tcPr>
           <w:p>
             <w:pPr>
-              <w:spacing w:before="0" w:after="0" w:line="240" w:lineRule="auto"/>
+              <w:spacing w:before="40" w:after="40" w:line="276" w:lineRule="auto"/>
               <w:jc w:val="center"/>
             </w:pPr>
-            <w:r/>
             <w:r>
               <w:rPr>
-                <w:rFonts w:ascii="NanumSquare" w:hAnsi="NanumSquare" w:eastAsia="NanumSquare"/>
-                <w:b/>
+                <w:rFonts w:ascii="맑은 고딕" w:hAnsi="맑은 고딕" w:eastAsia="맑은 고딕"/>
+                <w:b w:val="0"/>
+                <w:color w:val="222222"/>
+                <w:sz w:val="17"/>
+              </w:rPr>
+            </w:r>
+            <w:r>
+              <w:rPr>
+                <w:rFonts w:ascii="맑은 고딕" w:hAnsi="맑은 고딕" w:eastAsia="맑은 고딕"/>
+                <w:b w:val="0"/>
+                <w:color w:val="222222"/>
                 <w:sz w:val="17"/>
               </w:rPr>
               <w:t>조 사 자</w:t>
@@ -249,24 +305,34 @@
               <w:end w:w="70" w:type="dxa"/>
             </w:tcMar>
             <w:tcBorders>
-              <w:top w:val="single" w:sz="8" w:space="0" w:color="666666"/>
+              <w:top w:val="single" w:sz="4" w:space="0" w:color="B5C1CC"/>
               <w:start w:val="single" w:sz="8" w:space="0" w:color="666666"/>
-              <w:bottom w:val="single" w:sz="8" w:space="0" w:color="666666"/>
+              <w:bottom w:val="single" w:sz="4" w:space="0" w:color="B5C1CC"/>
               <w:end w:val="single" w:sz="8" w:space="0" w:color="666666"/>
               <w:insideH w:val="single" w:sz="8" w:space="0" w:color="666666"/>
               <w:insideV w:val="single" w:sz="8" w:space="0" w:color="666666"/>
+              <w:left w:val="single" w:sz="4" w:color="B5C1CC"/>
+              <w:right w:val="single" w:sz="4" w:color="B5C1CC"/>
             </w:tcBorders>
           </w:tcPr>
           <w:p>
             <w:pPr>
-              <w:spacing w:before="0" w:after="0" w:line="240" w:lineRule="auto"/>
+              <w:spacing w:before="40" w:after="40" w:line="276" w:lineRule="auto"/>
               <w:jc w:val="left"/>
             </w:pPr>
-            <w:r/>
             <w:r>
               <w:rPr>
-                <w:rFonts w:ascii="NanumSquare" w:hAnsi="NanumSquare" w:eastAsia="NanumSquare"/>
+                <w:rFonts w:ascii="맑은 고딕" w:hAnsi="맑은 고딕" w:eastAsia="맑은 고딕"/>
                 <w:b w:val="0"/>
+                <w:color w:val="222222"/>
+                <w:sz w:val="17"/>
+              </w:rPr>
+            </w:r>
+            <w:r>
+              <w:rPr>
+                <w:rFonts w:ascii="맑은 고딕" w:hAnsi="맑은 고딕" w:eastAsia="맑은 고딕"/>
+                <w:b w:val="0"/>
+                <w:color w:val="222222"/>
                 <w:sz w:val="17"/>
               </w:rPr>
               <w:t>{{조사자}}</w:t>
@@ -284,25 +350,35 @@
               <w:end w:w="70" w:type="dxa"/>
             </w:tcMar>
             <w:tcBorders>
-              <w:top w:val="single" w:sz="8" w:space="0" w:color="666666"/>
+              <w:top w:val="single" w:sz="4" w:space="0" w:color="B5C1CC"/>
               <w:start w:val="single" w:sz="8" w:space="0" w:color="666666"/>
-              <w:bottom w:val="single" w:sz="8" w:space="0" w:color="666666"/>
+              <w:bottom w:val="single" w:sz="4" w:space="0" w:color="B5C1CC"/>
               <w:end w:val="single" w:sz="8" w:space="0" w:color="666666"/>
               <w:insideH w:val="single" w:sz="8" w:space="0" w:color="666666"/>
               <w:insideV w:val="single" w:sz="8" w:space="0" w:color="666666"/>
+              <w:left w:val="single" w:sz="4" w:color="B5C1CC"/>
+              <w:right w:val="single" w:sz="4" w:color="B5C1CC"/>
             </w:tcBorders>
             <w:shd w:fill="D9E1EC"/>
           </w:tcPr>
           <w:p>
             <w:pPr>
-              <w:spacing w:before="0" w:after="0" w:line="240" w:lineRule="auto"/>
+              <w:spacing w:before="40" w:after="40" w:line="276" w:lineRule="auto"/>
               <w:jc w:val="center"/>
             </w:pPr>
-            <w:r/>
             <w:r>
               <w:rPr>
-                <w:rFonts w:ascii="NanumSquare" w:hAnsi="NanumSquare" w:eastAsia="NanumSquare"/>
-                <w:b/>
+                <w:rFonts w:ascii="맑은 고딕" w:hAnsi="맑은 고딕" w:eastAsia="맑은 고딕"/>
+                <w:b w:val="0"/>
+                <w:color w:val="222222"/>
+                <w:sz w:val="17"/>
+              </w:rPr>
+            </w:r>
+            <w:r>
+              <w:rPr>
+                <w:rFonts w:ascii="맑은 고딕" w:hAnsi="맑은 고딕" w:eastAsia="맑은 고딕"/>
+                <w:b w:val="0"/>
+                <w:color w:val="222222"/>
                 <w:sz w:val="17"/>
               </w:rPr>
               <w:t>부 서 명</w:t>
@@ -320,24 +396,34 @@
               <w:end w:w="70" w:type="dxa"/>
             </w:tcMar>
             <w:tcBorders>
-              <w:top w:val="single" w:sz="8" w:space="0" w:color="666666"/>
+              <w:top w:val="single" w:sz="4" w:space="0" w:color="B5C1CC"/>
               <w:start w:val="single" w:sz="8" w:space="0" w:color="666666"/>
-              <w:bottom w:val="single" w:sz="8" w:space="0" w:color="666666"/>
+              <w:bottom w:val="single" w:sz="4" w:space="0" w:color="B5C1CC"/>
               <w:end w:val="single" w:sz="8" w:space="0" w:color="666666"/>
               <w:insideH w:val="single" w:sz="8" w:space="0" w:color="666666"/>
               <w:insideV w:val="single" w:sz="8" w:space="0" w:color="666666"/>
+              <w:left w:val="single" w:sz="4" w:color="B5C1CC"/>
+              <w:right w:val="single" w:sz="4" w:color="B5C1CC"/>
             </w:tcBorders>
           </w:tcPr>
           <w:p>
             <w:pPr>
-              <w:spacing w:before="0" w:after="0" w:line="240" w:lineRule="auto"/>
+              <w:spacing w:before="40" w:after="40" w:line="276" w:lineRule="auto"/>
               <w:jc w:val="left"/>
             </w:pPr>
-            <w:r/>
             <w:r>
               <w:rPr>
-                <w:rFonts w:ascii="NanumSquare" w:hAnsi="NanumSquare" w:eastAsia="NanumSquare"/>
+                <w:rFonts w:ascii="맑은 고딕" w:hAnsi="맑은 고딕" w:eastAsia="맑은 고딕"/>
                 <w:b w:val="0"/>
+                <w:color w:val="222222"/>
+                <w:sz w:val="17"/>
+              </w:rPr>
+            </w:r>
+            <w:r>
+              <w:rPr>
+                <w:rFonts w:ascii="맑은 고딕" w:hAnsi="맑은 고딕" w:eastAsia="맑은 고딕"/>
+                <w:b w:val="0"/>
+                <w:color w:val="222222"/>
                 <w:sz w:val="17"/>
               </w:rPr>
               <w:t>{{부서명}}</w:t>
@@ -357,25 +443,35 @@
               <w:end w:w="70" w:type="dxa"/>
             </w:tcMar>
             <w:tcBorders>
-              <w:top w:val="single" w:sz="8" w:space="0" w:color="666666"/>
+              <w:top w:val="single" w:sz="4" w:space="0" w:color="B5C1CC"/>
               <w:start w:val="single" w:sz="8" w:space="0" w:color="666666"/>
-              <w:bottom w:val="single" w:sz="8" w:space="0" w:color="666666"/>
+              <w:bottom w:val="single" w:sz="4" w:space="0" w:color="B5C1CC"/>
               <w:end w:val="single" w:sz="8" w:space="0" w:color="666666"/>
               <w:insideH w:val="single" w:sz="8" w:space="0" w:color="666666"/>
               <w:insideV w:val="single" w:sz="8" w:space="0" w:color="666666"/>
+              <w:left w:val="single" w:sz="4" w:color="B5C1CC"/>
+              <w:right w:val="single" w:sz="4" w:color="B5C1CC"/>
             </w:tcBorders>
-            <w:shd w:fill="D9E1EC"/>
+            <w:shd w:fill="F2F5F8"/>
           </w:tcPr>
           <w:p>
             <w:pPr>
-              <w:spacing w:before="0" w:after="0" w:line="240" w:lineRule="auto"/>
+              <w:spacing w:before="40" w:after="40" w:line="276" w:lineRule="auto"/>
               <w:jc w:val="center"/>
             </w:pPr>
-            <w:r/>
             <w:r>
               <w:rPr>
-                <w:rFonts w:ascii="NanumSquare" w:hAnsi="NanumSquare" w:eastAsia="NanumSquare"/>
-                <w:b/>
+                <w:rFonts w:ascii="맑은 고딕" w:hAnsi="맑은 고딕" w:eastAsia="맑은 고딕"/>
+                <w:b w:val="0"/>
+                <w:color w:val="222222"/>
+                <w:sz w:val="17"/>
+              </w:rPr>
+            </w:r>
+            <w:r>
+              <w:rPr>
+                <w:rFonts w:ascii="맑은 고딕" w:hAnsi="맑은 고딕" w:eastAsia="맑은 고딕"/>
+                <w:b w:val="0"/>
+                <w:color w:val="222222"/>
                 <w:sz w:val="17"/>
               </w:rPr>
               <w:t>작업공정명</w:t>
@@ -393,24 +489,34 @@
               <w:end w:w="70" w:type="dxa"/>
             </w:tcMar>
             <w:tcBorders>
-              <w:top w:val="single" w:sz="8" w:space="0" w:color="666666"/>
+              <w:top w:val="single" w:sz="4" w:space="0" w:color="B5C1CC"/>
               <w:start w:val="single" w:sz="8" w:space="0" w:color="666666"/>
-              <w:bottom w:val="single" w:sz="8" w:space="0" w:color="666666"/>
+              <w:bottom w:val="single" w:sz="4" w:space="0" w:color="B5C1CC"/>
               <w:end w:val="single" w:sz="8" w:space="0" w:color="666666"/>
               <w:insideH w:val="single" w:sz="8" w:space="0" w:color="666666"/>
               <w:insideV w:val="single" w:sz="8" w:space="0" w:color="666666"/>
+              <w:left w:val="single" w:sz="4" w:color="B5C1CC"/>
+              <w:right w:val="single" w:sz="4" w:color="B5C1CC"/>
             </w:tcBorders>
           </w:tcPr>
           <w:p>
             <w:pPr>
-              <w:spacing w:before="0" w:after="0" w:line="240" w:lineRule="auto"/>
+              <w:spacing w:before="40" w:after="40" w:line="276" w:lineRule="auto"/>
               <w:jc w:val="left"/>
             </w:pPr>
-            <w:r/>
             <w:r>
               <w:rPr>
-                <w:rFonts w:ascii="NanumSquare" w:hAnsi="NanumSquare" w:eastAsia="NanumSquare"/>
+                <w:rFonts w:ascii="맑은 고딕" w:hAnsi="맑은 고딕" w:eastAsia="맑은 고딕"/>
                 <w:b w:val="0"/>
+                <w:color w:val="222222"/>
+                <w:sz w:val="17"/>
+              </w:rPr>
+            </w:r>
+            <w:r>
+              <w:rPr>
+                <w:rFonts w:ascii="맑은 고딕" w:hAnsi="맑은 고딕" w:eastAsia="맑은 고딕"/>
+                <w:b w:val="0"/>
+                <w:color w:val="222222"/>
                 <w:sz w:val="17"/>
               </w:rPr>
               <w:t>{{작업공정명}}</w:t>
@@ -428,25 +534,35 @@
               <w:end w:w="70" w:type="dxa"/>
             </w:tcMar>
             <w:tcBorders>
-              <w:top w:val="single" w:sz="8" w:space="0" w:color="666666"/>
+              <w:top w:val="single" w:sz="4" w:space="0" w:color="B5C1CC"/>
               <w:start w:val="single" w:sz="8" w:space="0" w:color="666666"/>
-              <w:bottom w:val="single" w:sz="8" w:space="0" w:color="666666"/>
+              <w:bottom w:val="single" w:sz="4" w:space="0" w:color="B5C1CC"/>
               <w:end w:val="single" w:sz="8" w:space="0" w:color="666666"/>
               <w:insideH w:val="single" w:sz="8" w:space="0" w:color="666666"/>
               <w:insideV w:val="single" w:sz="8" w:space="0" w:color="666666"/>
+              <w:left w:val="single" w:sz="4" w:color="B5C1CC"/>
+              <w:right w:val="single" w:sz="4" w:color="B5C1CC"/>
             </w:tcBorders>
             <w:shd w:fill="D9E1EC"/>
           </w:tcPr>
           <w:p>
             <w:pPr>
-              <w:spacing w:before="0" w:after="0" w:line="240" w:lineRule="auto"/>
+              <w:spacing w:before="40" w:after="40" w:line="276" w:lineRule="auto"/>
               <w:jc w:val="center"/>
             </w:pPr>
-            <w:r/>
             <w:r>
               <w:rPr>
-                <w:rFonts w:ascii="NanumSquare" w:hAnsi="NanumSquare" w:eastAsia="NanumSquare"/>
-                <w:b/>
+                <w:rFonts w:ascii="맑은 고딕" w:hAnsi="맑은 고딕" w:eastAsia="맑은 고딕"/>
+                <w:b w:val="0"/>
+                <w:color w:val="222222"/>
+                <w:sz w:val="17"/>
+              </w:rPr>
+            </w:r>
+            <w:r>
+              <w:rPr>
+                <w:rFonts w:ascii="맑은 고딕" w:hAnsi="맑은 고딕" w:eastAsia="맑은 고딕"/>
+                <w:b w:val="0"/>
+                <w:color w:val="222222"/>
                 <w:sz w:val="17"/>
               </w:rPr>
               <w:t>작 업 명</w:t>
@@ -464,24 +580,34 @@
               <w:end w:w="70" w:type="dxa"/>
             </w:tcMar>
             <w:tcBorders>
-              <w:top w:val="single" w:sz="8" w:space="0" w:color="666666"/>
+              <w:top w:val="single" w:sz="4" w:space="0" w:color="B5C1CC"/>
               <w:start w:val="single" w:sz="8" w:space="0" w:color="666666"/>
-              <w:bottom w:val="single" w:sz="8" w:space="0" w:color="666666"/>
+              <w:bottom w:val="single" w:sz="4" w:space="0" w:color="B5C1CC"/>
               <w:end w:val="single" w:sz="8" w:space="0" w:color="666666"/>
               <w:insideH w:val="single" w:sz="8" w:space="0" w:color="666666"/>
               <w:insideV w:val="single" w:sz="8" w:space="0" w:color="666666"/>
+              <w:left w:val="single" w:sz="4" w:color="B5C1CC"/>
+              <w:right w:val="single" w:sz="4" w:color="B5C1CC"/>
             </w:tcBorders>
           </w:tcPr>
           <w:p>
             <w:pPr>
-              <w:spacing w:before="0" w:after="0" w:line="240" w:lineRule="auto"/>
+              <w:spacing w:before="40" w:after="40" w:line="276" w:lineRule="auto"/>
               <w:jc w:val="left"/>
             </w:pPr>
-            <w:r/>
             <w:r>
               <w:rPr>
-                <w:rFonts w:ascii="NanumSquare" w:hAnsi="NanumSquare" w:eastAsia="NanumSquare"/>
+                <w:rFonts w:ascii="맑은 고딕" w:hAnsi="맑은 고딕" w:eastAsia="맑은 고딕"/>
                 <w:b w:val="0"/>
+                <w:color w:val="222222"/>
+                <w:sz w:val="17"/>
+              </w:rPr>
+            </w:r>
+            <w:r>
+              <w:rPr>
+                <w:rFonts w:ascii="맑은 고딕" w:hAnsi="맑은 고딕" w:eastAsia="맑은 고딕"/>
+                <w:b w:val="0"/>
+                <w:color w:val="222222"/>
                 <w:sz w:val="17"/>
               </w:rPr>
               <w:t>{{작업명}}</w:t>
@@ -492,13 +618,15 @@
     </w:tbl>
     <w:p>
       <w:pPr>
-        <w:spacing w:before="80" w:after="80" w:line="240" w:lineRule="auto"/>
+        <w:keepNext/>
+        <w:spacing w:before="180" w:after="100" w:line="300" w:lineRule="auto"/>
       </w:pPr>
       <w:r>
         <w:rPr>
-          <w:rFonts w:ascii="NanumSquare" w:hAnsi="NanumSquare" w:eastAsia="NanumSquare"/>
+          <w:rFonts w:ascii="맑은 고딕" w:hAnsi="맑은 고딕" w:eastAsia="맑은 고딕"/>
           <w:b/>
-          <w:sz w:val="21"/>
+          <w:color w:val="24477E"/>
+          <w:sz w:val="22"/>
         </w:rPr>
         <w:t>나. 작업장 상황 조사</w:t>
       </w:r>
@@ -528,26 +656,36 @@
               <w:end w:w="70" w:type="dxa"/>
             </w:tcMar>
             <w:tcBorders>
-              <w:top w:val="single" w:sz="8" w:space="0" w:color="666666"/>
+              <w:top w:val="single" w:sz="4" w:space="0" w:color="B5C1CC"/>
               <w:start w:val="single" w:sz="8" w:space="0" w:color="666666"/>
-              <w:bottom w:val="single" w:sz="8" w:space="0" w:color="666666"/>
+              <w:bottom w:val="single" w:sz="4" w:space="0" w:color="B5C1CC"/>
               <w:end w:val="single" w:sz="8" w:space="0" w:color="666666"/>
               <w:insideH w:val="single" w:sz="8" w:space="0" w:color="666666"/>
               <w:insideV w:val="single" w:sz="8" w:space="0" w:color="666666"/>
+              <w:left w:val="single" w:sz="4" w:color="B5C1CC"/>
+              <w:right w:val="single" w:sz="4" w:color="B5C1CC"/>
             </w:tcBorders>
-            <w:shd w:fill="D9E1EC"/>
+            <w:shd w:fill="E8EFF6"/>
           </w:tcPr>
           <w:p>
             <w:pPr>
-              <w:spacing w:before="0" w:after="0" w:line="240" w:lineRule="auto"/>
+              <w:spacing w:before="40" w:after="40" w:line="276" w:lineRule="auto"/>
               <w:jc w:val="center"/>
             </w:pPr>
-            <w:r/>
             <w:r>
               <w:rPr>
-                <w:rFonts w:ascii="NanumSquare" w:hAnsi="NanumSquare" w:eastAsia="NanumSquare"/>
+                <w:rFonts w:ascii="맑은 고딕" w:hAnsi="맑은 고딕" w:eastAsia="맑은 고딕"/>
                 <w:b/>
-                <w:sz w:val="16"/>
+                <w:color w:val="24477E"/>
+                <w:sz w:val="17"/>
+              </w:rPr>
+            </w:r>
+            <w:r>
+              <w:rPr>
+                <w:rFonts w:ascii="맑은 고딕" w:hAnsi="맑은 고딕" w:eastAsia="맑은 고딕"/>
+                <w:b/>
+                <w:color w:val="24477E"/>
+                <w:sz w:val="17"/>
               </w:rPr>
               <w:t>항  목</w:t>
             </w:r>
@@ -564,26 +702,36 @@
               <w:end w:w="70" w:type="dxa"/>
             </w:tcMar>
             <w:tcBorders>
-              <w:top w:val="single" w:sz="8" w:space="0" w:color="666666"/>
+              <w:top w:val="single" w:sz="4" w:space="0" w:color="B5C1CC"/>
               <w:start w:val="single" w:sz="8" w:space="0" w:color="666666"/>
-              <w:bottom w:val="single" w:sz="8" w:space="0" w:color="666666"/>
+              <w:bottom w:val="single" w:sz="4" w:space="0" w:color="B5C1CC"/>
               <w:end w:val="single" w:sz="8" w:space="0" w:color="666666"/>
               <w:insideH w:val="single" w:sz="8" w:space="0" w:color="666666"/>
               <w:insideV w:val="single" w:sz="8" w:space="0" w:color="666666"/>
+              <w:left w:val="single" w:sz="4" w:color="B5C1CC"/>
+              <w:right w:val="single" w:sz="4" w:color="B5C1CC"/>
             </w:tcBorders>
-            <w:shd w:fill="D9E1EC"/>
+            <w:shd w:fill="E8EFF6"/>
           </w:tcPr>
           <w:p>
             <w:pPr>
-              <w:spacing w:before="0" w:after="0" w:line="240" w:lineRule="auto"/>
+              <w:spacing w:before="40" w:after="40" w:line="276" w:lineRule="auto"/>
               <w:jc w:val="center"/>
             </w:pPr>
-            <w:r/>
             <w:r>
               <w:rPr>
-                <w:rFonts w:ascii="NanumSquare" w:hAnsi="NanumSquare" w:eastAsia="NanumSquare"/>
+                <w:rFonts w:ascii="맑은 고딕" w:hAnsi="맑은 고딕" w:eastAsia="맑은 고딕"/>
                 <w:b/>
-                <w:sz w:val="16"/>
+                <w:color w:val="24477E"/>
+                <w:sz w:val="17"/>
+              </w:rPr>
+            </w:r>
+            <w:r>
+              <w:rPr>
+                <w:rFonts w:ascii="맑은 고딕" w:hAnsi="맑은 고딕" w:eastAsia="맑은 고딕"/>
+                <w:b/>
+                <w:color w:val="24477E"/>
+                <w:sz w:val="17"/>
               </w:rPr>
               <w:t>변화여부</w:t>
             </w:r>
@@ -600,26 +748,36 @@
               <w:end w:w="70" w:type="dxa"/>
             </w:tcMar>
             <w:tcBorders>
-              <w:top w:val="single" w:sz="8" w:space="0" w:color="666666"/>
+              <w:top w:val="single" w:sz="4" w:space="0" w:color="B5C1CC"/>
               <w:start w:val="single" w:sz="8" w:space="0" w:color="666666"/>
-              <w:bottom w:val="single" w:sz="8" w:space="0" w:color="666666"/>
+              <w:bottom w:val="single" w:sz="4" w:space="0" w:color="B5C1CC"/>
               <w:end w:val="single" w:sz="8" w:space="0" w:color="666666"/>
               <w:insideH w:val="single" w:sz="8" w:space="0" w:color="666666"/>
               <w:insideV w:val="single" w:sz="8" w:space="0" w:color="666666"/>
+              <w:left w:val="single" w:sz="4" w:color="B5C1CC"/>
+              <w:right w:val="single" w:sz="4" w:color="B5C1CC"/>
             </w:tcBorders>
-            <w:shd w:fill="D9E1EC"/>
+            <w:shd w:fill="E8EFF6"/>
           </w:tcPr>
           <w:p>
             <w:pPr>
-              <w:spacing w:before="0" w:after="0" w:line="240" w:lineRule="auto"/>
+              <w:spacing w:before="40" w:after="40" w:line="276" w:lineRule="auto"/>
               <w:jc w:val="center"/>
             </w:pPr>
-            <w:r/>
             <w:r>
               <w:rPr>
-                <w:rFonts w:ascii="NanumSquare" w:hAnsi="NanumSquare" w:eastAsia="NanumSquare"/>
+                <w:rFonts w:ascii="맑은 고딕" w:hAnsi="맑은 고딕" w:eastAsia="맑은 고딕"/>
                 <w:b/>
-                <w:sz w:val="16"/>
+                <w:color w:val="24477E"/>
+                <w:sz w:val="17"/>
+              </w:rPr>
+            </w:r>
+            <w:r>
+              <w:rPr>
+                <w:rFonts w:ascii="맑은 고딕" w:hAnsi="맑은 고딕" w:eastAsia="맑은 고딕"/>
+                <w:b/>
+                <w:color w:val="24477E"/>
+                <w:sz w:val="17"/>
               </w:rPr>
               <w:t>변화 시점</w:t>
             </w:r>
@@ -638,25 +796,36 @@
               <w:end w:w="70" w:type="dxa"/>
             </w:tcMar>
             <w:tcBorders>
-              <w:top w:val="single" w:sz="8" w:space="0" w:color="666666"/>
+              <w:top w:val="single" w:sz="4" w:space="0" w:color="B5C1CC"/>
               <w:start w:val="single" w:sz="8" w:space="0" w:color="666666"/>
-              <w:bottom w:val="single" w:sz="8" w:space="0" w:color="666666"/>
+              <w:bottom w:val="single" w:sz="4" w:space="0" w:color="B5C1CC"/>
               <w:end w:val="single" w:sz="8" w:space="0" w:color="666666"/>
               <w:insideH w:val="single" w:sz="8" w:space="0" w:color="666666"/>
               <w:insideV w:val="single" w:sz="8" w:space="0" w:color="666666"/>
+              <w:left w:val="single" w:sz="4" w:color="B5C1CC"/>
+              <w:right w:val="single" w:sz="4" w:color="B5C1CC"/>
             </w:tcBorders>
+            <w:shd w:fill="F2F5F8"/>
           </w:tcPr>
           <w:p>
             <w:pPr>
-              <w:spacing w:before="0" w:after="0" w:line="240" w:lineRule="auto"/>
+              <w:spacing w:before="40" w:after="40" w:line="276" w:lineRule="auto"/>
               <w:jc w:val="left"/>
             </w:pPr>
-            <w:r/>
             <w:r>
               <w:rPr>
-                <w:rFonts w:ascii="NanumSquare" w:hAnsi="NanumSquare" w:eastAsia="NanumSquare"/>
+                <w:rFonts w:ascii="맑은 고딕" w:hAnsi="맑은 고딕" w:eastAsia="맑은 고딕"/>
                 <w:b w:val="0"/>
-                <w:sz w:val="16"/>
+                <w:color w:val="222222"/>
+                <w:sz w:val="17"/>
+              </w:rPr>
+            </w:r>
+            <w:r>
+              <w:rPr>
+                <w:rFonts w:ascii="맑은 고딕" w:hAnsi="맑은 고딕" w:eastAsia="맑은 고딕"/>
+                <w:b w:val="0"/>
+                <w:color w:val="222222"/>
+                <w:sz w:val="17"/>
               </w:rPr>
               <w:t>작업 설비</w:t>
             </w:r>
@@ -673,25 +842,35 @@
               <w:end w:w="70" w:type="dxa"/>
             </w:tcMar>
             <w:tcBorders>
-              <w:top w:val="single" w:sz="8" w:space="0" w:color="666666"/>
+              <w:top w:val="single" w:sz="4" w:space="0" w:color="B5C1CC"/>
               <w:start w:val="single" w:sz="8" w:space="0" w:color="666666"/>
-              <w:bottom w:val="single" w:sz="8" w:space="0" w:color="666666"/>
+              <w:bottom w:val="single" w:sz="4" w:space="0" w:color="B5C1CC"/>
               <w:end w:val="single" w:sz="8" w:space="0" w:color="666666"/>
               <w:insideH w:val="single" w:sz="8" w:space="0" w:color="666666"/>
               <w:insideV w:val="single" w:sz="8" w:space="0" w:color="666666"/>
+              <w:left w:val="single" w:sz="4" w:color="B5C1CC"/>
+              <w:right w:val="single" w:sz="4" w:color="B5C1CC"/>
             </w:tcBorders>
           </w:tcPr>
           <w:p>
             <w:pPr>
-              <w:spacing w:before="0" w:after="0" w:line="240" w:lineRule="auto"/>
+              <w:spacing w:before="40" w:after="40" w:line="276" w:lineRule="auto"/>
               <w:jc w:val="left"/>
             </w:pPr>
-            <w:r/>
             <w:r>
               <w:rPr>
-                <w:rFonts w:ascii="NanumSquare" w:hAnsi="NanumSquare" w:eastAsia="NanumSquare"/>
+                <w:rFonts w:ascii="맑은 고딕" w:hAnsi="맑은 고딕" w:eastAsia="맑은 고딕"/>
                 <w:b w:val="0"/>
-                <w:sz w:val="16"/>
+                <w:color w:val="222222"/>
+                <w:sz w:val="17"/>
+              </w:rPr>
+            </w:r>
+            <w:r>
+              <w:rPr>
+                <w:rFonts w:ascii="맑은 고딕" w:hAnsi="맑은 고딕" w:eastAsia="맑은 고딕"/>
+                <w:b w:val="0"/>
+                <w:color w:val="222222"/>
+                <w:sz w:val="17"/>
               </w:rPr>
               <w:t>{{작업설비_변화여부}}</w:t>
             </w:r>
@@ -708,25 +887,35 @@
               <w:end w:w="70" w:type="dxa"/>
             </w:tcMar>
             <w:tcBorders>
-              <w:top w:val="single" w:sz="8" w:space="0" w:color="666666"/>
+              <w:top w:val="single" w:sz="4" w:space="0" w:color="B5C1CC"/>
               <w:start w:val="single" w:sz="8" w:space="0" w:color="666666"/>
-              <w:bottom w:val="single" w:sz="8" w:space="0" w:color="666666"/>
+              <w:bottom w:val="single" w:sz="4" w:space="0" w:color="B5C1CC"/>
               <w:end w:val="single" w:sz="8" w:space="0" w:color="666666"/>
               <w:insideH w:val="single" w:sz="8" w:space="0" w:color="666666"/>
               <w:insideV w:val="single" w:sz="8" w:space="0" w:color="666666"/>
+              <w:left w:val="single" w:sz="4" w:color="B5C1CC"/>
+              <w:right w:val="single" w:sz="4" w:color="B5C1CC"/>
             </w:tcBorders>
           </w:tcPr>
           <w:p>
             <w:pPr>
-              <w:spacing w:before="0" w:after="0" w:line="240" w:lineRule="auto"/>
+              <w:spacing w:before="40" w:after="40" w:line="276" w:lineRule="auto"/>
               <w:jc w:val="left"/>
             </w:pPr>
-            <w:r/>
             <w:r>
               <w:rPr>
-                <w:rFonts w:ascii="NanumSquare" w:hAnsi="NanumSquare" w:eastAsia="NanumSquare"/>
+                <w:rFonts w:ascii="맑은 고딕" w:hAnsi="맑은 고딕" w:eastAsia="맑은 고딕"/>
                 <w:b w:val="0"/>
-                <w:sz w:val="16"/>
+                <w:color w:val="222222"/>
+                <w:sz w:val="17"/>
+              </w:rPr>
+            </w:r>
+            <w:r>
+              <w:rPr>
+                <w:rFonts w:ascii="맑은 고딕" w:hAnsi="맑은 고딕" w:eastAsia="맑은 고딕"/>
+                <w:b w:val="0"/>
+                <w:color w:val="222222"/>
+                <w:sz w:val="17"/>
               </w:rPr>
               <w:t>{{작업설비_변화시점}}</w:t>
             </w:r>
@@ -745,25 +934,36 @@
               <w:end w:w="70" w:type="dxa"/>
             </w:tcMar>
             <w:tcBorders>
-              <w:top w:val="single" w:sz="8" w:space="0" w:color="666666"/>
+              <w:top w:val="single" w:sz="4" w:space="0" w:color="B5C1CC"/>
               <w:start w:val="single" w:sz="8" w:space="0" w:color="666666"/>
-              <w:bottom w:val="single" w:sz="8" w:space="0" w:color="666666"/>
+              <w:bottom w:val="single" w:sz="4" w:space="0" w:color="B5C1CC"/>
               <w:end w:val="single" w:sz="8" w:space="0" w:color="666666"/>
               <w:insideH w:val="single" w:sz="8" w:space="0" w:color="666666"/>
               <w:insideV w:val="single" w:sz="8" w:space="0" w:color="666666"/>
+              <w:left w:val="single" w:sz="4" w:color="B5C1CC"/>
+              <w:right w:val="single" w:sz="4" w:color="B5C1CC"/>
             </w:tcBorders>
+            <w:shd w:fill="F2F5F8"/>
           </w:tcPr>
           <w:p>
             <w:pPr>
-              <w:spacing w:before="0" w:after="0" w:line="240" w:lineRule="auto"/>
+              <w:spacing w:before="40" w:after="40" w:line="276" w:lineRule="auto"/>
               <w:jc w:val="left"/>
             </w:pPr>
-            <w:r/>
             <w:r>
               <w:rPr>
-                <w:rFonts w:ascii="NanumSquare" w:hAnsi="NanumSquare" w:eastAsia="NanumSquare"/>
+                <w:rFonts w:ascii="맑은 고딕" w:hAnsi="맑은 고딕" w:eastAsia="맑은 고딕"/>
                 <w:b w:val="0"/>
-                <w:sz w:val="16"/>
+                <w:color w:val="222222"/>
+                <w:sz w:val="17"/>
+              </w:rPr>
+            </w:r>
+            <w:r>
+              <w:rPr>
+                <w:rFonts w:ascii="맑은 고딕" w:hAnsi="맑은 고딕" w:eastAsia="맑은 고딕"/>
+                <w:b w:val="0"/>
+                <w:color w:val="222222"/>
+                <w:sz w:val="17"/>
               </w:rPr>
               <w:t>작 업 량</w:t>
             </w:r>
@@ -780,25 +980,35 @@
               <w:end w:w="70" w:type="dxa"/>
             </w:tcMar>
             <w:tcBorders>
-              <w:top w:val="single" w:sz="8" w:space="0" w:color="666666"/>
+              <w:top w:val="single" w:sz="4" w:space="0" w:color="B5C1CC"/>
               <w:start w:val="single" w:sz="8" w:space="0" w:color="666666"/>
-              <w:bottom w:val="single" w:sz="8" w:space="0" w:color="666666"/>
+              <w:bottom w:val="single" w:sz="4" w:space="0" w:color="B5C1CC"/>
               <w:end w:val="single" w:sz="8" w:space="0" w:color="666666"/>
               <w:insideH w:val="single" w:sz="8" w:space="0" w:color="666666"/>
               <w:insideV w:val="single" w:sz="8" w:space="0" w:color="666666"/>
+              <w:left w:val="single" w:sz="4" w:color="B5C1CC"/>
+              <w:right w:val="single" w:sz="4" w:color="B5C1CC"/>
             </w:tcBorders>
           </w:tcPr>
           <w:p>
             <w:pPr>
-              <w:spacing w:before="0" w:after="0" w:line="240" w:lineRule="auto"/>
+              <w:spacing w:before="40" w:after="40" w:line="276" w:lineRule="auto"/>
               <w:jc w:val="left"/>
             </w:pPr>
-            <w:r/>
             <w:r>
               <w:rPr>
-                <w:rFonts w:ascii="NanumSquare" w:hAnsi="NanumSquare" w:eastAsia="NanumSquare"/>
+                <w:rFonts w:ascii="맑은 고딕" w:hAnsi="맑은 고딕" w:eastAsia="맑은 고딕"/>
                 <w:b w:val="0"/>
-                <w:sz w:val="16"/>
+                <w:color w:val="222222"/>
+                <w:sz w:val="17"/>
+              </w:rPr>
+            </w:r>
+            <w:r>
+              <w:rPr>
+                <w:rFonts w:ascii="맑은 고딕" w:hAnsi="맑은 고딕" w:eastAsia="맑은 고딕"/>
+                <w:b w:val="0"/>
+                <w:color w:val="222222"/>
+                <w:sz w:val="17"/>
               </w:rPr>
               <w:t>{{작업량_변화여부}}</w:t>
             </w:r>
@@ -815,25 +1025,35 @@
               <w:end w:w="70" w:type="dxa"/>
             </w:tcMar>
             <w:tcBorders>
-              <w:top w:val="single" w:sz="8" w:space="0" w:color="666666"/>
+              <w:top w:val="single" w:sz="4" w:space="0" w:color="B5C1CC"/>
               <w:start w:val="single" w:sz="8" w:space="0" w:color="666666"/>
-              <w:bottom w:val="single" w:sz="8" w:space="0" w:color="666666"/>
+              <w:bottom w:val="single" w:sz="4" w:space="0" w:color="B5C1CC"/>
               <w:end w:val="single" w:sz="8" w:space="0" w:color="666666"/>
               <w:insideH w:val="single" w:sz="8" w:space="0" w:color="666666"/>
               <w:insideV w:val="single" w:sz="8" w:space="0" w:color="666666"/>
+              <w:left w:val="single" w:sz="4" w:color="B5C1CC"/>
+              <w:right w:val="single" w:sz="4" w:color="B5C1CC"/>
             </w:tcBorders>
           </w:tcPr>
           <w:p>
             <w:pPr>
-              <w:spacing w:before="0" w:after="0" w:line="240" w:lineRule="auto"/>
+              <w:spacing w:before="40" w:after="40" w:line="276" w:lineRule="auto"/>
               <w:jc w:val="left"/>
             </w:pPr>
-            <w:r/>
             <w:r>
               <w:rPr>
-                <w:rFonts w:ascii="NanumSquare" w:hAnsi="NanumSquare" w:eastAsia="NanumSquare"/>
+                <w:rFonts w:ascii="맑은 고딕" w:hAnsi="맑은 고딕" w:eastAsia="맑은 고딕"/>
                 <w:b w:val="0"/>
-                <w:sz w:val="16"/>
+                <w:color w:val="222222"/>
+                <w:sz w:val="17"/>
+              </w:rPr>
+            </w:r>
+            <w:r>
+              <w:rPr>
+                <w:rFonts w:ascii="맑은 고딕" w:hAnsi="맑은 고딕" w:eastAsia="맑은 고딕"/>
+                <w:b w:val="0"/>
+                <w:color w:val="222222"/>
+                <w:sz w:val="17"/>
               </w:rPr>
               <w:t>{{작업량_변화시점}}</w:t>
             </w:r>
@@ -852,25 +1072,36 @@
               <w:end w:w="70" w:type="dxa"/>
             </w:tcMar>
             <w:tcBorders>
-              <w:top w:val="single" w:sz="8" w:space="0" w:color="666666"/>
+              <w:top w:val="single" w:sz="4" w:space="0" w:color="B5C1CC"/>
               <w:start w:val="single" w:sz="8" w:space="0" w:color="666666"/>
-              <w:bottom w:val="single" w:sz="8" w:space="0" w:color="666666"/>
+              <w:bottom w:val="single" w:sz="4" w:space="0" w:color="B5C1CC"/>
               <w:end w:val="single" w:sz="8" w:space="0" w:color="666666"/>
               <w:insideH w:val="single" w:sz="8" w:space="0" w:color="666666"/>
               <w:insideV w:val="single" w:sz="8" w:space="0" w:color="666666"/>
+              <w:left w:val="single" w:sz="4" w:color="B5C1CC"/>
+              <w:right w:val="single" w:sz="4" w:color="B5C1CC"/>
             </w:tcBorders>
+            <w:shd w:fill="F2F5F8"/>
           </w:tcPr>
           <w:p>
             <w:pPr>
-              <w:spacing w:before="0" w:after="0" w:line="240" w:lineRule="auto"/>
+              <w:spacing w:before="40" w:after="40" w:line="276" w:lineRule="auto"/>
               <w:jc w:val="left"/>
             </w:pPr>
-            <w:r/>
             <w:r>
               <w:rPr>
-                <w:rFonts w:ascii="NanumSquare" w:hAnsi="NanumSquare" w:eastAsia="NanumSquare"/>
+                <w:rFonts w:ascii="맑은 고딕" w:hAnsi="맑은 고딕" w:eastAsia="맑은 고딕"/>
                 <w:b w:val="0"/>
-                <w:sz w:val="16"/>
+                <w:color w:val="222222"/>
+                <w:sz w:val="17"/>
+              </w:rPr>
+            </w:r>
+            <w:r>
+              <w:rPr>
+                <w:rFonts w:ascii="맑은 고딕" w:hAnsi="맑은 고딕" w:eastAsia="맑은 고딕"/>
+                <w:b w:val="0"/>
+                <w:color w:val="222222"/>
+                <w:sz w:val="17"/>
               </w:rPr>
               <w:t>작업 속도</w:t>
             </w:r>
@@ -887,25 +1118,35 @@
               <w:end w:w="70" w:type="dxa"/>
             </w:tcMar>
             <w:tcBorders>
-              <w:top w:val="single" w:sz="8" w:space="0" w:color="666666"/>
+              <w:top w:val="single" w:sz="4" w:space="0" w:color="B5C1CC"/>
               <w:start w:val="single" w:sz="8" w:space="0" w:color="666666"/>
-              <w:bottom w:val="single" w:sz="8" w:space="0" w:color="666666"/>
+              <w:bottom w:val="single" w:sz="4" w:space="0" w:color="B5C1CC"/>
               <w:end w:val="single" w:sz="8" w:space="0" w:color="666666"/>
               <w:insideH w:val="single" w:sz="8" w:space="0" w:color="666666"/>
               <w:insideV w:val="single" w:sz="8" w:space="0" w:color="666666"/>
+              <w:left w:val="single" w:sz="4" w:color="B5C1CC"/>
+              <w:right w:val="single" w:sz="4" w:color="B5C1CC"/>
             </w:tcBorders>
           </w:tcPr>
           <w:p>
             <w:pPr>
-              <w:spacing w:before="0" w:after="0" w:line="240" w:lineRule="auto"/>
+              <w:spacing w:before="40" w:after="40" w:line="276" w:lineRule="auto"/>
               <w:jc w:val="left"/>
             </w:pPr>
-            <w:r/>
             <w:r>
               <w:rPr>
-                <w:rFonts w:ascii="NanumSquare" w:hAnsi="NanumSquare" w:eastAsia="NanumSquare"/>
+                <w:rFonts w:ascii="맑은 고딕" w:hAnsi="맑은 고딕" w:eastAsia="맑은 고딕"/>
                 <w:b w:val="0"/>
-                <w:sz w:val="16"/>
+                <w:color w:val="222222"/>
+                <w:sz w:val="17"/>
+              </w:rPr>
+            </w:r>
+            <w:r>
+              <w:rPr>
+                <w:rFonts w:ascii="맑은 고딕" w:hAnsi="맑은 고딕" w:eastAsia="맑은 고딕"/>
+                <w:b w:val="0"/>
+                <w:color w:val="222222"/>
+                <w:sz w:val="17"/>
               </w:rPr>
               <w:t>{{작업속도_변화여부}}</w:t>
             </w:r>
@@ -922,25 +1163,35 @@
               <w:end w:w="70" w:type="dxa"/>
             </w:tcMar>
             <w:tcBorders>
-              <w:top w:val="single" w:sz="8" w:space="0" w:color="666666"/>
+              <w:top w:val="single" w:sz="4" w:space="0" w:color="B5C1CC"/>
               <w:start w:val="single" w:sz="8" w:space="0" w:color="666666"/>
-              <w:bottom w:val="single" w:sz="8" w:space="0" w:color="666666"/>
+              <w:bottom w:val="single" w:sz="4" w:space="0" w:color="B5C1CC"/>
               <w:end w:val="single" w:sz="8" w:space="0" w:color="666666"/>
               <w:insideH w:val="single" w:sz="8" w:space="0" w:color="666666"/>
               <w:insideV w:val="single" w:sz="8" w:space="0" w:color="666666"/>
+              <w:left w:val="single" w:sz="4" w:color="B5C1CC"/>
+              <w:right w:val="single" w:sz="4" w:color="B5C1CC"/>
             </w:tcBorders>
           </w:tcPr>
           <w:p>
             <w:pPr>
-              <w:spacing w:before="0" w:after="0" w:line="240" w:lineRule="auto"/>
+              <w:spacing w:before="40" w:after="40" w:line="276" w:lineRule="auto"/>
               <w:jc w:val="left"/>
             </w:pPr>
-            <w:r/>
             <w:r>
               <w:rPr>
-                <w:rFonts w:ascii="NanumSquare" w:hAnsi="NanumSquare" w:eastAsia="NanumSquare"/>
+                <w:rFonts w:ascii="맑은 고딕" w:hAnsi="맑은 고딕" w:eastAsia="맑은 고딕"/>
                 <w:b w:val="0"/>
-                <w:sz w:val="16"/>
+                <w:color w:val="222222"/>
+                <w:sz w:val="17"/>
+              </w:rPr>
+            </w:r>
+            <w:r>
+              <w:rPr>
+                <w:rFonts w:ascii="맑은 고딕" w:hAnsi="맑은 고딕" w:eastAsia="맑은 고딕"/>
+                <w:b w:val="0"/>
+                <w:color w:val="222222"/>
+                <w:sz w:val="17"/>
               </w:rPr>
               <w:t>{{작업속도_변화시점}}</w:t>
             </w:r>
@@ -959,25 +1210,36 @@
               <w:end w:w="70" w:type="dxa"/>
             </w:tcMar>
             <w:tcBorders>
-              <w:top w:val="single" w:sz="8" w:space="0" w:color="666666"/>
+              <w:top w:val="single" w:sz="4" w:space="0" w:color="B5C1CC"/>
               <w:start w:val="single" w:sz="8" w:space="0" w:color="666666"/>
-              <w:bottom w:val="single" w:sz="8" w:space="0" w:color="666666"/>
+              <w:bottom w:val="single" w:sz="4" w:space="0" w:color="B5C1CC"/>
               <w:end w:val="single" w:sz="8" w:space="0" w:color="666666"/>
               <w:insideH w:val="single" w:sz="8" w:space="0" w:color="666666"/>
               <w:insideV w:val="single" w:sz="8" w:space="0" w:color="666666"/>
+              <w:left w:val="single" w:sz="4" w:color="B5C1CC"/>
+              <w:right w:val="single" w:sz="4" w:color="B5C1CC"/>
             </w:tcBorders>
+            <w:shd w:fill="F2F5F8"/>
           </w:tcPr>
           <w:p>
             <w:pPr>
-              <w:spacing w:before="0" w:after="0" w:line="240" w:lineRule="auto"/>
+              <w:spacing w:before="40" w:after="40" w:line="276" w:lineRule="auto"/>
               <w:jc w:val="left"/>
             </w:pPr>
-            <w:r/>
             <w:r>
               <w:rPr>
-                <w:rFonts w:ascii="NanumSquare" w:hAnsi="NanumSquare" w:eastAsia="NanumSquare"/>
+                <w:rFonts w:ascii="맑은 고딕" w:hAnsi="맑은 고딕" w:eastAsia="맑은 고딕"/>
                 <w:b w:val="0"/>
-                <w:sz w:val="16"/>
+                <w:color w:val="222222"/>
+                <w:sz w:val="17"/>
+              </w:rPr>
+            </w:r>
+            <w:r>
+              <w:rPr>
+                <w:rFonts w:ascii="맑은 고딕" w:hAnsi="맑은 고딕" w:eastAsia="맑은 고딕"/>
+                <w:b w:val="0"/>
+                <w:color w:val="222222"/>
+                <w:sz w:val="17"/>
               </w:rPr>
               <w:t>업무 변화</w:t>
             </w:r>
@@ -994,25 +1256,35 @@
               <w:end w:w="70" w:type="dxa"/>
             </w:tcMar>
             <w:tcBorders>
-              <w:top w:val="single" w:sz="8" w:space="0" w:color="666666"/>
+              <w:top w:val="single" w:sz="4" w:space="0" w:color="B5C1CC"/>
               <w:start w:val="single" w:sz="8" w:space="0" w:color="666666"/>
-              <w:bottom w:val="single" w:sz="8" w:space="0" w:color="666666"/>
+              <w:bottom w:val="single" w:sz="4" w:space="0" w:color="B5C1CC"/>
               <w:end w:val="single" w:sz="8" w:space="0" w:color="666666"/>
               <w:insideH w:val="single" w:sz="8" w:space="0" w:color="666666"/>
               <w:insideV w:val="single" w:sz="8" w:space="0" w:color="666666"/>
+              <w:left w:val="single" w:sz="4" w:color="B5C1CC"/>
+              <w:right w:val="single" w:sz="4" w:color="B5C1CC"/>
             </w:tcBorders>
           </w:tcPr>
           <w:p>
             <w:pPr>
-              <w:spacing w:before="0" w:after="0" w:line="240" w:lineRule="auto"/>
+              <w:spacing w:before="40" w:after="40" w:line="276" w:lineRule="auto"/>
               <w:jc w:val="left"/>
             </w:pPr>
-            <w:r/>
             <w:r>
               <w:rPr>
-                <w:rFonts w:ascii="NanumSquare" w:hAnsi="NanumSquare" w:eastAsia="NanumSquare"/>
+                <w:rFonts w:ascii="맑은 고딕" w:hAnsi="맑은 고딕" w:eastAsia="맑은 고딕"/>
                 <w:b w:val="0"/>
-                <w:sz w:val="16"/>
+                <w:color w:val="222222"/>
+                <w:sz w:val="17"/>
+              </w:rPr>
+            </w:r>
+            <w:r>
+              <w:rPr>
+                <w:rFonts w:ascii="맑은 고딕" w:hAnsi="맑은 고딕" w:eastAsia="맑은 고딕"/>
+                <w:b w:val="0"/>
+                <w:color w:val="222222"/>
+                <w:sz w:val="17"/>
               </w:rPr>
               <w:t>{{업무변화_여부}}</w:t>
             </w:r>
@@ -1029,25 +1301,35 @@
               <w:end w:w="70" w:type="dxa"/>
             </w:tcMar>
             <w:tcBorders>
-              <w:top w:val="single" w:sz="8" w:space="0" w:color="666666"/>
+              <w:top w:val="single" w:sz="4" w:space="0" w:color="B5C1CC"/>
               <w:start w:val="single" w:sz="8" w:space="0" w:color="666666"/>
-              <w:bottom w:val="single" w:sz="8" w:space="0" w:color="666666"/>
+              <w:bottom w:val="single" w:sz="4" w:space="0" w:color="B5C1CC"/>
               <w:end w:val="single" w:sz="8" w:space="0" w:color="666666"/>
               <w:insideH w:val="single" w:sz="8" w:space="0" w:color="666666"/>
               <w:insideV w:val="single" w:sz="8" w:space="0" w:color="666666"/>
+              <w:left w:val="single" w:sz="4" w:color="B5C1CC"/>
+              <w:right w:val="single" w:sz="4" w:color="B5C1CC"/>
             </w:tcBorders>
           </w:tcPr>
           <w:p>
             <w:pPr>
-              <w:spacing w:before="0" w:after="0" w:line="240" w:lineRule="auto"/>
+              <w:spacing w:before="40" w:after="40" w:line="276" w:lineRule="auto"/>
               <w:jc w:val="left"/>
             </w:pPr>
-            <w:r/>
             <w:r>
               <w:rPr>
-                <w:rFonts w:ascii="NanumSquare" w:hAnsi="NanumSquare" w:eastAsia="NanumSquare"/>
+                <w:rFonts w:ascii="맑은 고딕" w:hAnsi="맑은 고딕" w:eastAsia="맑은 고딕"/>
                 <w:b w:val="0"/>
-                <w:sz w:val="16"/>
+                <w:color w:val="222222"/>
+                <w:sz w:val="17"/>
+              </w:rPr>
+            </w:r>
+            <w:r>
+              <w:rPr>
+                <w:rFonts w:ascii="맑은 고딕" w:hAnsi="맑은 고딕" w:eastAsia="맑은 고딕"/>
+                <w:b w:val="0"/>
+                <w:color w:val="222222"/>
+                <w:sz w:val="17"/>
               </w:rPr>
               <w:t>{{업무변화_시점}}</w:t>
             </w:r>
@@ -1057,52 +1339,57 @@
     </w:tbl>
     <w:p>
       <w:pPr>
-        <w:spacing w:before="80" w:after="80" w:line="240" w:lineRule="auto"/>
+        <w:keepNext/>
+        <w:spacing w:before="180" w:after="100" w:line="300" w:lineRule="auto"/>
       </w:pPr>
       <w:r>
         <w:rPr>
-          <w:rFonts w:ascii="NanumSquare" w:hAnsi="NanumSquare" w:eastAsia="NanumSquare"/>
+          <w:rFonts w:ascii="맑은 고딕" w:hAnsi="맑은 고딕" w:eastAsia="맑은 고딕"/>
           <w:b/>
-          <w:sz w:val="21"/>
+          <w:color w:val="24477E"/>
+          <w:sz w:val="22"/>
         </w:rPr>
         <w:t>다. 작업조건 조사 — 1단계 : 작업별 주요 작업내용</w:t>
       </w:r>
     </w:p>
     <w:p>
       <w:pPr>
-        <w:spacing w:before="0" w:after="40" w:line="240" w:lineRule="auto"/>
+        <w:spacing w:before="0" w:after="60" w:line="300" w:lineRule="auto"/>
       </w:pPr>
       <w:r>
         <w:rPr>
-          <w:rFonts w:ascii="NanumSquare" w:hAnsi="NanumSquare" w:eastAsia="NanumSquare"/>
+          <w:rFonts w:ascii="맑은 고딕" w:hAnsi="맑은 고딕" w:eastAsia="맑은 고딕"/>
           <w:b w:val="0"/>
-          <w:sz w:val="17"/>
+          <w:color w:val="222222"/>
+          <w:sz w:val="18"/>
         </w:rPr>
         <w:t>작업명 : {{작업명}}</w:t>
       </w:r>
     </w:p>
     <w:p>
       <w:pPr>
-        <w:spacing w:before="0" w:after="40" w:line="240" w:lineRule="auto"/>
+        <w:spacing w:before="0" w:after="60" w:line="300" w:lineRule="auto"/>
       </w:pPr>
       <w:r>
         <w:rPr>
-          <w:rFonts w:ascii="NanumSquare" w:hAnsi="NanumSquare" w:eastAsia="NanumSquare"/>
+          <w:rFonts w:ascii="맑은 고딕" w:hAnsi="맑은 고딕" w:eastAsia="맑은 고딕"/>
           <w:b w:val="0"/>
-          <w:sz w:val="16"/>
+          <w:color w:val="222222"/>
+          <w:sz w:val="18"/>
         </w:rPr>
         <w:t>1) 단위작업명 : {{단위작업명}}   / 작업내용 : {{작업내용}}</w:t>
       </w:r>
     </w:p>
     <w:p>
       <w:pPr>
-        <w:spacing w:before="0" w:after="80" w:line="240" w:lineRule="auto"/>
+        <w:spacing w:before="0" w:after="60" w:line="300" w:lineRule="auto"/>
       </w:pPr>
       <w:r>
         <w:rPr>
-          <w:rFonts w:ascii="NanumSquare" w:hAnsi="NanumSquare" w:eastAsia="NanumSquare"/>
+          <w:rFonts w:ascii="맑은 고딕" w:hAnsi="맑은 고딕" w:eastAsia="맑은 고딕"/>
           <w:b w:val="0"/>
-          <w:sz w:val="16"/>
+          <w:color w:val="222222"/>
+          <w:sz w:val="18"/>
         </w:rPr>
         <w:t>작업기술 : {{작업기술}}</w:t>
       </w:r>
@@ -1131,26 +1418,36 @@
               <w:end w:w="70" w:type="dxa"/>
             </w:tcMar>
             <w:tcBorders>
-              <w:top w:val="single" w:sz="8" w:space="0" w:color="666666"/>
+              <w:top w:val="single" w:sz="4" w:space="0" w:color="B5C1CC"/>
               <w:start w:val="single" w:sz="8" w:space="0" w:color="666666"/>
-              <w:bottom w:val="single" w:sz="8" w:space="0" w:color="666666"/>
+              <w:bottom w:val="single" w:sz="4" w:space="0" w:color="B5C1CC"/>
               <w:end w:val="single" w:sz="8" w:space="0" w:color="666666"/>
               <w:insideH w:val="single" w:sz="8" w:space="0" w:color="666666"/>
               <w:insideV w:val="single" w:sz="8" w:space="0" w:color="666666"/>
+              <w:left w:val="single" w:sz="4" w:color="B5C1CC"/>
+              <w:right w:val="single" w:sz="4" w:color="B5C1CC"/>
             </w:tcBorders>
-            <w:shd w:fill="D9E1EC"/>
+            <w:shd w:fill="E8EFF6"/>
           </w:tcPr>
           <w:p>
             <w:pPr>
-              <w:spacing w:before="0" w:after="0" w:line="240" w:lineRule="auto"/>
+              <w:spacing w:before="40" w:after="40" w:line="276" w:lineRule="auto"/>
               <w:jc w:val="center"/>
             </w:pPr>
-            <w:r/>
             <w:r>
               <w:rPr>
-                <w:rFonts w:ascii="NanumSquare" w:hAnsi="NanumSquare" w:eastAsia="NanumSquare"/>
+                <w:rFonts w:ascii="맑은 고딕" w:hAnsi="맑은 고딕" w:eastAsia="맑은 고딕"/>
                 <w:b/>
-                <w:sz w:val="16"/>
+                <w:color w:val="24477E"/>
+                <w:sz w:val="17"/>
+              </w:rPr>
+            </w:r>
+            <w:r>
+              <w:rPr>
+                <w:rFonts w:ascii="맑은 고딕" w:hAnsi="맑은 고딕" w:eastAsia="맑은 고딕"/>
+                <w:b/>
+                <w:color w:val="24477E"/>
+                <w:sz w:val="17"/>
               </w:rPr>
               <w:t>유해요인</w:t>
             </w:r>
@@ -1167,26 +1464,36 @@
               <w:end w:w="70" w:type="dxa"/>
             </w:tcMar>
             <w:tcBorders>
-              <w:top w:val="single" w:sz="8" w:space="0" w:color="666666"/>
+              <w:top w:val="single" w:sz="4" w:space="0" w:color="B5C1CC"/>
               <w:start w:val="single" w:sz="8" w:space="0" w:color="666666"/>
-              <w:bottom w:val="single" w:sz="8" w:space="0" w:color="666666"/>
+              <w:bottom w:val="single" w:sz="4" w:space="0" w:color="B5C1CC"/>
               <w:end w:val="single" w:sz="8" w:space="0" w:color="666666"/>
               <w:insideH w:val="single" w:sz="8" w:space="0" w:color="666666"/>
               <w:insideV w:val="single" w:sz="8" w:space="0" w:color="666666"/>
+              <w:left w:val="single" w:sz="4" w:color="B5C1CC"/>
+              <w:right w:val="single" w:sz="4" w:color="B5C1CC"/>
             </w:tcBorders>
-            <w:shd w:fill="D9E1EC"/>
+            <w:shd w:fill="E8EFF6"/>
           </w:tcPr>
           <w:p>
             <w:pPr>
-              <w:spacing w:before="0" w:after="0" w:line="240" w:lineRule="auto"/>
+              <w:spacing w:before="40" w:after="40" w:line="276" w:lineRule="auto"/>
               <w:jc w:val="center"/>
             </w:pPr>
-            <w:r/>
             <w:r>
               <w:rPr>
-                <w:rFonts w:ascii="NanumSquare" w:hAnsi="NanumSquare" w:eastAsia="NanumSquare"/>
+                <w:rFonts w:ascii="맑은 고딕" w:hAnsi="맑은 고딕" w:eastAsia="맑은 고딕"/>
                 <w:b/>
-                <w:sz w:val="16"/>
+                <w:color w:val="24477E"/>
+                <w:sz w:val="17"/>
+              </w:rPr>
+            </w:r>
+            <w:r>
+              <w:rPr>
+                <w:rFonts w:ascii="맑은 고딕" w:hAnsi="맑은 고딕" w:eastAsia="맑은 고딕"/>
+                <w:b/>
+                <w:color w:val="24477E"/>
+                <w:sz w:val="17"/>
               </w:rPr>
               <w:t>세부내용</w:t>
             </w:r>
@@ -1205,25 +1512,36 @@
               <w:end w:w="70" w:type="dxa"/>
             </w:tcMar>
             <w:tcBorders>
-              <w:top w:val="single" w:sz="8" w:space="0" w:color="666666"/>
+              <w:top w:val="single" w:sz="4" w:space="0" w:color="B5C1CC"/>
               <w:start w:val="single" w:sz="8" w:space="0" w:color="666666"/>
-              <w:bottom w:val="single" w:sz="8" w:space="0" w:color="666666"/>
+              <w:bottom w:val="single" w:sz="4" w:space="0" w:color="B5C1CC"/>
               <w:end w:val="single" w:sz="8" w:space="0" w:color="666666"/>
               <w:insideH w:val="single" w:sz="8" w:space="0" w:color="666666"/>
               <w:insideV w:val="single" w:sz="8" w:space="0" w:color="666666"/>
+              <w:left w:val="single" w:sz="4" w:color="B5C1CC"/>
+              <w:right w:val="single" w:sz="4" w:color="B5C1CC"/>
             </w:tcBorders>
+            <w:shd w:fill="F2F5F8"/>
           </w:tcPr>
           <w:p>
             <w:pPr>
-              <w:spacing w:before="0" w:after="0" w:line="240" w:lineRule="auto"/>
+              <w:spacing w:before="40" w:after="40" w:line="276" w:lineRule="auto"/>
               <w:jc w:val="left"/>
             </w:pPr>
-            <w:r/>
             <w:r>
               <w:rPr>
-                <w:rFonts w:ascii="NanumSquare" w:hAnsi="NanumSquare" w:eastAsia="NanumSquare"/>
+                <w:rFonts w:ascii="맑은 고딕" w:hAnsi="맑은 고딕" w:eastAsia="맑은 고딕"/>
                 <w:b w:val="0"/>
-                <w:sz w:val="16"/>
+                <w:color w:val="222222"/>
+                <w:sz w:val="17"/>
+              </w:rPr>
+            </w:r>
+            <w:r>
+              <w:rPr>
+                <w:rFonts w:ascii="맑은 고딕" w:hAnsi="맑은 고딕" w:eastAsia="맑은 고딕"/>
+                <w:b w:val="0"/>
+                <w:color w:val="222222"/>
+                <w:sz w:val="17"/>
               </w:rPr>
               <w:t>부적절한 자세</w:t>
             </w:r>
@@ -1240,25 +1558,35 @@
               <w:end w:w="70" w:type="dxa"/>
             </w:tcMar>
             <w:tcBorders>
-              <w:top w:val="single" w:sz="8" w:space="0" w:color="666666"/>
+              <w:top w:val="single" w:sz="4" w:space="0" w:color="B5C1CC"/>
               <w:start w:val="single" w:sz="8" w:space="0" w:color="666666"/>
-              <w:bottom w:val="single" w:sz="8" w:space="0" w:color="666666"/>
+              <w:bottom w:val="single" w:sz="4" w:space="0" w:color="B5C1CC"/>
               <w:end w:val="single" w:sz="8" w:space="0" w:color="666666"/>
               <w:insideH w:val="single" w:sz="8" w:space="0" w:color="666666"/>
               <w:insideV w:val="single" w:sz="8" w:space="0" w:color="666666"/>
+              <w:left w:val="single" w:sz="4" w:color="B5C1CC"/>
+              <w:right w:val="single" w:sz="4" w:color="B5C1CC"/>
             </w:tcBorders>
           </w:tcPr>
           <w:p>
             <w:pPr>
-              <w:spacing w:before="0" w:after="0" w:line="240" w:lineRule="auto"/>
+              <w:spacing w:before="40" w:after="40" w:line="276" w:lineRule="auto"/>
               <w:jc w:val="left"/>
             </w:pPr>
-            <w:r/>
             <w:r>
               <w:rPr>
-                <w:rFonts w:ascii="NanumSquare" w:hAnsi="NanumSquare" w:eastAsia="NanumSquare"/>
+                <w:rFonts w:ascii="맑은 고딕" w:hAnsi="맑은 고딕" w:eastAsia="맑은 고딕"/>
                 <w:b w:val="0"/>
-                <w:sz w:val="16"/>
+                <w:color w:val="222222"/>
+                <w:sz w:val="17"/>
+              </w:rPr>
+            </w:r>
+            <w:r>
+              <w:rPr>
+                <w:rFonts w:ascii="맑은 고딕" w:hAnsi="맑은 고딕" w:eastAsia="맑은 고딕"/>
+                <w:b w:val="0"/>
+                <w:color w:val="222222"/>
+                <w:sz w:val="17"/>
               </w:rPr>
               <w:t>{{부적절한자세_세부내용}}</w:t>
             </w:r>
@@ -1277,25 +1605,36 @@
               <w:end w:w="70" w:type="dxa"/>
             </w:tcMar>
             <w:tcBorders>
-              <w:top w:val="single" w:sz="8" w:space="0" w:color="666666"/>
+              <w:top w:val="single" w:sz="4" w:space="0" w:color="B5C1CC"/>
               <w:start w:val="single" w:sz="8" w:space="0" w:color="666666"/>
-              <w:bottom w:val="single" w:sz="8" w:space="0" w:color="666666"/>
+              <w:bottom w:val="single" w:sz="4" w:space="0" w:color="B5C1CC"/>
               <w:end w:val="single" w:sz="8" w:space="0" w:color="666666"/>
               <w:insideH w:val="single" w:sz="8" w:space="0" w:color="666666"/>
               <w:insideV w:val="single" w:sz="8" w:space="0" w:color="666666"/>
+              <w:left w:val="single" w:sz="4" w:color="B5C1CC"/>
+              <w:right w:val="single" w:sz="4" w:color="B5C1CC"/>
             </w:tcBorders>
+            <w:shd w:fill="F2F5F8"/>
           </w:tcPr>
           <w:p>
             <w:pPr>
-              <w:spacing w:before="0" w:after="0" w:line="240" w:lineRule="auto"/>
+              <w:spacing w:before="40" w:after="40" w:line="276" w:lineRule="auto"/>
               <w:jc w:val="left"/>
             </w:pPr>
-            <w:r/>
             <w:r>
               <w:rPr>
-                <w:rFonts w:ascii="NanumSquare" w:hAnsi="NanumSquare" w:eastAsia="NanumSquare"/>
+                <w:rFonts w:ascii="맑은 고딕" w:hAnsi="맑은 고딕" w:eastAsia="맑은 고딕"/>
                 <w:b w:val="0"/>
-                <w:sz w:val="16"/>
+                <w:color w:val="222222"/>
+                <w:sz w:val="17"/>
+              </w:rPr>
+            </w:r>
+            <w:r>
+              <w:rPr>
+                <w:rFonts w:ascii="맑은 고딕" w:hAnsi="맑은 고딕" w:eastAsia="맑은 고딕"/>
+                <w:b w:val="0"/>
+                <w:color w:val="222222"/>
+                <w:sz w:val="17"/>
               </w:rPr>
               <w:t>중량물 취급</w:t>
             </w:r>
@@ -1312,25 +1651,35 @@
               <w:end w:w="70" w:type="dxa"/>
             </w:tcMar>
             <w:tcBorders>
-              <w:top w:val="single" w:sz="8" w:space="0" w:color="666666"/>
+              <w:top w:val="single" w:sz="4" w:space="0" w:color="B5C1CC"/>
               <w:start w:val="single" w:sz="8" w:space="0" w:color="666666"/>
-              <w:bottom w:val="single" w:sz="8" w:space="0" w:color="666666"/>
+              <w:bottom w:val="single" w:sz="4" w:space="0" w:color="B5C1CC"/>
               <w:end w:val="single" w:sz="8" w:space="0" w:color="666666"/>
               <w:insideH w:val="single" w:sz="8" w:space="0" w:color="666666"/>
               <w:insideV w:val="single" w:sz="8" w:space="0" w:color="666666"/>
+              <w:left w:val="single" w:sz="4" w:color="B5C1CC"/>
+              <w:right w:val="single" w:sz="4" w:color="B5C1CC"/>
             </w:tcBorders>
           </w:tcPr>
           <w:p>
             <w:pPr>
-              <w:spacing w:before="0" w:after="0" w:line="240" w:lineRule="auto"/>
+              <w:spacing w:before="40" w:after="40" w:line="276" w:lineRule="auto"/>
               <w:jc w:val="left"/>
             </w:pPr>
-            <w:r/>
             <w:r>
               <w:rPr>
-                <w:rFonts w:ascii="NanumSquare" w:hAnsi="NanumSquare" w:eastAsia="NanumSquare"/>
+                <w:rFonts w:ascii="맑은 고딕" w:hAnsi="맑은 고딕" w:eastAsia="맑은 고딕"/>
                 <w:b w:val="0"/>
-                <w:sz w:val="16"/>
+                <w:color w:val="222222"/>
+                <w:sz w:val="17"/>
+              </w:rPr>
+            </w:r>
+            <w:r>
+              <w:rPr>
+                <w:rFonts w:ascii="맑은 고딕" w:hAnsi="맑은 고딕" w:eastAsia="맑은 고딕"/>
+                <w:b w:val="0"/>
+                <w:color w:val="222222"/>
+                <w:sz w:val="17"/>
               </w:rPr>
               <w:t>{{중량물취급_세부내용}}</w:t>
             </w:r>
@@ -1340,13 +1689,15 @@
     </w:tbl>
     <w:p>
       <w:pPr>
-        <w:spacing w:before="80" w:after="80" w:line="240" w:lineRule="auto"/>
+        <w:keepNext/>
+        <w:spacing w:before="180" w:after="100" w:line="300" w:lineRule="auto"/>
       </w:pPr>
       <w:r>
         <w:rPr>
-          <w:rFonts w:ascii="NanumSquare" w:hAnsi="NanumSquare" w:eastAsia="NanumSquare"/>
+          <w:rFonts w:ascii="맑은 고딕" w:hAnsi="맑은 고딕" w:eastAsia="맑은 고딕"/>
           <w:b/>
-          <w:sz w:val="21"/>
+          <w:color w:val="24477E"/>
+          <w:sz w:val="22"/>
         </w:rPr>
         <w:t>라. 작업조건 조사 — 2단계 : 부담작업 평가</w:t>
       </w:r>
@@ -1378,26 +1729,36 @@
               <w:end w:w="70" w:type="dxa"/>
             </w:tcMar>
             <w:tcBorders>
-              <w:top w:val="single" w:sz="8" w:space="0" w:color="666666"/>
+              <w:top w:val="single" w:sz="4" w:space="0" w:color="B5C1CC"/>
               <w:start w:val="single" w:sz="8" w:space="0" w:color="666666"/>
-              <w:bottom w:val="single" w:sz="8" w:space="0" w:color="666666"/>
+              <w:bottom w:val="single" w:sz="4" w:space="0" w:color="B5C1CC"/>
               <w:end w:val="single" w:sz="8" w:space="0" w:color="666666"/>
               <w:insideH w:val="single" w:sz="8" w:space="0" w:color="666666"/>
               <w:insideV w:val="single" w:sz="8" w:space="0" w:color="666666"/>
+              <w:left w:val="single" w:sz="4" w:color="B5C1CC"/>
+              <w:right w:val="single" w:sz="4" w:color="B5C1CC"/>
             </w:tcBorders>
-            <w:shd w:fill="D9E1EC"/>
+            <w:shd w:fill="E8EFF6"/>
           </w:tcPr>
           <w:p>
             <w:pPr>
-              <w:spacing w:before="0" w:after="0" w:line="240" w:lineRule="auto"/>
+              <w:spacing w:before="40" w:after="40" w:line="276" w:lineRule="auto"/>
               <w:jc w:val="center"/>
             </w:pPr>
-            <w:r/>
             <w:r>
               <w:rPr>
-                <w:rFonts w:ascii="NanumSquare" w:hAnsi="NanumSquare" w:eastAsia="NanumSquare"/>
+                <w:rFonts w:ascii="맑은 고딕" w:hAnsi="맑은 고딕" w:eastAsia="맑은 고딕"/>
                 <w:b/>
-                <w:sz w:val="15"/>
+                <w:color w:val="24477E"/>
+                <w:sz w:val="17"/>
+              </w:rPr>
+            </w:r>
+            <w:r>
+              <w:rPr>
+                <w:rFonts w:ascii="맑은 고딕" w:hAnsi="맑은 고딕" w:eastAsia="맑은 고딕"/>
+                <w:b/>
+                <w:color w:val="24477E"/>
+                <w:sz w:val="17"/>
               </w:rPr>
               <w:t>단위작업명</w:t>
             </w:r>
@@ -1414,26 +1775,36 @@
               <w:end w:w="70" w:type="dxa"/>
             </w:tcMar>
             <w:tcBorders>
-              <w:top w:val="single" w:sz="8" w:space="0" w:color="666666"/>
+              <w:top w:val="single" w:sz="4" w:space="0" w:color="B5C1CC"/>
               <w:start w:val="single" w:sz="8" w:space="0" w:color="666666"/>
-              <w:bottom w:val="single" w:sz="8" w:space="0" w:color="666666"/>
+              <w:bottom w:val="single" w:sz="4" w:space="0" w:color="B5C1CC"/>
               <w:end w:val="single" w:sz="8" w:space="0" w:color="666666"/>
               <w:insideH w:val="single" w:sz="8" w:space="0" w:color="666666"/>
               <w:insideV w:val="single" w:sz="8" w:space="0" w:color="666666"/>
+              <w:left w:val="single" w:sz="4" w:color="B5C1CC"/>
+              <w:right w:val="single" w:sz="4" w:color="B5C1CC"/>
             </w:tcBorders>
-            <w:shd w:fill="D9E1EC"/>
+            <w:shd w:fill="E8EFF6"/>
           </w:tcPr>
           <w:p>
             <w:pPr>
-              <w:spacing w:before="0" w:after="0" w:line="240" w:lineRule="auto"/>
+              <w:spacing w:before="40" w:after="40" w:line="276" w:lineRule="auto"/>
               <w:jc w:val="center"/>
             </w:pPr>
-            <w:r/>
             <w:r>
               <w:rPr>
-                <w:rFonts w:ascii="NanumSquare" w:hAnsi="NanumSquare" w:eastAsia="NanumSquare"/>
+                <w:rFonts w:ascii="맑은 고딕" w:hAnsi="맑은 고딕" w:eastAsia="맑은 고딕"/>
                 <w:b/>
-                <w:sz w:val="15"/>
+                <w:color w:val="24477E"/>
+                <w:sz w:val="17"/>
+              </w:rPr>
+            </w:r>
+            <w:r>
+              <w:rPr>
+                <w:rFonts w:ascii="맑은 고딕" w:hAnsi="맑은 고딕" w:eastAsia="맑은 고딕"/>
+                <w:b/>
+                <w:color w:val="24477E"/>
+                <w:sz w:val="17"/>
               </w:rPr>
               <w:t>부담작업(호)</w:t>
             </w:r>
@@ -1450,26 +1821,36 @@
               <w:end w:w="70" w:type="dxa"/>
             </w:tcMar>
             <w:tcBorders>
-              <w:top w:val="single" w:sz="8" w:space="0" w:color="666666"/>
+              <w:top w:val="single" w:sz="4" w:space="0" w:color="B5C1CC"/>
               <w:start w:val="single" w:sz="8" w:space="0" w:color="666666"/>
-              <w:bottom w:val="single" w:sz="8" w:space="0" w:color="666666"/>
+              <w:bottom w:val="single" w:sz="4" w:space="0" w:color="B5C1CC"/>
               <w:end w:val="single" w:sz="8" w:space="0" w:color="666666"/>
               <w:insideH w:val="single" w:sz="8" w:space="0" w:color="666666"/>
               <w:insideV w:val="single" w:sz="8" w:space="0" w:color="666666"/>
+              <w:left w:val="single" w:sz="4" w:color="B5C1CC"/>
+              <w:right w:val="single" w:sz="4" w:color="B5C1CC"/>
             </w:tcBorders>
-            <w:shd w:fill="D9E1EC"/>
+            <w:shd w:fill="E8EFF6"/>
           </w:tcPr>
           <w:p>
             <w:pPr>
-              <w:spacing w:before="0" w:after="0" w:line="240" w:lineRule="auto"/>
+              <w:spacing w:before="40" w:after="40" w:line="276" w:lineRule="auto"/>
               <w:jc w:val="center"/>
             </w:pPr>
-            <w:r/>
             <w:r>
               <w:rPr>
-                <w:rFonts w:ascii="NanumSquare" w:hAnsi="NanumSquare" w:eastAsia="NanumSquare"/>
+                <w:rFonts w:ascii="맑은 고딕" w:hAnsi="맑은 고딕" w:eastAsia="맑은 고딕"/>
                 <w:b/>
-                <w:sz w:val="15"/>
+                <w:color w:val="24477E"/>
+                <w:sz w:val="17"/>
+              </w:rPr>
+            </w:r>
+            <w:r>
+              <w:rPr>
+                <w:rFonts w:ascii="맑은 고딕" w:hAnsi="맑은 고딕" w:eastAsia="맑은 고딕"/>
+                <w:b/>
+                <w:color w:val="24477E"/>
+                <w:sz w:val="17"/>
               </w:rPr>
               <w:t>작업부하(A)</w:t>
             </w:r>
@@ -1486,26 +1867,36 @@
               <w:end w:w="70" w:type="dxa"/>
             </w:tcMar>
             <w:tcBorders>
-              <w:top w:val="single" w:sz="8" w:space="0" w:color="666666"/>
+              <w:top w:val="single" w:sz="4" w:space="0" w:color="B5C1CC"/>
               <w:start w:val="single" w:sz="8" w:space="0" w:color="666666"/>
-              <w:bottom w:val="single" w:sz="8" w:space="0" w:color="666666"/>
+              <w:bottom w:val="single" w:sz="4" w:space="0" w:color="B5C1CC"/>
               <w:end w:val="single" w:sz="8" w:space="0" w:color="666666"/>
               <w:insideH w:val="single" w:sz="8" w:space="0" w:color="666666"/>
               <w:insideV w:val="single" w:sz="8" w:space="0" w:color="666666"/>
+              <w:left w:val="single" w:sz="4" w:color="B5C1CC"/>
+              <w:right w:val="single" w:sz="4" w:color="B5C1CC"/>
             </w:tcBorders>
-            <w:shd w:fill="D9E1EC"/>
+            <w:shd w:fill="E8EFF6"/>
           </w:tcPr>
           <w:p>
             <w:pPr>
-              <w:spacing w:before="0" w:after="0" w:line="240" w:lineRule="auto"/>
+              <w:spacing w:before="40" w:after="40" w:line="276" w:lineRule="auto"/>
               <w:jc w:val="center"/>
             </w:pPr>
-            <w:r/>
             <w:r>
               <w:rPr>
-                <w:rFonts w:ascii="NanumSquare" w:hAnsi="NanumSquare" w:eastAsia="NanumSquare"/>
+                <w:rFonts w:ascii="맑은 고딕" w:hAnsi="맑은 고딕" w:eastAsia="맑은 고딕"/>
                 <w:b/>
-                <w:sz w:val="15"/>
+                <w:color w:val="24477E"/>
+                <w:sz w:val="17"/>
+              </w:rPr>
+            </w:r>
+            <w:r>
+              <w:rPr>
+                <w:rFonts w:ascii="맑은 고딕" w:hAnsi="맑은 고딕" w:eastAsia="맑은 고딕"/>
+                <w:b/>
+                <w:color w:val="24477E"/>
+                <w:sz w:val="17"/>
               </w:rPr>
               <w:t>작업빈도(B)</w:t>
             </w:r>
@@ -1522,26 +1913,36 @@
               <w:end w:w="70" w:type="dxa"/>
             </w:tcMar>
             <w:tcBorders>
-              <w:top w:val="single" w:sz="8" w:space="0" w:color="666666"/>
+              <w:top w:val="single" w:sz="4" w:space="0" w:color="B5C1CC"/>
               <w:start w:val="single" w:sz="8" w:space="0" w:color="666666"/>
-              <w:bottom w:val="single" w:sz="8" w:space="0" w:color="666666"/>
+              <w:bottom w:val="single" w:sz="4" w:space="0" w:color="B5C1CC"/>
               <w:end w:val="single" w:sz="8" w:space="0" w:color="666666"/>
               <w:insideH w:val="single" w:sz="8" w:space="0" w:color="666666"/>
               <w:insideV w:val="single" w:sz="8" w:space="0" w:color="666666"/>
+              <w:left w:val="single" w:sz="4" w:color="B5C1CC"/>
+              <w:right w:val="single" w:sz="4" w:color="B5C1CC"/>
             </w:tcBorders>
-            <w:shd w:fill="D9E1EC"/>
+            <w:shd w:fill="E8EFF6"/>
           </w:tcPr>
           <w:p>
             <w:pPr>
-              <w:spacing w:before="0" w:after="0" w:line="240" w:lineRule="auto"/>
+              <w:spacing w:before="40" w:after="40" w:line="276" w:lineRule="auto"/>
               <w:jc w:val="center"/>
             </w:pPr>
-            <w:r/>
             <w:r>
               <w:rPr>
-                <w:rFonts w:ascii="NanumSquare" w:hAnsi="NanumSquare" w:eastAsia="NanumSquare"/>
+                <w:rFonts w:ascii="맑은 고딕" w:hAnsi="맑은 고딕" w:eastAsia="맑은 고딕"/>
                 <w:b/>
-                <w:sz w:val="15"/>
+                <w:color w:val="24477E"/>
+                <w:sz w:val="17"/>
+              </w:rPr>
+            </w:r>
+            <w:r>
+              <w:rPr>
+                <w:rFonts w:ascii="맑은 고딕" w:hAnsi="맑은 고딕" w:eastAsia="맑은 고딕"/>
+                <w:b/>
+                <w:color w:val="24477E"/>
+                <w:sz w:val="17"/>
               </w:rPr>
               <w:t>총점수(A×B)</w:t>
             </w:r>
@@ -1560,25 +1961,36 @@
               <w:end w:w="70" w:type="dxa"/>
             </w:tcMar>
             <w:tcBorders>
-              <w:top w:val="single" w:sz="8" w:space="0" w:color="666666"/>
+              <w:top w:val="single" w:sz="4" w:space="0" w:color="B5C1CC"/>
               <w:start w:val="single" w:sz="8" w:space="0" w:color="666666"/>
-              <w:bottom w:val="single" w:sz="8" w:space="0" w:color="666666"/>
+              <w:bottom w:val="single" w:sz="4" w:space="0" w:color="B5C1CC"/>
               <w:end w:val="single" w:sz="8" w:space="0" w:color="666666"/>
               <w:insideH w:val="single" w:sz="8" w:space="0" w:color="666666"/>
               <w:insideV w:val="single" w:sz="8" w:space="0" w:color="666666"/>
+              <w:left w:val="single" w:sz="4" w:color="B5C1CC"/>
+              <w:right w:val="single" w:sz="4" w:color="B5C1CC"/>
             </w:tcBorders>
+            <w:shd w:fill="F2F5F8"/>
           </w:tcPr>
           <w:p>
             <w:pPr>
-              <w:spacing w:before="0" w:after="0" w:line="240" w:lineRule="auto"/>
+              <w:spacing w:before="40" w:after="40" w:line="276" w:lineRule="auto"/>
               <w:jc w:val="center"/>
             </w:pPr>
-            <w:r/>
             <w:r>
               <w:rPr>
-                <w:rFonts w:ascii="NanumSquare" w:hAnsi="NanumSquare" w:eastAsia="NanumSquare"/>
+                <w:rFonts w:ascii="맑은 고딕" w:hAnsi="맑은 고딕" w:eastAsia="맑은 고딕"/>
                 <w:b w:val="0"/>
-                <w:sz w:val="16"/>
+                <w:color w:val="222222"/>
+                <w:sz w:val="17"/>
+              </w:rPr>
+            </w:r>
+            <w:r>
+              <w:rPr>
+                <w:rFonts w:ascii="맑은 고딕" w:hAnsi="맑은 고딕" w:eastAsia="맑은 고딕"/>
+                <w:b w:val="0"/>
+                <w:color w:val="222222"/>
+                <w:sz w:val="17"/>
               </w:rPr>
               <w:t>{{단위작업명}}</w:t>
             </w:r>
@@ -1595,25 +2007,35 @@
               <w:end w:w="70" w:type="dxa"/>
             </w:tcMar>
             <w:tcBorders>
-              <w:top w:val="single" w:sz="8" w:space="0" w:color="666666"/>
+              <w:top w:val="single" w:sz="4" w:space="0" w:color="B5C1CC"/>
               <w:start w:val="single" w:sz="8" w:space="0" w:color="666666"/>
-              <w:bottom w:val="single" w:sz="8" w:space="0" w:color="666666"/>
+              <w:bottom w:val="single" w:sz="4" w:space="0" w:color="B5C1CC"/>
               <w:end w:val="single" w:sz="8" w:space="0" w:color="666666"/>
               <w:insideH w:val="single" w:sz="8" w:space="0" w:color="666666"/>
               <w:insideV w:val="single" w:sz="8" w:space="0" w:color="666666"/>
+              <w:left w:val="single" w:sz="4" w:color="B5C1CC"/>
+              <w:right w:val="single" w:sz="4" w:color="B5C1CC"/>
             </w:tcBorders>
           </w:tcPr>
           <w:p>
             <w:pPr>
-              <w:spacing w:before="0" w:after="0" w:line="240" w:lineRule="auto"/>
+              <w:spacing w:before="40" w:after="40" w:line="276" w:lineRule="auto"/>
               <w:jc w:val="center"/>
             </w:pPr>
-            <w:r/>
             <w:r>
               <w:rPr>
-                <w:rFonts w:ascii="NanumSquare" w:hAnsi="NanumSquare" w:eastAsia="NanumSquare"/>
+                <w:rFonts w:ascii="맑은 고딕" w:hAnsi="맑은 고딕" w:eastAsia="맑은 고딕"/>
                 <w:b w:val="0"/>
-                <w:sz w:val="16"/>
+                <w:color w:val="222222"/>
+                <w:sz w:val="17"/>
+              </w:rPr>
+            </w:r>
+            <w:r>
+              <w:rPr>
+                <w:rFonts w:ascii="맑은 고딕" w:hAnsi="맑은 고딕" w:eastAsia="맑은 고딕"/>
+                <w:b w:val="0"/>
+                <w:color w:val="222222"/>
+                <w:sz w:val="17"/>
               </w:rPr>
               <w:t>{{부담작업호}}</w:t>
             </w:r>
@@ -1630,25 +2052,35 @@
               <w:end w:w="70" w:type="dxa"/>
             </w:tcMar>
             <w:tcBorders>
-              <w:top w:val="single" w:sz="8" w:space="0" w:color="666666"/>
+              <w:top w:val="single" w:sz="4" w:space="0" w:color="B5C1CC"/>
               <w:start w:val="single" w:sz="8" w:space="0" w:color="666666"/>
-              <w:bottom w:val="single" w:sz="8" w:space="0" w:color="666666"/>
+              <w:bottom w:val="single" w:sz="4" w:space="0" w:color="B5C1CC"/>
               <w:end w:val="single" w:sz="8" w:space="0" w:color="666666"/>
               <w:insideH w:val="single" w:sz="8" w:space="0" w:color="666666"/>
               <w:insideV w:val="single" w:sz="8" w:space="0" w:color="666666"/>
+              <w:left w:val="single" w:sz="4" w:color="B5C1CC"/>
+              <w:right w:val="single" w:sz="4" w:color="B5C1CC"/>
             </w:tcBorders>
           </w:tcPr>
           <w:p>
             <w:pPr>
-              <w:spacing w:before="0" w:after="0" w:line="240" w:lineRule="auto"/>
+              <w:spacing w:before="40" w:after="40" w:line="276" w:lineRule="auto"/>
               <w:jc w:val="center"/>
             </w:pPr>
-            <w:r/>
             <w:r>
               <w:rPr>
-                <w:rFonts w:ascii="NanumSquare" w:hAnsi="NanumSquare" w:eastAsia="NanumSquare"/>
+                <w:rFonts w:ascii="맑은 고딕" w:hAnsi="맑은 고딕" w:eastAsia="맑은 고딕"/>
                 <w:b w:val="0"/>
-                <w:sz w:val="16"/>
+                <w:color w:val="222222"/>
+                <w:sz w:val="17"/>
+              </w:rPr>
+            </w:r>
+            <w:r>
+              <w:rPr>
+                <w:rFonts w:ascii="맑은 고딕" w:hAnsi="맑은 고딕" w:eastAsia="맑은 고딕"/>
+                <w:b w:val="0"/>
+                <w:color w:val="222222"/>
+                <w:sz w:val="17"/>
               </w:rPr>
               <w:t>{{작업부하A}}</w:t>
             </w:r>
@@ -1665,25 +2097,35 @@
               <w:end w:w="70" w:type="dxa"/>
             </w:tcMar>
             <w:tcBorders>
-              <w:top w:val="single" w:sz="8" w:space="0" w:color="666666"/>
+              <w:top w:val="single" w:sz="4" w:space="0" w:color="B5C1CC"/>
               <w:start w:val="single" w:sz="8" w:space="0" w:color="666666"/>
-              <w:bottom w:val="single" w:sz="8" w:space="0" w:color="666666"/>
+              <w:bottom w:val="single" w:sz="4" w:space="0" w:color="B5C1CC"/>
               <w:end w:val="single" w:sz="8" w:space="0" w:color="666666"/>
               <w:insideH w:val="single" w:sz="8" w:space="0" w:color="666666"/>
               <w:insideV w:val="single" w:sz="8" w:space="0" w:color="666666"/>
+              <w:left w:val="single" w:sz="4" w:color="B5C1CC"/>
+              <w:right w:val="single" w:sz="4" w:color="B5C1CC"/>
             </w:tcBorders>
           </w:tcPr>
           <w:p>
             <w:pPr>
-              <w:spacing w:before="0" w:after="0" w:line="240" w:lineRule="auto"/>
+              <w:spacing w:before="40" w:after="40" w:line="276" w:lineRule="auto"/>
               <w:jc w:val="center"/>
             </w:pPr>
-            <w:r/>
             <w:r>
               <w:rPr>
-                <w:rFonts w:ascii="NanumSquare" w:hAnsi="NanumSquare" w:eastAsia="NanumSquare"/>
+                <w:rFonts w:ascii="맑은 고딕" w:hAnsi="맑은 고딕" w:eastAsia="맑은 고딕"/>
                 <w:b w:val="0"/>
-                <w:sz w:val="16"/>
+                <w:color w:val="222222"/>
+                <w:sz w:val="17"/>
+              </w:rPr>
+            </w:r>
+            <w:r>
+              <w:rPr>
+                <w:rFonts w:ascii="맑은 고딕" w:hAnsi="맑은 고딕" w:eastAsia="맑은 고딕"/>
+                <w:b w:val="0"/>
+                <w:color w:val="222222"/>
+                <w:sz w:val="17"/>
               </w:rPr>
               <w:t>{{작업빈도B}}</w:t>
             </w:r>
@@ -1700,25 +2142,35 @@
               <w:end w:w="70" w:type="dxa"/>
             </w:tcMar>
             <w:tcBorders>
-              <w:top w:val="single" w:sz="8" w:space="0" w:color="666666"/>
+              <w:top w:val="single" w:sz="4" w:space="0" w:color="B5C1CC"/>
               <w:start w:val="single" w:sz="8" w:space="0" w:color="666666"/>
-              <w:bottom w:val="single" w:sz="8" w:space="0" w:color="666666"/>
+              <w:bottom w:val="single" w:sz="4" w:space="0" w:color="B5C1CC"/>
               <w:end w:val="single" w:sz="8" w:space="0" w:color="666666"/>
               <w:insideH w:val="single" w:sz="8" w:space="0" w:color="666666"/>
               <w:insideV w:val="single" w:sz="8" w:space="0" w:color="666666"/>
+              <w:left w:val="single" w:sz="4" w:color="B5C1CC"/>
+              <w:right w:val="single" w:sz="4" w:color="B5C1CC"/>
             </w:tcBorders>
           </w:tcPr>
           <w:p>
             <w:pPr>
-              <w:spacing w:before="0" w:after="0" w:line="240" w:lineRule="auto"/>
+              <w:spacing w:before="40" w:after="40" w:line="276" w:lineRule="auto"/>
               <w:jc w:val="center"/>
             </w:pPr>
-            <w:r/>
             <w:r>
               <w:rPr>
-                <w:rFonts w:ascii="NanumSquare" w:hAnsi="NanumSquare" w:eastAsia="NanumSquare"/>
+                <w:rFonts w:ascii="맑은 고딕" w:hAnsi="맑은 고딕" w:eastAsia="맑은 고딕"/>
                 <w:b w:val="0"/>
-                <w:sz w:val="16"/>
+                <w:color w:val="222222"/>
+                <w:sz w:val="17"/>
+              </w:rPr>
+            </w:r>
+            <w:r>
+              <w:rPr>
+                <w:rFonts w:ascii="맑은 고딕" w:hAnsi="맑은 고딕" w:eastAsia="맑은 고딕"/>
+                <w:b w:val="0"/>
+                <w:color w:val="222222"/>
+                <w:sz w:val="17"/>
               </w:rPr>
               <w:t>{{부담작업총점}}</w:t>
             </w:r>
@@ -1727,14 +2179,21 @@
       </w:tr>
     </w:tbl>
     <w:p>
-      <w:pPr/>
+      <w:pPr>
+        <w:spacing w:before="0" w:after="60" w:line="300" w:lineRule="auto"/>
+      </w:pPr>
       <w:r>
+        <w:rPr>
+          <w:rFonts w:ascii="맑은 고딕" w:hAnsi="맑은 고딕" w:eastAsia="맑은 고딕"/>
+          <w:color w:val="222222"/>
+          <w:sz w:val="18"/>
+        </w:rPr>
         <w:br w:type="page"/>
       </w:r>
     </w:p>
     <w:p>
       <w:pPr>
-        <w:spacing w:before="80" w:after="80" w:line="240" w:lineRule="auto"/>
+        <w:spacing w:before="0" w:after="60" w:line="300" w:lineRule="auto"/>
       </w:pPr>
     </w:p>
     <w:tbl>
@@ -1762,26 +2221,36 @@
               <w:end w:w="70" w:type="dxa"/>
             </w:tcMar>
             <w:tcBorders>
-              <w:top w:val="single" w:sz="8" w:space="0" w:color="666666"/>
+              <w:top w:val="single" w:sz="4" w:space="0" w:color="B5C1CC"/>
               <w:start w:val="single" w:sz="8" w:space="0" w:color="666666"/>
-              <w:bottom w:val="single" w:sz="8" w:space="0" w:color="666666"/>
+              <w:bottom w:val="single" w:sz="4" w:space="0" w:color="B5C1CC"/>
               <w:end w:val="single" w:sz="8" w:space="0" w:color="666666"/>
               <w:insideH w:val="single" w:sz="8" w:space="0" w:color="666666"/>
               <w:insideV w:val="single" w:sz="8" w:space="0" w:color="666666"/>
+              <w:left w:val="single" w:sz="4" w:color="B5C1CC"/>
+              <w:right w:val="single" w:sz="4" w:color="B5C1CC"/>
             </w:tcBorders>
-            <w:shd w:fill="D9E1EC"/>
+            <w:shd w:fill="E8EFF6"/>
           </w:tcPr>
           <w:p>
             <w:pPr>
-              <w:spacing w:before="0" w:after="0" w:line="240" w:lineRule="auto"/>
+              <w:spacing w:before="40" w:after="40" w:line="276" w:lineRule="auto"/>
               <w:jc w:val="center"/>
             </w:pPr>
-            <w:r/>
             <w:r>
               <w:rPr>
-                <w:rFonts w:ascii="NanumSquare" w:hAnsi="NanumSquare" w:eastAsia="NanumSquare"/>
+                <w:rFonts w:ascii="맑은 고딕" w:hAnsi="맑은 고딕" w:eastAsia="맑은 고딕"/>
                 <w:b/>
-                <w:sz w:val="16"/>
+                <w:color w:val="24477E"/>
+                <w:sz w:val="17"/>
+              </w:rPr>
+            </w:r>
+            <w:r>
+              <w:rPr>
+                <w:rFonts w:ascii="맑은 고딕" w:hAnsi="맑은 고딕" w:eastAsia="맑은 고딕"/>
+                <w:b/>
+                <w:color w:val="24477E"/>
+                <w:sz w:val="17"/>
               </w:rPr>
               <w:t>신체부위</w:t>
             </w:r>
@@ -1798,26 +2267,36 @@
               <w:end w:w="70" w:type="dxa"/>
             </w:tcMar>
             <w:tcBorders>
-              <w:top w:val="single" w:sz="8" w:space="0" w:color="666666"/>
+              <w:top w:val="single" w:sz="4" w:space="0" w:color="B5C1CC"/>
               <w:start w:val="single" w:sz="8" w:space="0" w:color="666666"/>
-              <w:bottom w:val="single" w:sz="8" w:space="0" w:color="666666"/>
+              <w:bottom w:val="single" w:sz="4" w:space="0" w:color="B5C1CC"/>
               <w:end w:val="single" w:sz="8" w:space="0" w:color="666666"/>
               <w:insideH w:val="single" w:sz="8" w:space="0" w:color="666666"/>
               <w:insideV w:val="single" w:sz="8" w:space="0" w:color="666666"/>
+              <w:left w:val="single" w:sz="4" w:color="B5C1CC"/>
+              <w:right w:val="single" w:sz="4" w:color="B5C1CC"/>
             </w:tcBorders>
-            <w:shd w:fill="D9E1EC"/>
+            <w:shd w:fill="E8EFF6"/>
           </w:tcPr>
           <w:p>
             <w:pPr>
-              <w:spacing w:before="0" w:after="0" w:line="240" w:lineRule="auto"/>
+              <w:spacing w:before="40" w:after="40" w:line="276" w:lineRule="auto"/>
               <w:jc w:val="center"/>
             </w:pPr>
-            <w:r/>
             <w:r>
               <w:rPr>
-                <w:rFonts w:ascii="NanumSquare" w:hAnsi="NanumSquare" w:eastAsia="NanumSquare"/>
+                <w:rFonts w:ascii="맑은 고딕" w:hAnsi="맑은 고딕" w:eastAsia="맑은 고딕"/>
                 <w:b/>
-                <w:sz w:val="16"/>
+                <w:color w:val="24477E"/>
+                <w:sz w:val="17"/>
+              </w:rPr>
+            </w:r>
+            <w:r>
+              <w:rPr>
+                <w:rFonts w:ascii="맑은 고딕" w:hAnsi="맑은 고딕" w:eastAsia="맑은 고딕"/>
+                <w:b/>
+                <w:color w:val="24477E"/>
+                <w:sz w:val="17"/>
               </w:rPr>
               <w:t>점수</w:t>
             </w:r>
@@ -1834,26 +2313,36 @@
               <w:end w:w="70" w:type="dxa"/>
             </w:tcMar>
             <w:tcBorders>
-              <w:top w:val="single" w:sz="8" w:space="0" w:color="666666"/>
+              <w:top w:val="single" w:sz="4" w:space="0" w:color="B5C1CC"/>
               <w:start w:val="single" w:sz="8" w:space="0" w:color="666666"/>
-              <w:bottom w:val="single" w:sz="8" w:space="0" w:color="666666"/>
+              <w:bottom w:val="single" w:sz="4" w:space="0" w:color="B5C1CC"/>
               <w:end w:val="single" w:sz="8" w:space="0" w:color="666666"/>
               <w:insideH w:val="single" w:sz="8" w:space="0" w:color="666666"/>
               <w:insideV w:val="single" w:sz="8" w:space="0" w:color="666666"/>
+              <w:left w:val="single" w:sz="4" w:color="B5C1CC"/>
+              <w:right w:val="single" w:sz="4" w:color="B5C1CC"/>
             </w:tcBorders>
-            <w:shd w:fill="D9E1EC"/>
+            <w:shd w:fill="E8EFF6"/>
           </w:tcPr>
           <w:p>
             <w:pPr>
-              <w:spacing w:before="0" w:after="0" w:line="240" w:lineRule="auto"/>
+              <w:spacing w:before="40" w:after="40" w:line="276" w:lineRule="auto"/>
               <w:jc w:val="center"/>
             </w:pPr>
-            <w:r/>
             <w:r>
               <w:rPr>
-                <w:rFonts w:ascii="NanumSquare" w:hAnsi="NanumSquare" w:eastAsia="NanumSquare"/>
+                <w:rFonts w:ascii="맑은 고딕" w:hAnsi="맑은 고딕" w:eastAsia="맑은 고딕"/>
                 <w:b/>
-                <w:sz w:val="16"/>
+                <w:color w:val="24477E"/>
+                <w:sz w:val="17"/>
+              </w:rPr>
+            </w:r>
+            <w:r>
+              <w:rPr>
+                <w:rFonts w:ascii="맑은 고딕" w:hAnsi="맑은 고딕" w:eastAsia="맑은 고딕"/>
+                <w:b/>
+                <w:color w:val="24477E"/>
+                <w:sz w:val="17"/>
               </w:rPr>
               <w:t>자세 분석 설명</w:t>
             </w:r>
@@ -1872,25 +2361,36 @@
               <w:end w:w="70" w:type="dxa"/>
             </w:tcMar>
             <w:tcBorders>
-              <w:top w:val="single" w:sz="8" w:space="0" w:color="666666"/>
+              <w:top w:val="single" w:sz="4" w:space="0" w:color="B5C1CC"/>
               <w:start w:val="single" w:sz="8" w:space="0" w:color="666666"/>
-              <w:bottom w:val="single" w:sz="8" w:space="0" w:color="666666"/>
+              <w:bottom w:val="single" w:sz="4" w:space="0" w:color="B5C1CC"/>
               <w:end w:val="single" w:sz="8" w:space="0" w:color="666666"/>
               <w:insideH w:val="single" w:sz="8" w:space="0" w:color="666666"/>
               <w:insideV w:val="single" w:sz="8" w:space="0" w:color="666666"/>
+              <w:left w:val="single" w:sz="4" w:color="B5C1CC"/>
+              <w:right w:val="single" w:sz="4" w:color="B5C1CC"/>
             </w:tcBorders>
+            <w:shd w:fill="F2F5F8"/>
           </w:tcPr>
           <w:p>
             <w:pPr>
-              <w:spacing w:before="0" w:after="0" w:line="240" w:lineRule="auto"/>
+              <w:spacing w:before="40" w:after="40" w:line="276" w:lineRule="auto"/>
               <w:jc w:val="left"/>
             </w:pPr>
-            <w:r/>
             <w:r>
               <w:rPr>
-                <w:rFonts w:ascii="NanumSquare" w:hAnsi="NanumSquare" w:eastAsia="NanumSquare"/>
+                <w:rFonts w:ascii="맑은 고딕" w:hAnsi="맑은 고딕" w:eastAsia="맑은 고딕"/>
                 <w:b w:val="0"/>
-                <w:sz w:val="15"/>
+                <w:color w:val="222222"/>
+                <w:sz w:val="17"/>
+              </w:rPr>
+            </w:r>
+            <w:r>
+              <w:rPr>
+                <w:rFonts w:ascii="맑은 고딕" w:hAnsi="맑은 고딕" w:eastAsia="맑은 고딕"/>
+                <w:b w:val="0"/>
+                <w:color w:val="222222"/>
+                <w:sz w:val="17"/>
               </w:rPr>
               <w:t>목(Neck)</w:t>
             </w:r>
@@ -1907,25 +2407,35 @@
               <w:end w:w="70" w:type="dxa"/>
             </w:tcMar>
             <w:tcBorders>
-              <w:top w:val="single" w:sz="8" w:space="0" w:color="666666"/>
+              <w:top w:val="single" w:sz="4" w:space="0" w:color="B5C1CC"/>
               <w:start w:val="single" w:sz="8" w:space="0" w:color="666666"/>
-              <w:bottom w:val="single" w:sz="8" w:space="0" w:color="666666"/>
+              <w:bottom w:val="single" w:sz="4" w:space="0" w:color="B5C1CC"/>
               <w:end w:val="single" w:sz="8" w:space="0" w:color="666666"/>
               <w:insideH w:val="single" w:sz="8" w:space="0" w:color="666666"/>
               <w:insideV w:val="single" w:sz="8" w:space="0" w:color="666666"/>
+              <w:left w:val="single" w:sz="4" w:color="B5C1CC"/>
+              <w:right w:val="single" w:sz="4" w:color="B5C1CC"/>
             </w:tcBorders>
           </w:tcPr>
           <w:p>
             <w:pPr>
-              <w:spacing w:before="0" w:after="0" w:line="240" w:lineRule="auto"/>
+              <w:spacing w:before="40" w:after="40" w:line="276" w:lineRule="auto"/>
               <w:jc w:val="center"/>
             </w:pPr>
-            <w:r/>
             <w:r>
               <w:rPr>
-                <w:rFonts w:ascii="NanumSquare" w:hAnsi="NanumSquare" w:eastAsia="NanumSquare"/>
+                <w:rFonts w:ascii="맑은 고딕" w:hAnsi="맑은 고딕" w:eastAsia="맑은 고딕"/>
                 <w:b w:val="0"/>
-                <w:sz w:val="16"/>
+                <w:color w:val="222222"/>
+                <w:sz w:val="17"/>
+              </w:rPr>
+            </w:r>
+            <w:r>
+              <w:rPr>
+                <w:rFonts w:ascii="맑은 고딕" w:hAnsi="맑은 고딕" w:eastAsia="맑은 고딕"/>
+                <w:b w:val="0"/>
+                <w:color w:val="222222"/>
+                <w:sz w:val="17"/>
               </w:rPr>
               <w:t>{{목점수}}</w:t>
             </w:r>
@@ -1942,25 +2452,35 @@
               <w:end w:w="70" w:type="dxa"/>
             </w:tcMar>
             <w:tcBorders>
-              <w:top w:val="single" w:sz="8" w:space="0" w:color="666666"/>
+              <w:top w:val="single" w:sz="4" w:space="0" w:color="B5C1CC"/>
               <w:start w:val="single" w:sz="8" w:space="0" w:color="666666"/>
-              <w:bottom w:val="single" w:sz="8" w:space="0" w:color="666666"/>
+              <w:bottom w:val="single" w:sz="4" w:space="0" w:color="B5C1CC"/>
               <w:end w:val="single" w:sz="8" w:space="0" w:color="666666"/>
               <w:insideH w:val="single" w:sz="8" w:space="0" w:color="666666"/>
               <w:insideV w:val="single" w:sz="8" w:space="0" w:color="666666"/>
+              <w:left w:val="single" w:sz="4" w:color="B5C1CC"/>
+              <w:right w:val="single" w:sz="4" w:color="B5C1CC"/>
             </w:tcBorders>
           </w:tcPr>
           <w:p>
             <w:pPr>
-              <w:spacing w:before="0" w:after="0" w:line="240" w:lineRule="auto"/>
+              <w:spacing w:before="40" w:after="40" w:line="276" w:lineRule="auto"/>
               <w:jc w:val="left"/>
             </w:pPr>
-            <w:r/>
             <w:r>
               <w:rPr>
-                <w:rFonts w:ascii="NanumSquare" w:hAnsi="NanumSquare" w:eastAsia="NanumSquare"/>
+                <w:rFonts w:ascii="맑은 고딕" w:hAnsi="맑은 고딕" w:eastAsia="맑은 고딕"/>
                 <w:b w:val="0"/>
-                <w:sz w:val="15"/>
+                <w:color w:val="222222"/>
+                <w:sz w:val="17"/>
+              </w:rPr>
+            </w:r>
+            <w:r>
+              <w:rPr>
+                <w:rFonts w:ascii="맑은 고딕" w:hAnsi="맑은 고딕" w:eastAsia="맑은 고딕"/>
+                <w:b w:val="0"/>
+                <w:color w:val="222222"/>
+                <w:sz w:val="17"/>
               </w:rPr>
               <w:t>{{목_자세분석}}</w:t>
             </w:r>
@@ -1979,25 +2499,36 @@
               <w:end w:w="70" w:type="dxa"/>
             </w:tcMar>
             <w:tcBorders>
-              <w:top w:val="single" w:sz="8" w:space="0" w:color="666666"/>
+              <w:top w:val="single" w:sz="4" w:space="0" w:color="B5C1CC"/>
               <w:start w:val="single" w:sz="8" w:space="0" w:color="666666"/>
-              <w:bottom w:val="single" w:sz="8" w:space="0" w:color="666666"/>
+              <w:bottom w:val="single" w:sz="4" w:space="0" w:color="B5C1CC"/>
               <w:end w:val="single" w:sz="8" w:space="0" w:color="666666"/>
               <w:insideH w:val="single" w:sz="8" w:space="0" w:color="666666"/>
               <w:insideV w:val="single" w:sz="8" w:space="0" w:color="666666"/>
+              <w:left w:val="single" w:sz="4" w:color="B5C1CC"/>
+              <w:right w:val="single" w:sz="4" w:color="B5C1CC"/>
             </w:tcBorders>
+            <w:shd w:fill="F2F5F8"/>
           </w:tcPr>
           <w:p>
             <w:pPr>
-              <w:spacing w:before="0" w:after="0" w:line="240" w:lineRule="auto"/>
+              <w:spacing w:before="40" w:after="40" w:line="276" w:lineRule="auto"/>
               <w:jc w:val="left"/>
             </w:pPr>
-            <w:r/>
             <w:r>
               <w:rPr>
-                <w:rFonts w:ascii="NanumSquare" w:hAnsi="NanumSquare" w:eastAsia="NanumSquare"/>
+                <w:rFonts w:ascii="맑은 고딕" w:hAnsi="맑은 고딕" w:eastAsia="맑은 고딕"/>
                 <w:b w:val="0"/>
-                <w:sz w:val="15"/>
+                <w:color w:val="222222"/>
+                <w:sz w:val="17"/>
+              </w:rPr>
+            </w:r>
+            <w:r>
+              <w:rPr>
+                <w:rFonts w:ascii="맑은 고딕" w:hAnsi="맑은 고딕" w:eastAsia="맑은 고딕"/>
+                <w:b w:val="0"/>
+                <w:color w:val="222222"/>
+                <w:sz w:val="17"/>
               </w:rPr>
               <w:t>몸통(Trunk)</w:t>
             </w:r>
@@ -2014,25 +2545,35 @@
               <w:end w:w="70" w:type="dxa"/>
             </w:tcMar>
             <w:tcBorders>
-              <w:top w:val="single" w:sz="8" w:space="0" w:color="666666"/>
+              <w:top w:val="single" w:sz="4" w:space="0" w:color="B5C1CC"/>
               <w:start w:val="single" w:sz="8" w:space="0" w:color="666666"/>
-              <w:bottom w:val="single" w:sz="8" w:space="0" w:color="666666"/>
+              <w:bottom w:val="single" w:sz="4" w:space="0" w:color="B5C1CC"/>
               <w:end w:val="single" w:sz="8" w:space="0" w:color="666666"/>
               <w:insideH w:val="single" w:sz="8" w:space="0" w:color="666666"/>
               <w:insideV w:val="single" w:sz="8" w:space="0" w:color="666666"/>
+              <w:left w:val="single" w:sz="4" w:color="B5C1CC"/>
+              <w:right w:val="single" w:sz="4" w:color="B5C1CC"/>
             </w:tcBorders>
           </w:tcPr>
           <w:p>
             <w:pPr>
-              <w:spacing w:before="0" w:after="0" w:line="240" w:lineRule="auto"/>
+              <w:spacing w:before="40" w:after="40" w:line="276" w:lineRule="auto"/>
               <w:jc w:val="center"/>
             </w:pPr>
-            <w:r/>
             <w:r>
               <w:rPr>
-                <w:rFonts w:ascii="NanumSquare" w:hAnsi="NanumSquare" w:eastAsia="NanumSquare"/>
+                <w:rFonts w:ascii="맑은 고딕" w:hAnsi="맑은 고딕" w:eastAsia="맑은 고딕"/>
                 <w:b w:val="0"/>
-                <w:sz w:val="16"/>
+                <w:color w:val="222222"/>
+                <w:sz w:val="17"/>
+              </w:rPr>
+            </w:r>
+            <w:r>
+              <w:rPr>
+                <w:rFonts w:ascii="맑은 고딕" w:hAnsi="맑은 고딕" w:eastAsia="맑은 고딕"/>
+                <w:b w:val="0"/>
+                <w:color w:val="222222"/>
+                <w:sz w:val="17"/>
               </w:rPr>
               <w:t>{{몸통점수}}</w:t>
             </w:r>
@@ -2049,25 +2590,35 @@
               <w:end w:w="70" w:type="dxa"/>
             </w:tcMar>
             <w:tcBorders>
-              <w:top w:val="single" w:sz="8" w:space="0" w:color="666666"/>
+              <w:top w:val="single" w:sz="4" w:space="0" w:color="B5C1CC"/>
               <w:start w:val="single" w:sz="8" w:space="0" w:color="666666"/>
-              <w:bottom w:val="single" w:sz="8" w:space="0" w:color="666666"/>
+              <w:bottom w:val="single" w:sz="4" w:space="0" w:color="B5C1CC"/>
               <w:end w:val="single" w:sz="8" w:space="0" w:color="666666"/>
               <w:insideH w:val="single" w:sz="8" w:space="0" w:color="666666"/>
               <w:insideV w:val="single" w:sz="8" w:space="0" w:color="666666"/>
+              <w:left w:val="single" w:sz="4" w:color="B5C1CC"/>
+              <w:right w:val="single" w:sz="4" w:color="B5C1CC"/>
             </w:tcBorders>
           </w:tcPr>
           <w:p>
             <w:pPr>
-              <w:spacing w:before="0" w:after="0" w:line="240" w:lineRule="auto"/>
+              <w:spacing w:before="40" w:after="40" w:line="276" w:lineRule="auto"/>
               <w:jc w:val="left"/>
             </w:pPr>
-            <w:r/>
             <w:r>
               <w:rPr>
-                <w:rFonts w:ascii="NanumSquare" w:hAnsi="NanumSquare" w:eastAsia="NanumSquare"/>
+                <w:rFonts w:ascii="맑은 고딕" w:hAnsi="맑은 고딕" w:eastAsia="맑은 고딕"/>
                 <w:b w:val="0"/>
-                <w:sz w:val="15"/>
+                <w:color w:val="222222"/>
+                <w:sz w:val="17"/>
+              </w:rPr>
+            </w:r>
+            <w:r>
+              <w:rPr>
+                <w:rFonts w:ascii="맑은 고딕" w:hAnsi="맑은 고딕" w:eastAsia="맑은 고딕"/>
+                <w:b w:val="0"/>
+                <w:color w:val="222222"/>
+                <w:sz w:val="17"/>
               </w:rPr>
               <w:t>{{몸통_자세분석}}</w:t>
             </w:r>
@@ -2086,25 +2637,36 @@
               <w:end w:w="70" w:type="dxa"/>
             </w:tcMar>
             <w:tcBorders>
-              <w:top w:val="single" w:sz="8" w:space="0" w:color="666666"/>
+              <w:top w:val="single" w:sz="4" w:space="0" w:color="B5C1CC"/>
               <w:start w:val="single" w:sz="8" w:space="0" w:color="666666"/>
-              <w:bottom w:val="single" w:sz="8" w:space="0" w:color="666666"/>
+              <w:bottom w:val="single" w:sz="4" w:space="0" w:color="B5C1CC"/>
               <w:end w:val="single" w:sz="8" w:space="0" w:color="666666"/>
               <w:insideH w:val="single" w:sz="8" w:space="0" w:color="666666"/>
               <w:insideV w:val="single" w:sz="8" w:space="0" w:color="666666"/>
+              <w:left w:val="single" w:sz="4" w:color="B5C1CC"/>
+              <w:right w:val="single" w:sz="4" w:color="B5C1CC"/>
             </w:tcBorders>
+            <w:shd w:fill="F2F5F8"/>
           </w:tcPr>
           <w:p>
             <w:pPr>
-              <w:spacing w:before="0" w:after="0" w:line="240" w:lineRule="auto"/>
+              <w:spacing w:before="40" w:after="40" w:line="276" w:lineRule="auto"/>
               <w:jc w:val="left"/>
             </w:pPr>
-            <w:r/>
             <w:r>
               <w:rPr>
-                <w:rFonts w:ascii="NanumSquare" w:hAnsi="NanumSquare" w:eastAsia="NanumSquare"/>
+                <w:rFonts w:ascii="맑은 고딕" w:hAnsi="맑은 고딕" w:eastAsia="맑은 고딕"/>
                 <w:b w:val="0"/>
-                <w:sz w:val="15"/>
+                <w:color w:val="222222"/>
+                <w:sz w:val="17"/>
+              </w:rPr>
+            </w:r>
+            <w:r>
+              <w:rPr>
+                <w:rFonts w:ascii="맑은 고딕" w:hAnsi="맑은 고딕" w:eastAsia="맑은 고딕"/>
+                <w:b w:val="0"/>
+                <w:color w:val="222222"/>
+                <w:sz w:val="17"/>
               </w:rPr>
               <w:t>다리(Legs)</w:t>
             </w:r>
@@ -2121,25 +2683,35 @@
               <w:end w:w="70" w:type="dxa"/>
             </w:tcMar>
             <w:tcBorders>
-              <w:top w:val="single" w:sz="8" w:space="0" w:color="666666"/>
+              <w:top w:val="single" w:sz="4" w:space="0" w:color="B5C1CC"/>
               <w:start w:val="single" w:sz="8" w:space="0" w:color="666666"/>
-              <w:bottom w:val="single" w:sz="8" w:space="0" w:color="666666"/>
+              <w:bottom w:val="single" w:sz="4" w:space="0" w:color="B5C1CC"/>
               <w:end w:val="single" w:sz="8" w:space="0" w:color="666666"/>
               <w:insideH w:val="single" w:sz="8" w:space="0" w:color="666666"/>
               <w:insideV w:val="single" w:sz="8" w:space="0" w:color="666666"/>
+              <w:left w:val="single" w:sz="4" w:color="B5C1CC"/>
+              <w:right w:val="single" w:sz="4" w:color="B5C1CC"/>
             </w:tcBorders>
           </w:tcPr>
           <w:p>
             <w:pPr>
-              <w:spacing w:before="0" w:after="0" w:line="240" w:lineRule="auto"/>
+              <w:spacing w:before="40" w:after="40" w:line="276" w:lineRule="auto"/>
               <w:jc w:val="center"/>
             </w:pPr>
-            <w:r/>
             <w:r>
               <w:rPr>
-                <w:rFonts w:ascii="NanumSquare" w:hAnsi="NanumSquare" w:eastAsia="NanumSquare"/>
+                <w:rFonts w:ascii="맑은 고딕" w:hAnsi="맑은 고딕" w:eastAsia="맑은 고딕"/>
                 <w:b w:val="0"/>
-                <w:sz w:val="16"/>
+                <w:color w:val="222222"/>
+                <w:sz w:val="17"/>
+              </w:rPr>
+            </w:r>
+            <w:r>
+              <w:rPr>
+                <w:rFonts w:ascii="맑은 고딕" w:hAnsi="맑은 고딕" w:eastAsia="맑은 고딕"/>
+                <w:b w:val="0"/>
+                <w:color w:val="222222"/>
+                <w:sz w:val="17"/>
               </w:rPr>
               <w:t>{{다리점수}}</w:t>
             </w:r>
@@ -2156,25 +2728,35 @@
               <w:end w:w="70" w:type="dxa"/>
             </w:tcMar>
             <w:tcBorders>
-              <w:top w:val="single" w:sz="8" w:space="0" w:color="666666"/>
+              <w:top w:val="single" w:sz="4" w:space="0" w:color="B5C1CC"/>
               <w:start w:val="single" w:sz="8" w:space="0" w:color="666666"/>
-              <w:bottom w:val="single" w:sz="8" w:space="0" w:color="666666"/>
+              <w:bottom w:val="single" w:sz="4" w:space="0" w:color="B5C1CC"/>
               <w:end w:val="single" w:sz="8" w:space="0" w:color="666666"/>
               <w:insideH w:val="single" w:sz="8" w:space="0" w:color="666666"/>
               <w:insideV w:val="single" w:sz="8" w:space="0" w:color="666666"/>
+              <w:left w:val="single" w:sz="4" w:color="B5C1CC"/>
+              <w:right w:val="single" w:sz="4" w:color="B5C1CC"/>
             </w:tcBorders>
           </w:tcPr>
           <w:p>
             <w:pPr>
-              <w:spacing w:before="0" w:after="0" w:line="240" w:lineRule="auto"/>
+              <w:spacing w:before="40" w:after="40" w:line="276" w:lineRule="auto"/>
               <w:jc w:val="left"/>
             </w:pPr>
-            <w:r/>
             <w:r>
               <w:rPr>
-                <w:rFonts w:ascii="NanumSquare" w:hAnsi="NanumSquare" w:eastAsia="NanumSquare"/>
+                <w:rFonts w:ascii="맑은 고딕" w:hAnsi="맑은 고딕" w:eastAsia="맑은 고딕"/>
                 <w:b w:val="0"/>
-                <w:sz w:val="15"/>
+                <w:color w:val="222222"/>
+                <w:sz w:val="17"/>
+              </w:rPr>
+            </w:r>
+            <w:r>
+              <w:rPr>
+                <w:rFonts w:ascii="맑은 고딕" w:hAnsi="맑은 고딕" w:eastAsia="맑은 고딕"/>
+                <w:b w:val="0"/>
+                <w:color w:val="222222"/>
+                <w:sz w:val="17"/>
               </w:rPr>
               <w:t>{{다리_자세분석}}</w:t>
             </w:r>
@@ -2193,25 +2775,36 @@
               <w:end w:w="70" w:type="dxa"/>
             </w:tcMar>
             <w:tcBorders>
-              <w:top w:val="single" w:sz="8" w:space="0" w:color="666666"/>
+              <w:top w:val="single" w:sz="4" w:space="0" w:color="B5C1CC"/>
               <w:start w:val="single" w:sz="8" w:space="0" w:color="666666"/>
-              <w:bottom w:val="single" w:sz="8" w:space="0" w:color="666666"/>
+              <w:bottom w:val="single" w:sz="4" w:space="0" w:color="B5C1CC"/>
               <w:end w:val="single" w:sz="8" w:space="0" w:color="666666"/>
               <w:insideH w:val="single" w:sz="8" w:space="0" w:color="666666"/>
               <w:insideV w:val="single" w:sz="8" w:space="0" w:color="666666"/>
+              <w:left w:val="single" w:sz="4" w:color="B5C1CC"/>
+              <w:right w:val="single" w:sz="4" w:color="B5C1CC"/>
             </w:tcBorders>
+            <w:shd w:fill="F2F5F8"/>
           </w:tcPr>
           <w:p>
             <w:pPr>
-              <w:spacing w:before="0" w:after="0" w:line="240" w:lineRule="auto"/>
+              <w:spacing w:before="40" w:after="40" w:line="276" w:lineRule="auto"/>
               <w:jc w:val="left"/>
             </w:pPr>
-            <w:r/>
             <w:r>
               <w:rPr>
-                <w:rFonts w:ascii="NanumSquare" w:hAnsi="NanumSquare" w:eastAsia="NanumSquare"/>
+                <w:rFonts w:ascii="맑은 고딕" w:hAnsi="맑은 고딕" w:eastAsia="맑은 고딕"/>
                 <w:b w:val="0"/>
-                <w:sz w:val="15"/>
+                <w:color w:val="222222"/>
+                <w:sz w:val="17"/>
+              </w:rPr>
+            </w:r>
+            <w:r>
+              <w:rPr>
+                <w:rFonts w:ascii="맑은 고딕" w:hAnsi="맑은 고딕" w:eastAsia="맑은 고딕"/>
+                <w:b w:val="0"/>
+                <w:color w:val="222222"/>
+                <w:sz w:val="17"/>
               </w:rPr>
               <w:t>위팔(Upper Arm)</w:t>
             </w:r>
@@ -2228,25 +2821,35 @@
               <w:end w:w="70" w:type="dxa"/>
             </w:tcMar>
             <w:tcBorders>
-              <w:top w:val="single" w:sz="8" w:space="0" w:color="666666"/>
+              <w:top w:val="single" w:sz="4" w:space="0" w:color="B5C1CC"/>
               <w:start w:val="single" w:sz="8" w:space="0" w:color="666666"/>
-              <w:bottom w:val="single" w:sz="8" w:space="0" w:color="666666"/>
+              <w:bottom w:val="single" w:sz="4" w:space="0" w:color="B5C1CC"/>
               <w:end w:val="single" w:sz="8" w:space="0" w:color="666666"/>
               <w:insideH w:val="single" w:sz="8" w:space="0" w:color="666666"/>
               <w:insideV w:val="single" w:sz="8" w:space="0" w:color="666666"/>
+              <w:left w:val="single" w:sz="4" w:color="B5C1CC"/>
+              <w:right w:val="single" w:sz="4" w:color="B5C1CC"/>
             </w:tcBorders>
           </w:tcPr>
           <w:p>
             <w:pPr>
-              <w:spacing w:before="0" w:after="0" w:line="240" w:lineRule="auto"/>
+              <w:spacing w:before="40" w:after="40" w:line="276" w:lineRule="auto"/>
               <w:jc w:val="center"/>
             </w:pPr>
-            <w:r/>
             <w:r>
               <w:rPr>
-                <w:rFonts w:ascii="NanumSquare" w:hAnsi="NanumSquare" w:eastAsia="NanumSquare"/>
+                <w:rFonts w:ascii="맑은 고딕" w:hAnsi="맑은 고딕" w:eastAsia="맑은 고딕"/>
                 <w:b w:val="0"/>
-                <w:sz w:val="16"/>
+                <w:color w:val="222222"/>
+                <w:sz w:val="17"/>
+              </w:rPr>
+            </w:r>
+            <w:r>
+              <w:rPr>
+                <w:rFonts w:ascii="맑은 고딕" w:hAnsi="맑은 고딕" w:eastAsia="맑은 고딕"/>
+                <w:b w:val="0"/>
+                <w:color w:val="222222"/>
+                <w:sz w:val="17"/>
               </w:rPr>
               <w:t>{{위팔점수}}</w:t>
             </w:r>
@@ -2263,25 +2866,35 @@
               <w:end w:w="70" w:type="dxa"/>
             </w:tcMar>
             <w:tcBorders>
-              <w:top w:val="single" w:sz="8" w:space="0" w:color="666666"/>
+              <w:top w:val="single" w:sz="4" w:space="0" w:color="B5C1CC"/>
               <w:start w:val="single" w:sz="8" w:space="0" w:color="666666"/>
-              <w:bottom w:val="single" w:sz="8" w:space="0" w:color="666666"/>
+              <w:bottom w:val="single" w:sz="4" w:space="0" w:color="B5C1CC"/>
               <w:end w:val="single" w:sz="8" w:space="0" w:color="666666"/>
               <w:insideH w:val="single" w:sz="8" w:space="0" w:color="666666"/>
               <w:insideV w:val="single" w:sz="8" w:space="0" w:color="666666"/>
+              <w:left w:val="single" w:sz="4" w:color="B5C1CC"/>
+              <w:right w:val="single" w:sz="4" w:color="B5C1CC"/>
             </w:tcBorders>
           </w:tcPr>
           <w:p>
             <w:pPr>
-              <w:spacing w:before="0" w:after="0" w:line="240" w:lineRule="auto"/>
+              <w:spacing w:before="40" w:after="40" w:line="276" w:lineRule="auto"/>
               <w:jc w:val="left"/>
             </w:pPr>
-            <w:r/>
             <w:r>
               <w:rPr>
-                <w:rFonts w:ascii="NanumSquare" w:hAnsi="NanumSquare" w:eastAsia="NanumSquare"/>
+                <w:rFonts w:ascii="맑은 고딕" w:hAnsi="맑은 고딕" w:eastAsia="맑은 고딕"/>
                 <w:b w:val="0"/>
-                <w:sz w:val="15"/>
+                <w:color w:val="222222"/>
+                <w:sz w:val="17"/>
+              </w:rPr>
+            </w:r>
+            <w:r>
+              <w:rPr>
+                <w:rFonts w:ascii="맑은 고딕" w:hAnsi="맑은 고딕" w:eastAsia="맑은 고딕"/>
+                <w:b w:val="0"/>
+                <w:color w:val="222222"/>
+                <w:sz w:val="17"/>
               </w:rPr>
               <w:t>{{위팔_자세분석}}</w:t>
             </w:r>
@@ -2300,25 +2913,36 @@
               <w:end w:w="70" w:type="dxa"/>
             </w:tcMar>
             <w:tcBorders>
-              <w:top w:val="single" w:sz="8" w:space="0" w:color="666666"/>
+              <w:top w:val="single" w:sz="4" w:space="0" w:color="B5C1CC"/>
               <w:start w:val="single" w:sz="8" w:space="0" w:color="666666"/>
-              <w:bottom w:val="single" w:sz="8" w:space="0" w:color="666666"/>
+              <w:bottom w:val="single" w:sz="4" w:space="0" w:color="B5C1CC"/>
               <w:end w:val="single" w:sz="8" w:space="0" w:color="666666"/>
               <w:insideH w:val="single" w:sz="8" w:space="0" w:color="666666"/>
               <w:insideV w:val="single" w:sz="8" w:space="0" w:color="666666"/>
+              <w:left w:val="single" w:sz="4" w:color="B5C1CC"/>
+              <w:right w:val="single" w:sz="4" w:color="B5C1CC"/>
             </w:tcBorders>
+            <w:shd w:fill="F2F5F8"/>
           </w:tcPr>
           <w:p>
             <w:pPr>
-              <w:spacing w:before="0" w:after="0" w:line="240" w:lineRule="auto"/>
+              <w:spacing w:before="40" w:after="40" w:line="276" w:lineRule="auto"/>
               <w:jc w:val="left"/>
             </w:pPr>
-            <w:r/>
             <w:r>
               <w:rPr>
-                <w:rFonts w:ascii="NanumSquare" w:hAnsi="NanumSquare" w:eastAsia="NanumSquare"/>
+                <w:rFonts w:ascii="맑은 고딕" w:hAnsi="맑은 고딕" w:eastAsia="맑은 고딕"/>
                 <w:b w:val="0"/>
-                <w:sz w:val="15"/>
+                <w:color w:val="222222"/>
+                <w:sz w:val="17"/>
+              </w:rPr>
+            </w:r>
+            <w:r>
+              <w:rPr>
+                <w:rFonts w:ascii="맑은 고딕" w:hAnsi="맑은 고딕" w:eastAsia="맑은 고딕"/>
+                <w:b w:val="0"/>
+                <w:color w:val="222222"/>
+                <w:sz w:val="17"/>
               </w:rPr>
               <w:t>아래팔(Lower Arm)</w:t>
             </w:r>
@@ -2335,25 +2959,35 @@
               <w:end w:w="70" w:type="dxa"/>
             </w:tcMar>
             <w:tcBorders>
-              <w:top w:val="single" w:sz="8" w:space="0" w:color="666666"/>
+              <w:top w:val="single" w:sz="4" w:space="0" w:color="B5C1CC"/>
               <w:start w:val="single" w:sz="8" w:space="0" w:color="666666"/>
-              <w:bottom w:val="single" w:sz="8" w:space="0" w:color="666666"/>
+              <w:bottom w:val="single" w:sz="4" w:space="0" w:color="B5C1CC"/>
               <w:end w:val="single" w:sz="8" w:space="0" w:color="666666"/>
               <w:insideH w:val="single" w:sz="8" w:space="0" w:color="666666"/>
               <w:insideV w:val="single" w:sz="8" w:space="0" w:color="666666"/>
+              <w:left w:val="single" w:sz="4" w:color="B5C1CC"/>
+              <w:right w:val="single" w:sz="4" w:color="B5C1CC"/>
             </w:tcBorders>
           </w:tcPr>
           <w:p>
             <w:pPr>
-              <w:spacing w:before="0" w:after="0" w:line="240" w:lineRule="auto"/>
+              <w:spacing w:before="40" w:after="40" w:line="276" w:lineRule="auto"/>
               <w:jc w:val="center"/>
             </w:pPr>
-            <w:r/>
             <w:r>
               <w:rPr>
-                <w:rFonts w:ascii="NanumSquare" w:hAnsi="NanumSquare" w:eastAsia="NanumSquare"/>
+                <w:rFonts w:ascii="맑은 고딕" w:hAnsi="맑은 고딕" w:eastAsia="맑은 고딕"/>
                 <w:b w:val="0"/>
-                <w:sz w:val="16"/>
+                <w:color w:val="222222"/>
+                <w:sz w:val="17"/>
+              </w:rPr>
+            </w:r>
+            <w:r>
+              <w:rPr>
+                <w:rFonts w:ascii="맑은 고딕" w:hAnsi="맑은 고딕" w:eastAsia="맑은 고딕"/>
+                <w:b w:val="0"/>
+                <w:color w:val="222222"/>
+                <w:sz w:val="17"/>
               </w:rPr>
               <w:t>{{아래팔점수}}</w:t>
             </w:r>
@@ -2370,25 +3004,35 @@
               <w:end w:w="70" w:type="dxa"/>
             </w:tcMar>
             <w:tcBorders>
-              <w:top w:val="single" w:sz="8" w:space="0" w:color="666666"/>
+              <w:top w:val="single" w:sz="4" w:space="0" w:color="B5C1CC"/>
               <w:start w:val="single" w:sz="8" w:space="0" w:color="666666"/>
-              <w:bottom w:val="single" w:sz="8" w:space="0" w:color="666666"/>
+              <w:bottom w:val="single" w:sz="4" w:space="0" w:color="B5C1CC"/>
               <w:end w:val="single" w:sz="8" w:space="0" w:color="666666"/>
               <w:insideH w:val="single" w:sz="8" w:space="0" w:color="666666"/>
               <w:insideV w:val="single" w:sz="8" w:space="0" w:color="666666"/>
+              <w:left w:val="single" w:sz="4" w:color="B5C1CC"/>
+              <w:right w:val="single" w:sz="4" w:color="B5C1CC"/>
             </w:tcBorders>
           </w:tcPr>
           <w:p>
             <w:pPr>
-              <w:spacing w:before="0" w:after="0" w:line="240" w:lineRule="auto"/>
+              <w:spacing w:before="40" w:after="40" w:line="276" w:lineRule="auto"/>
               <w:jc w:val="left"/>
             </w:pPr>
-            <w:r/>
             <w:r>
               <w:rPr>
-                <w:rFonts w:ascii="NanumSquare" w:hAnsi="NanumSquare" w:eastAsia="NanumSquare"/>
+                <w:rFonts w:ascii="맑은 고딕" w:hAnsi="맑은 고딕" w:eastAsia="맑은 고딕"/>
                 <w:b w:val="0"/>
-                <w:sz w:val="15"/>
+                <w:color w:val="222222"/>
+                <w:sz w:val="17"/>
+              </w:rPr>
+            </w:r>
+            <w:r>
+              <w:rPr>
+                <w:rFonts w:ascii="맑은 고딕" w:hAnsi="맑은 고딕" w:eastAsia="맑은 고딕"/>
+                <w:b w:val="0"/>
+                <w:color w:val="222222"/>
+                <w:sz w:val="17"/>
               </w:rPr>
               <w:t>{{아래팔_자세분석}}</w:t>
             </w:r>
@@ -2407,25 +3051,36 @@
               <w:end w:w="70" w:type="dxa"/>
             </w:tcMar>
             <w:tcBorders>
-              <w:top w:val="single" w:sz="8" w:space="0" w:color="666666"/>
+              <w:top w:val="single" w:sz="4" w:space="0" w:color="B5C1CC"/>
               <w:start w:val="single" w:sz="8" w:space="0" w:color="666666"/>
-              <w:bottom w:val="single" w:sz="8" w:space="0" w:color="666666"/>
+              <w:bottom w:val="single" w:sz="4" w:space="0" w:color="B5C1CC"/>
               <w:end w:val="single" w:sz="8" w:space="0" w:color="666666"/>
               <w:insideH w:val="single" w:sz="8" w:space="0" w:color="666666"/>
               <w:insideV w:val="single" w:sz="8" w:space="0" w:color="666666"/>
+              <w:left w:val="single" w:sz="4" w:color="B5C1CC"/>
+              <w:right w:val="single" w:sz="4" w:color="B5C1CC"/>
             </w:tcBorders>
+            <w:shd w:fill="F2F5F8"/>
           </w:tcPr>
           <w:p>
             <w:pPr>
-              <w:spacing w:before="0" w:after="0" w:line="240" w:lineRule="auto"/>
+              <w:spacing w:before="40" w:after="40" w:line="276" w:lineRule="auto"/>
               <w:jc w:val="left"/>
             </w:pPr>
-            <w:r/>
             <w:r>
               <w:rPr>
-                <w:rFonts w:ascii="NanumSquare" w:hAnsi="NanumSquare" w:eastAsia="NanumSquare"/>
+                <w:rFonts w:ascii="맑은 고딕" w:hAnsi="맑은 고딕" w:eastAsia="맑은 고딕"/>
                 <w:b w:val="0"/>
-                <w:sz w:val="15"/>
+                <w:color w:val="222222"/>
+                <w:sz w:val="17"/>
+              </w:rPr>
+            </w:r>
+            <w:r>
+              <w:rPr>
+                <w:rFonts w:ascii="맑은 고딕" w:hAnsi="맑은 고딕" w:eastAsia="맑은 고딕"/>
+                <w:b w:val="0"/>
+                <w:color w:val="222222"/>
+                <w:sz w:val="17"/>
               </w:rPr>
               <w:t>손목(Wrist)</w:t>
             </w:r>
@@ -2442,25 +3097,35 @@
               <w:end w:w="70" w:type="dxa"/>
             </w:tcMar>
             <w:tcBorders>
-              <w:top w:val="single" w:sz="8" w:space="0" w:color="666666"/>
+              <w:top w:val="single" w:sz="4" w:space="0" w:color="B5C1CC"/>
               <w:start w:val="single" w:sz="8" w:space="0" w:color="666666"/>
-              <w:bottom w:val="single" w:sz="8" w:space="0" w:color="666666"/>
+              <w:bottom w:val="single" w:sz="4" w:space="0" w:color="B5C1CC"/>
               <w:end w:val="single" w:sz="8" w:space="0" w:color="666666"/>
               <w:insideH w:val="single" w:sz="8" w:space="0" w:color="666666"/>
               <w:insideV w:val="single" w:sz="8" w:space="0" w:color="666666"/>
+              <w:left w:val="single" w:sz="4" w:color="B5C1CC"/>
+              <w:right w:val="single" w:sz="4" w:color="B5C1CC"/>
             </w:tcBorders>
           </w:tcPr>
           <w:p>
             <w:pPr>
-              <w:spacing w:before="0" w:after="0" w:line="240" w:lineRule="auto"/>
+              <w:spacing w:before="40" w:after="40" w:line="276" w:lineRule="auto"/>
               <w:jc w:val="center"/>
             </w:pPr>
-            <w:r/>
             <w:r>
               <w:rPr>
-                <w:rFonts w:ascii="NanumSquare" w:hAnsi="NanumSquare" w:eastAsia="NanumSquare"/>
+                <w:rFonts w:ascii="맑은 고딕" w:hAnsi="맑은 고딕" w:eastAsia="맑은 고딕"/>
                 <w:b w:val="0"/>
-                <w:sz w:val="16"/>
+                <w:color w:val="222222"/>
+                <w:sz w:val="17"/>
+              </w:rPr>
+            </w:r>
+            <w:r>
+              <w:rPr>
+                <w:rFonts w:ascii="맑은 고딕" w:hAnsi="맑은 고딕" w:eastAsia="맑은 고딕"/>
+                <w:b w:val="0"/>
+                <w:color w:val="222222"/>
+                <w:sz w:val="17"/>
               </w:rPr>
               <w:t>{{손목점수}}</w:t>
             </w:r>
@@ -2477,25 +3142,35 @@
               <w:end w:w="70" w:type="dxa"/>
             </w:tcMar>
             <w:tcBorders>
-              <w:top w:val="single" w:sz="8" w:space="0" w:color="666666"/>
+              <w:top w:val="single" w:sz="4" w:space="0" w:color="B5C1CC"/>
               <w:start w:val="single" w:sz="8" w:space="0" w:color="666666"/>
-              <w:bottom w:val="single" w:sz="8" w:space="0" w:color="666666"/>
+              <w:bottom w:val="single" w:sz="4" w:space="0" w:color="B5C1CC"/>
               <w:end w:val="single" w:sz="8" w:space="0" w:color="666666"/>
               <w:insideH w:val="single" w:sz="8" w:space="0" w:color="666666"/>
               <w:insideV w:val="single" w:sz="8" w:space="0" w:color="666666"/>
+              <w:left w:val="single" w:sz="4" w:color="B5C1CC"/>
+              <w:right w:val="single" w:sz="4" w:color="B5C1CC"/>
             </w:tcBorders>
           </w:tcPr>
           <w:p>
             <w:pPr>
-              <w:spacing w:before="0" w:after="0" w:line="240" w:lineRule="auto"/>
+              <w:spacing w:before="40" w:after="40" w:line="276" w:lineRule="auto"/>
               <w:jc w:val="left"/>
             </w:pPr>
-            <w:r/>
             <w:r>
               <w:rPr>
-                <w:rFonts w:ascii="NanumSquare" w:hAnsi="NanumSquare" w:eastAsia="NanumSquare"/>
+                <w:rFonts w:ascii="맑은 고딕" w:hAnsi="맑은 고딕" w:eastAsia="맑은 고딕"/>
                 <w:b w:val="0"/>
-                <w:sz w:val="15"/>
+                <w:color w:val="222222"/>
+                <w:sz w:val="17"/>
+              </w:rPr>
+            </w:r>
+            <w:r>
+              <w:rPr>
+                <w:rFonts w:ascii="맑은 고딕" w:hAnsi="맑은 고딕" w:eastAsia="맑은 고딕"/>
+                <w:b w:val="0"/>
+                <w:color w:val="222222"/>
+                <w:sz w:val="17"/>
               </w:rPr>
               <w:t>{{손목_자세분석}}</w:t>
             </w:r>
@@ -2514,25 +3189,36 @@
               <w:end w:w="70" w:type="dxa"/>
             </w:tcMar>
             <w:tcBorders>
-              <w:top w:val="single" w:sz="8" w:space="0" w:color="666666"/>
+              <w:top w:val="single" w:sz="4" w:space="0" w:color="B5C1CC"/>
               <w:start w:val="single" w:sz="8" w:space="0" w:color="666666"/>
-              <w:bottom w:val="single" w:sz="8" w:space="0" w:color="666666"/>
+              <w:bottom w:val="single" w:sz="4" w:space="0" w:color="B5C1CC"/>
               <w:end w:val="single" w:sz="8" w:space="0" w:color="666666"/>
               <w:insideH w:val="single" w:sz="8" w:space="0" w:color="666666"/>
               <w:insideV w:val="single" w:sz="8" w:space="0" w:color="666666"/>
+              <w:left w:val="single" w:sz="4" w:color="B5C1CC"/>
+              <w:right w:val="single" w:sz="4" w:color="B5C1CC"/>
             </w:tcBorders>
+            <w:shd w:fill="F2F5F8"/>
           </w:tcPr>
           <w:p>
             <w:pPr>
-              <w:spacing w:before="0" w:after="0" w:line="240" w:lineRule="auto"/>
+              <w:spacing w:before="40" w:after="40" w:line="276" w:lineRule="auto"/>
               <w:jc w:val="left"/>
             </w:pPr>
-            <w:r/>
             <w:r>
               <w:rPr>
-                <w:rFonts w:ascii="NanumSquare" w:hAnsi="NanumSquare" w:eastAsia="NanumSquare"/>
+                <w:rFonts w:ascii="맑은 고딕" w:hAnsi="맑은 고딕" w:eastAsia="맑은 고딕"/>
                 <w:b w:val="0"/>
-                <w:sz w:val="15"/>
+                <w:color w:val="222222"/>
+                <w:sz w:val="17"/>
+              </w:rPr>
+            </w:r>
+            <w:r>
+              <w:rPr>
+                <w:rFonts w:ascii="맑은 고딕" w:hAnsi="맑은 고딕" w:eastAsia="맑은 고딕"/>
+                <w:b w:val="0"/>
+                <w:color w:val="222222"/>
+                <w:sz w:val="17"/>
               </w:rPr>
               <w:t>하중/힘(Load)</w:t>
             </w:r>
@@ -2549,25 +3235,35 @@
               <w:end w:w="70" w:type="dxa"/>
             </w:tcMar>
             <w:tcBorders>
-              <w:top w:val="single" w:sz="8" w:space="0" w:color="666666"/>
+              <w:top w:val="single" w:sz="4" w:space="0" w:color="B5C1CC"/>
               <w:start w:val="single" w:sz="8" w:space="0" w:color="666666"/>
-              <w:bottom w:val="single" w:sz="8" w:space="0" w:color="666666"/>
+              <w:bottom w:val="single" w:sz="4" w:space="0" w:color="B5C1CC"/>
               <w:end w:val="single" w:sz="8" w:space="0" w:color="666666"/>
               <w:insideH w:val="single" w:sz="8" w:space="0" w:color="666666"/>
               <w:insideV w:val="single" w:sz="8" w:space="0" w:color="666666"/>
+              <w:left w:val="single" w:sz="4" w:color="B5C1CC"/>
+              <w:right w:val="single" w:sz="4" w:color="B5C1CC"/>
             </w:tcBorders>
           </w:tcPr>
           <w:p>
             <w:pPr>
-              <w:spacing w:before="0" w:after="0" w:line="240" w:lineRule="auto"/>
+              <w:spacing w:before="40" w:after="40" w:line="276" w:lineRule="auto"/>
               <w:jc w:val="center"/>
             </w:pPr>
-            <w:r/>
             <w:r>
               <w:rPr>
-                <w:rFonts w:ascii="NanumSquare" w:hAnsi="NanumSquare" w:eastAsia="NanumSquare"/>
+                <w:rFonts w:ascii="맑은 고딕" w:hAnsi="맑은 고딕" w:eastAsia="맑은 고딕"/>
                 <w:b w:val="0"/>
-                <w:sz w:val="16"/>
+                <w:color w:val="222222"/>
+                <w:sz w:val="17"/>
+              </w:rPr>
+            </w:r>
+            <w:r>
+              <w:rPr>
+                <w:rFonts w:ascii="맑은 고딕" w:hAnsi="맑은 고딕" w:eastAsia="맑은 고딕"/>
+                <w:b w:val="0"/>
+                <w:color w:val="222222"/>
+                <w:sz w:val="17"/>
               </w:rPr>
               <w:t>{{하중점수}}</w:t>
             </w:r>
@@ -2584,25 +3280,35 @@
               <w:end w:w="70" w:type="dxa"/>
             </w:tcMar>
             <w:tcBorders>
-              <w:top w:val="single" w:sz="8" w:space="0" w:color="666666"/>
+              <w:top w:val="single" w:sz="4" w:space="0" w:color="B5C1CC"/>
               <w:start w:val="single" w:sz="8" w:space="0" w:color="666666"/>
-              <w:bottom w:val="single" w:sz="8" w:space="0" w:color="666666"/>
+              <w:bottom w:val="single" w:sz="4" w:space="0" w:color="B5C1CC"/>
               <w:end w:val="single" w:sz="8" w:space="0" w:color="666666"/>
               <w:insideH w:val="single" w:sz="8" w:space="0" w:color="666666"/>
               <w:insideV w:val="single" w:sz="8" w:space="0" w:color="666666"/>
+              <w:left w:val="single" w:sz="4" w:color="B5C1CC"/>
+              <w:right w:val="single" w:sz="4" w:color="B5C1CC"/>
             </w:tcBorders>
           </w:tcPr>
           <w:p>
             <w:pPr>
-              <w:spacing w:before="0" w:after="0" w:line="240" w:lineRule="auto"/>
+              <w:spacing w:before="40" w:after="40" w:line="276" w:lineRule="auto"/>
               <w:jc w:val="left"/>
             </w:pPr>
-            <w:r/>
             <w:r>
               <w:rPr>
-                <w:rFonts w:ascii="NanumSquare" w:hAnsi="NanumSquare" w:eastAsia="NanumSquare"/>
+                <w:rFonts w:ascii="맑은 고딕" w:hAnsi="맑은 고딕" w:eastAsia="맑은 고딕"/>
                 <w:b w:val="0"/>
-                <w:sz w:val="15"/>
+                <w:color w:val="222222"/>
+                <w:sz w:val="17"/>
+              </w:rPr>
+            </w:r>
+            <w:r>
+              <w:rPr>
+                <w:rFonts w:ascii="맑은 고딕" w:hAnsi="맑은 고딕" w:eastAsia="맑은 고딕"/>
+                <w:b w:val="0"/>
+                <w:color w:val="222222"/>
+                <w:sz w:val="17"/>
               </w:rPr>
               <w:t>{{하중_자세분석}}</w:t>
             </w:r>
@@ -2621,25 +3327,36 @@
               <w:end w:w="70" w:type="dxa"/>
             </w:tcMar>
             <w:tcBorders>
-              <w:top w:val="single" w:sz="8" w:space="0" w:color="666666"/>
+              <w:top w:val="single" w:sz="4" w:space="0" w:color="B5C1CC"/>
               <w:start w:val="single" w:sz="8" w:space="0" w:color="666666"/>
-              <w:bottom w:val="single" w:sz="8" w:space="0" w:color="666666"/>
+              <w:bottom w:val="single" w:sz="4" w:space="0" w:color="B5C1CC"/>
               <w:end w:val="single" w:sz="8" w:space="0" w:color="666666"/>
               <w:insideH w:val="single" w:sz="8" w:space="0" w:color="666666"/>
               <w:insideV w:val="single" w:sz="8" w:space="0" w:color="666666"/>
+              <w:left w:val="single" w:sz="4" w:color="B5C1CC"/>
+              <w:right w:val="single" w:sz="4" w:color="B5C1CC"/>
             </w:tcBorders>
+            <w:shd w:fill="F2F5F8"/>
           </w:tcPr>
           <w:p>
             <w:pPr>
-              <w:spacing w:before="0" w:after="0" w:line="240" w:lineRule="auto"/>
+              <w:spacing w:before="40" w:after="40" w:line="276" w:lineRule="auto"/>
               <w:jc w:val="left"/>
             </w:pPr>
-            <w:r/>
             <w:r>
               <w:rPr>
-                <w:rFonts w:ascii="NanumSquare" w:hAnsi="NanumSquare" w:eastAsia="NanumSquare"/>
+                <w:rFonts w:ascii="맑은 고딕" w:hAnsi="맑은 고딕" w:eastAsia="맑은 고딕"/>
                 <w:b w:val="0"/>
-                <w:sz w:val="15"/>
+                <w:color w:val="222222"/>
+                <w:sz w:val="17"/>
+              </w:rPr>
+            </w:r>
+            <w:r>
+              <w:rPr>
+                <w:rFonts w:ascii="맑은 고딕" w:hAnsi="맑은 고딕" w:eastAsia="맑은 고딕"/>
+                <w:b w:val="0"/>
+                <w:color w:val="222222"/>
+                <w:sz w:val="17"/>
               </w:rPr>
               <w:t>결합도(Coupling)</w:t>
             </w:r>
@@ -2656,25 +3373,35 @@
               <w:end w:w="70" w:type="dxa"/>
             </w:tcMar>
             <w:tcBorders>
-              <w:top w:val="single" w:sz="8" w:space="0" w:color="666666"/>
+              <w:top w:val="single" w:sz="4" w:space="0" w:color="B5C1CC"/>
               <w:start w:val="single" w:sz="8" w:space="0" w:color="666666"/>
-              <w:bottom w:val="single" w:sz="8" w:space="0" w:color="666666"/>
+              <w:bottom w:val="single" w:sz="4" w:space="0" w:color="B5C1CC"/>
               <w:end w:val="single" w:sz="8" w:space="0" w:color="666666"/>
               <w:insideH w:val="single" w:sz="8" w:space="0" w:color="666666"/>
               <w:insideV w:val="single" w:sz="8" w:space="0" w:color="666666"/>
+              <w:left w:val="single" w:sz="4" w:color="B5C1CC"/>
+              <w:right w:val="single" w:sz="4" w:color="B5C1CC"/>
             </w:tcBorders>
           </w:tcPr>
           <w:p>
             <w:pPr>
-              <w:spacing w:before="0" w:after="0" w:line="240" w:lineRule="auto"/>
+              <w:spacing w:before="40" w:after="40" w:line="276" w:lineRule="auto"/>
               <w:jc w:val="center"/>
             </w:pPr>
-            <w:r/>
             <w:r>
               <w:rPr>
-                <w:rFonts w:ascii="NanumSquare" w:hAnsi="NanumSquare" w:eastAsia="NanumSquare"/>
+                <w:rFonts w:ascii="맑은 고딕" w:hAnsi="맑은 고딕" w:eastAsia="맑은 고딕"/>
                 <w:b w:val="0"/>
-                <w:sz w:val="16"/>
+                <w:color w:val="222222"/>
+                <w:sz w:val="17"/>
+              </w:rPr>
+            </w:r>
+            <w:r>
+              <w:rPr>
+                <w:rFonts w:ascii="맑은 고딕" w:hAnsi="맑은 고딕" w:eastAsia="맑은 고딕"/>
+                <w:b w:val="0"/>
+                <w:color w:val="222222"/>
+                <w:sz w:val="17"/>
               </w:rPr>
               <w:t>{{결합도점수}}</w:t>
             </w:r>
@@ -2691,25 +3418,35 @@
               <w:end w:w="70" w:type="dxa"/>
             </w:tcMar>
             <w:tcBorders>
-              <w:top w:val="single" w:sz="8" w:space="0" w:color="666666"/>
+              <w:top w:val="single" w:sz="4" w:space="0" w:color="B5C1CC"/>
               <w:start w:val="single" w:sz="8" w:space="0" w:color="666666"/>
-              <w:bottom w:val="single" w:sz="8" w:space="0" w:color="666666"/>
+              <w:bottom w:val="single" w:sz="4" w:space="0" w:color="B5C1CC"/>
               <w:end w:val="single" w:sz="8" w:space="0" w:color="666666"/>
               <w:insideH w:val="single" w:sz="8" w:space="0" w:color="666666"/>
               <w:insideV w:val="single" w:sz="8" w:space="0" w:color="666666"/>
+              <w:left w:val="single" w:sz="4" w:color="B5C1CC"/>
+              <w:right w:val="single" w:sz="4" w:color="B5C1CC"/>
             </w:tcBorders>
           </w:tcPr>
           <w:p>
             <w:pPr>
-              <w:spacing w:before="0" w:after="0" w:line="240" w:lineRule="auto"/>
+              <w:spacing w:before="40" w:after="40" w:line="276" w:lineRule="auto"/>
               <w:jc w:val="left"/>
             </w:pPr>
-            <w:r/>
             <w:r>
               <w:rPr>
-                <w:rFonts w:ascii="NanumSquare" w:hAnsi="NanumSquare" w:eastAsia="NanumSquare"/>
+                <w:rFonts w:ascii="맑은 고딕" w:hAnsi="맑은 고딕" w:eastAsia="맑은 고딕"/>
                 <w:b w:val="0"/>
-                <w:sz w:val="15"/>
+                <w:color w:val="222222"/>
+                <w:sz w:val="17"/>
+              </w:rPr>
+            </w:r>
+            <w:r>
+              <w:rPr>
+                <w:rFonts w:ascii="맑은 고딕" w:hAnsi="맑은 고딕" w:eastAsia="맑은 고딕"/>
+                <w:b w:val="0"/>
+                <w:color w:val="222222"/>
+                <w:sz w:val="17"/>
               </w:rPr>
               <w:t>{{결합도_자세분석}}</w:t>
             </w:r>
@@ -2728,25 +3465,36 @@
               <w:end w:w="70" w:type="dxa"/>
             </w:tcMar>
             <w:tcBorders>
-              <w:top w:val="single" w:sz="8" w:space="0" w:color="666666"/>
+              <w:top w:val="single" w:sz="4" w:space="0" w:color="B5C1CC"/>
               <w:start w:val="single" w:sz="8" w:space="0" w:color="666666"/>
-              <w:bottom w:val="single" w:sz="8" w:space="0" w:color="666666"/>
+              <w:bottom w:val="single" w:sz="4" w:space="0" w:color="B5C1CC"/>
               <w:end w:val="single" w:sz="8" w:space="0" w:color="666666"/>
               <w:insideH w:val="single" w:sz="8" w:space="0" w:color="666666"/>
               <w:insideV w:val="single" w:sz="8" w:space="0" w:color="666666"/>
+              <w:left w:val="single" w:sz="4" w:color="B5C1CC"/>
+              <w:right w:val="single" w:sz="4" w:color="B5C1CC"/>
             </w:tcBorders>
+            <w:shd w:fill="F2F5F8"/>
           </w:tcPr>
           <w:p>
             <w:pPr>
-              <w:spacing w:before="0" w:after="0" w:line="240" w:lineRule="auto"/>
+              <w:spacing w:before="40" w:after="40" w:line="276" w:lineRule="auto"/>
               <w:jc w:val="left"/>
             </w:pPr>
-            <w:r/>
             <w:r>
               <w:rPr>
-                <w:rFonts w:ascii="NanumSquare" w:hAnsi="NanumSquare" w:eastAsia="NanumSquare"/>
+                <w:rFonts w:ascii="맑은 고딕" w:hAnsi="맑은 고딕" w:eastAsia="맑은 고딕"/>
                 <w:b w:val="0"/>
-                <w:sz w:val="15"/>
+                <w:color w:val="222222"/>
+                <w:sz w:val="17"/>
+              </w:rPr>
+            </w:r>
+            <w:r>
+              <w:rPr>
+                <w:rFonts w:ascii="맑은 고딕" w:hAnsi="맑은 고딕" w:eastAsia="맑은 고딕"/>
+                <w:b w:val="0"/>
+                <w:color w:val="222222"/>
+                <w:sz w:val="17"/>
               </w:rPr>
               <w:t>활동점수(Activity)</w:t>
             </w:r>
@@ -2763,25 +3511,35 @@
               <w:end w:w="70" w:type="dxa"/>
             </w:tcMar>
             <w:tcBorders>
-              <w:top w:val="single" w:sz="8" w:space="0" w:color="666666"/>
+              <w:top w:val="single" w:sz="4" w:space="0" w:color="B5C1CC"/>
               <w:start w:val="single" w:sz="8" w:space="0" w:color="666666"/>
-              <w:bottom w:val="single" w:sz="8" w:space="0" w:color="666666"/>
+              <w:bottom w:val="single" w:sz="4" w:space="0" w:color="B5C1CC"/>
               <w:end w:val="single" w:sz="8" w:space="0" w:color="666666"/>
               <w:insideH w:val="single" w:sz="8" w:space="0" w:color="666666"/>
               <w:insideV w:val="single" w:sz="8" w:space="0" w:color="666666"/>
+              <w:left w:val="single" w:sz="4" w:color="B5C1CC"/>
+              <w:right w:val="single" w:sz="4" w:color="B5C1CC"/>
             </w:tcBorders>
           </w:tcPr>
           <w:p>
             <w:pPr>
-              <w:spacing w:before="0" w:after="0" w:line="240" w:lineRule="auto"/>
+              <w:spacing w:before="40" w:after="40" w:line="276" w:lineRule="auto"/>
               <w:jc w:val="center"/>
             </w:pPr>
-            <w:r/>
             <w:r>
               <w:rPr>
-                <w:rFonts w:ascii="NanumSquare" w:hAnsi="NanumSquare" w:eastAsia="NanumSquare"/>
+                <w:rFonts w:ascii="맑은 고딕" w:hAnsi="맑은 고딕" w:eastAsia="맑은 고딕"/>
                 <w:b w:val="0"/>
-                <w:sz w:val="16"/>
+                <w:color w:val="222222"/>
+                <w:sz w:val="17"/>
+              </w:rPr>
+            </w:r>
+            <w:r>
+              <w:rPr>
+                <w:rFonts w:ascii="맑은 고딕" w:hAnsi="맑은 고딕" w:eastAsia="맑은 고딕"/>
+                <w:b w:val="0"/>
+                <w:color w:val="222222"/>
+                <w:sz w:val="17"/>
               </w:rPr>
               <w:t>{{활동점수}}</w:t>
             </w:r>
@@ -2798,25 +3556,35 @@
               <w:end w:w="70" w:type="dxa"/>
             </w:tcMar>
             <w:tcBorders>
-              <w:top w:val="single" w:sz="8" w:space="0" w:color="666666"/>
+              <w:top w:val="single" w:sz="4" w:space="0" w:color="B5C1CC"/>
               <w:start w:val="single" w:sz="8" w:space="0" w:color="666666"/>
-              <w:bottom w:val="single" w:sz="8" w:space="0" w:color="666666"/>
+              <w:bottom w:val="single" w:sz="4" w:space="0" w:color="B5C1CC"/>
               <w:end w:val="single" w:sz="8" w:space="0" w:color="666666"/>
               <w:insideH w:val="single" w:sz="8" w:space="0" w:color="666666"/>
               <w:insideV w:val="single" w:sz="8" w:space="0" w:color="666666"/>
+              <w:left w:val="single" w:sz="4" w:color="B5C1CC"/>
+              <w:right w:val="single" w:sz="4" w:color="B5C1CC"/>
             </w:tcBorders>
           </w:tcPr>
           <w:p>
             <w:pPr>
-              <w:spacing w:before="0" w:after="0" w:line="240" w:lineRule="auto"/>
+              <w:spacing w:before="40" w:after="40" w:line="276" w:lineRule="auto"/>
               <w:jc w:val="left"/>
             </w:pPr>
-            <w:r/>
             <w:r>
               <w:rPr>
-                <w:rFonts w:ascii="NanumSquare" w:hAnsi="NanumSquare" w:eastAsia="NanumSquare"/>
+                <w:rFonts w:ascii="맑은 고딕" w:hAnsi="맑은 고딕" w:eastAsia="맑은 고딕"/>
                 <w:b w:val="0"/>
-                <w:sz w:val="15"/>
+                <w:color w:val="222222"/>
+                <w:sz w:val="17"/>
+              </w:rPr>
+            </w:r>
+            <w:r>
+              <w:rPr>
+                <w:rFonts w:ascii="맑은 고딕" w:hAnsi="맑은 고딕" w:eastAsia="맑은 고딕"/>
+                <w:b w:val="0"/>
+                <w:color w:val="222222"/>
+                <w:sz w:val="17"/>
               </w:rPr>
               <w:t>{{활동점수_자세분석}}</w:t>
             </w:r>
@@ -2826,7 +3594,7 @@
     </w:tbl>
     <w:p>
       <w:pPr>
-        <w:spacing w:after="60"/>
+        <w:spacing w:after="60" w:before="0" w:line="300" w:lineRule="auto"/>
       </w:pPr>
     </w:p>
     <w:tbl>
@@ -2855,26 +3623,36 @@
               <w:end w:w="70" w:type="dxa"/>
             </w:tcMar>
             <w:tcBorders>
-              <w:top w:val="single" w:sz="8" w:space="0" w:color="666666"/>
+              <w:top w:val="single" w:sz="4" w:space="0" w:color="B5C1CC"/>
               <w:start w:val="single" w:sz="8" w:space="0" w:color="666666"/>
-              <w:bottom w:val="single" w:sz="8" w:space="0" w:color="666666"/>
+              <w:bottom w:val="single" w:sz="4" w:space="0" w:color="B5C1CC"/>
               <w:end w:val="single" w:sz="8" w:space="0" w:color="666666"/>
               <w:insideH w:val="single" w:sz="8" w:space="0" w:color="666666"/>
               <w:insideV w:val="single" w:sz="8" w:space="0" w:color="666666"/>
+              <w:left w:val="single" w:sz="4" w:color="B5C1CC"/>
+              <w:right w:val="single" w:sz="4" w:color="B5C1CC"/>
             </w:tcBorders>
-            <w:shd w:fill="D9E1EC"/>
+            <w:shd w:fill="E8EFF6"/>
           </w:tcPr>
           <w:p>
             <w:pPr>
-              <w:spacing w:before="0" w:after="0" w:line="240" w:lineRule="auto"/>
+              <w:spacing w:before="40" w:after="40" w:line="276" w:lineRule="auto"/>
               <w:jc w:val="center"/>
             </w:pPr>
-            <w:r/>
             <w:r>
               <w:rPr>
-                <w:rFonts w:ascii="NanumSquare" w:hAnsi="NanumSquare" w:eastAsia="NanumSquare"/>
+                <w:rFonts w:ascii="맑은 고딕" w:hAnsi="맑은 고딕" w:eastAsia="맑은 고딕"/>
                 <w:b/>
-                <w:sz w:val="16"/>
+                <w:color w:val="24477E"/>
+                <w:sz w:val="17"/>
+              </w:rPr>
+            </w:r>
+            <w:r>
+              <w:rPr>
+                <w:rFonts w:ascii="맑은 고딕" w:hAnsi="맑은 고딕" w:eastAsia="맑은 고딕"/>
+                <w:b/>
+                <w:color w:val="24477E"/>
+                <w:sz w:val="17"/>
               </w:rPr>
               <w:t>Score A</w:t>
               <w:br/>
@@ -2893,25 +3671,36 @@
               <w:end w:w="70" w:type="dxa"/>
             </w:tcMar>
             <w:tcBorders>
-              <w:top w:val="single" w:sz="8" w:space="0" w:color="666666"/>
+              <w:top w:val="single" w:sz="4" w:space="0" w:color="B5C1CC"/>
               <w:start w:val="single" w:sz="8" w:space="0" w:color="666666"/>
-              <w:bottom w:val="single" w:sz="8" w:space="0" w:color="666666"/>
+              <w:bottom w:val="single" w:sz="4" w:space="0" w:color="B5C1CC"/>
               <w:end w:val="single" w:sz="8" w:space="0" w:color="666666"/>
               <w:insideH w:val="single" w:sz="8" w:space="0" w:color="666666"/>
               <w:insideV w:val="single" w:sz="8" w:space="0" w:color="666666"/>
+              <w:left w:val="single" w:sz="4" w:color="B5C1CC"/>
+              <w:right w:val="single" w:sz="4" w:color="B5C1CC"/>
             </w:tcBorders>
+            <w:shd w:fill="E8EFF6"/>
           </w:tcPr>
           <w:p>
             <w:pPr>
-              <w:spacing w:before="0" w:after="0" w:line="240" w:lineRule="auto"/>
+              <w:spacing w:before="40" w:after="40" w:line="276" w:lineRule="auto"/>
               <w:jc w:val="center"/>
             </w:pPr>
-            <w:r/>
             <w:r>
               <w:rPr>
-                <w:rFonts w:ascii="NanumSquare" w:hAnsi="NanumSquare" w:eastAsia="NanumSquare"/>
-                <w:b w:val="0"/>
-                <w:sz w:val="16"/>
+                <w:rFonts w:ascii="맑은 고딕" w:hAnsi="맑은 고딕" w:eastAsia="맑은 고딕"/>
+                <w:b/>
+                <w:color w:val="24477E"/>
+                <w:sz w:val="17"/>
+              </w:rPr>
+            </w:r>
+            <w:r>
+              <w:rPr>
+                <w:rFonts w:ascii="맑은 고딕" w:hAnsi="맑은 고딕" w:eastAsia="맑은 고딕"/>
+                <w:b/>
+                <w:color w:val="24477E"/>
+                <w:sz w:val="17"/>
               </w:rPr>
               <w:t>{{ScoreA}}</w:t>
             </w:r>
@@ -2928,26 +3717,36 @@
               <w:end w:w="70" w:type="dxa"/>
             </w:tcMar>
             <w:tcBorders>
-              <w:top w:val="single" w:sz="8" w:space="0" w:color="666666"/>
+              <w:top w:val="single" w:sz="4" w:space="0" w:color="B5C1CC"/>
               <w:start w:val="single" w:sz="8" w:space="0" w:color="666666"/>
-              <w:bottom w:val="single" w:sz="8" w:space="0" w:color="666666"/>
+              <w:bottom w:val="single" w:sz="4" w:space="0" w:color="B5C1CC"/>
               <w:end w:val="single" w:sz="8" w:space="0" w:color="666666"/>
               <w:insideH w:val="single" w:sz="8" w:space="0" w:color="666666"/>
               <w:insideV w:val="single" w:sz="8" w:space="0" w:color="666666"/>
+              <w:left w:val="single" w:sz="4" w:color="B5C1CC"/>
+              <w:right w:val="single" w:sz="4" w:color="B5C1CC"/>
             </w:tcBorders>
-            <w:shd w:fill="D9E1EC"/>
+            <w:shd w:fill="E8EFF6"/>
           </w:tcPr>
           <w:p>
             <w:pPr>
-              <w:spacing w:before="0" w:after="0" w:line="240" w:lineRule="auto"/>
+              <w:spacing w:before="40" w:after="40" w:line="276" w:lineRule="auto"/>
               <w:jc w:val="center"/>
             </w:pPr>
-            <w:r/>
             <w:r>
               <w:rPr>
-                <w:rFonts w:ascii="NanumSquare" w:hAnsi="NanumSquare" w:eastAsia="NanumSquare"/>
+                <w:rFonts w:ascii="맑은 고딕" w:hAnsi="맑은 고딕" w:eastAsia="맑은 고딕"/>
                 <w:b/>
-                <w:sz w:val="16"/>
+                <w:color w:val="24477E"/>
+                <w:sz w:val="17"/>
+              </w:rPr>
+            </w:r>
+            <w:r>
+              <w:rPr>
+                <w:rFonts w:ascii="맑은 고딕" w:hAnsi="맑은 고딕" w:eastAsia="맑은 고딕"/>
+                <w:b/>
+                <w:color w:val="24477E"/>
+                <w:sz w:val="17"/>
               </w:rPr>
               <w:t>Score B</w:t>
               <w:br/>
@@ -2966,25 +3765,36 @@
               <w:end w:w="70" w:type="dxa"/>
             </w:tcMar>
             <w:tcBorders>
-              <w:top w:val="single" w:sz="8" w:space="0" w:color="666666"/>
+              <w:top w:val="single" w:sz="4" w:space="0" w:color="B5C1CC"/>
               <w:start w:val="single" w:sz="8" w:space="0" w:color="666666"/>
-              <w:bottom w:val="single" w:sz="8" w:space="0" w:color="666666"/>
+              <w:bottom w:val="single" w:sz="4" w:space="0" w:color="B5C1CC"/>
               <w:end w:val="single" w:sz="8" w:space="0" w:color="666666"/>
               <w:insideH w:val="single" w:sz="8" w:space="0" w:color="666666"/>
               <w:insideV w:val="single" w:sz="8" w:space="0" w:color="666666"/>
+              <w:left w:val="single" w:sz="4" w:color="B5C1CC"/>
+              <w:right w:val="single" w:sz="4" w:color="B5C1CC"/>
             </w:tcBorders>
+            <w:shd w:fill="E8EFF6"/>
           </w:tcPr>
           <w:p>
             <w:pPr>
-              <w:spacing w:before="0" w:after="0" w:line="240" w:lineRule="auto"/>
+              <w:spacing w:before="40" w:after="40" w:line="276" w:lineRule="auto"/>
               <w:jc w:val="center"/>
             </w:pPr>
-            <w:r/>
             <w:r>
               <w:rPr>
-                <w:rFonts w:ascii="NanumSquare" w:hAnsi="NanumSquare" w:eastAsia="NanumSquare"/>
-                <w:b w:val="0"/>
-                <w:sz w:val="16"/>
+                <w:rFonts w:ascii="맑은 고딕" w:hAnsi="맑은 고딕" w:eastAsia="맑은 고딕"/>
+                <w:b/>
+                <w:color w:val="24477E"/>
+                <w:sz w:val="17"/>
+              </w:rPr>
+            </w:r>
+            <w:r>
+              <w:rPr>
+                <w:rFonts w:ascii="맑은 고딕" w:hAnsi="맑은 고딕" w:eastAsia="맑은 고딕"/>
+                <w:b/>
+                <w:color w:val="24477E"/>
+                <w:sz w:val="17"/>
               </w:rPr>
               <w:t>{{ScoreB}}</w:t>
             </w:r>
@@ -3003,26 +3813,36 @@
               <w:end w:w="70" w:type="dxa"/>
             </w:tcMar>
             <w:tcBorders>
-              <w:top w:val="single" w:sz="8" w:space="0" w:color="666666"/>
+              <w:top w:val="single" w:sz="4" w:space="0" w:color="B5C1CC"/>
               <w:start w:val="single" w:sz="8" w:space="0" w:color="666666"/>
-              <w:bottom w:val="single" w:sz="8" w:space="0" w:color="666666"/>
+              <w:bottom w:val="single" w:sz="4" w:space="0" w:color="B5C1CC"/>
               <w:end w:val="single" w:sz="8" w:space="0" w:color="666666"/>
               <w:insideH w:val="single" w:sz="8" w:space="0" w:color="666666"/>
               <w:insideV w:val="single" w:sz="8" w:space="0" w:color="666666"/>
+              <w:left w:val="single" w:sz="4" w:color="B5C1CC"/>
+              <w:right w:val="single" w:sz="4" w:color="B5C1CC"/>
             </w:tcBorders>
-            <w:shd w:fill="D9E1EC"/>
+            <w:shd w:fill="F2F5F8"/>
           </w:tcPr>
           <w:p>
             <w:pPr>
-              <w:spacing w:before="0" w:after="0" w:line="240" w:lineRule="auto"/>
+              <w:spacing w:before="40" w:after="40" w:line="276" w:lineRule="auto"/>
               <w:jc w:val="center"/>
             </w:pPr>
-            <w:r/>
             <w:r>
               <w:rPr>
-                <w:rFonts w:ascii="NanumSquare" w:hAnsi="NanumSquare" w:eastAsia="NanumSquare"/>
-                <w:b/>
-                <w:sz w:val="16"/>
+                <w:rFonts w:ascii="맑은 고딕" w:hAnsi="맑은 고딕" w:eastAsia="맑은 고딕"/>
+                <w:b w:val="0"/>
+                <w:color w:val="222222"/>
+                <w:sz w:val="17"/>
+              </w:rPr>
+            </w:r>
+            <w:r>
+              <w:rPr>
+                <w:rFonts w:ascii="맑은 고딕" w:hAnsi="맑은 고딕" w:eastAsia="맑은 고딕"/>
+                <w:b w:val="0"/>
+                <w:color w:val="222222"/>
+                <w:sz w:val="17"/>
               </w:rPr>
               <w:t>Table C</w:t>
             </w:r>
@@ -3039,25 +3859,35 @@
               <w:end w:w="70" w:type="dxa"/>
             </w:tcMar>
             <w:tcBorders>
-              <w:top w:val="single" w:sz="8" w:space="0" w:color="666666"/>
+              <w:top w:val="single" w:sz="4" w:space="0" w:color="B5C1CC"/>
               <w:start w:val="single" w:sz="8" w:space="0" w:color="666666"/>
-              <w:bottom w:val="single" w:sz="8" w:space="0" w:color="666666"/>
+              <w:bottom w:val="single" w:sz="4" w:space="0" w:color="B5C1CC"/>
               <w:end w:val="single" w:sz="8" w:space="0" w:color="666666"/>
               <w:insideH w:val="single" w:sz="8" w:space="0" w:color="666666"/>
               <w:insideV w:val="single" w:sz="8" w:space="0" w:color="666666"/>
+              <w:left w:val="single" w:sz="4" w:color="B5C1CC"/>
+              <w:right w:val="single" w:sz="4" w:color="B5C1CC"/>
             </w:tcBorders>
           </w:tcPr>
           <w:p>
             <w:pPr>
-              <w:spacing w:before="0" w:after="0" w:line="240" w:lineRule="auto"/>
+              <w:spacing w:before="40" w:after="40" w:line="276" w:lineRule="auto"/>
               <w:jc w:val="center"/>
             </w:pPr>
-            <w:r/>
             <w:r>
               <w:rPr>
-                <w:rFonts w:ascii="NanumSquare" w:hAnsi="NanumSquare" w:eastAsia="NanumSquare"/>
+                <w:rFonts w:ascii="맑은 고딕" w:hAnsi="맑은 고딕" w:eastAsia="맑은 고딕"/>
                 <w:b w:val="0"/>
-                <w:sz w:val="16"/>
+                <w:color w:val="222222"/>
+                <w:sz w:val="17"/>
+              </w:rPr>
+            </w:r>
+            <w:r>
+              <w:rPr>
+                <w:rFonts w:ascii="맑은 고딕" w:hAnsi="맑은 고딕" w:eastAsia="맑은 고딕"/>
+                <w:b w:val="0"/>
+                <w:color w:val="222222"/>
+                <w:sz w:val="17"/>
               </w:rPr>
               <w:t>{{TableC}}</w:t>
             </w:r>
@@ -3074,26 +3904,36 @@
               <w:end w:w="70" w:type="dxa"/>
             </w:tcMar>
             <w:tcBorders>
-              <w:top w:val="single" w:sz="8" w:space="0" w:color="666666"/>
+              <w:top w:val="single" w:sz="4" w:space="0" w:color="B5C1CC"/>
               <w:start w:val="single" w:sz="8" w:space="0" w:color="666666"/>
-              <w:bottom w:val="single" w:sz="8" w:space="0" w:color="666666"/>
+              <w:bottom w:val="single" w:sz="4" w:space="0" w:color="B5C1CC"/>
               <w:end w:val="single" w:sz="8" w:space="0" w:color="666666"/>
               <w:insideH w:val="single" w:sz="8" w:space="0" w:color="666666"/>
               <w:insideV w:val="single" w:sz="8" w:space="0" w:color="666666"/>
+              <w:left w:val="single" w:sz="4" w:color="B5C1CC"/>
+              <w:right w:val="single" w:sz="4" w:color="B5C1CC"/>
             </w:tcBorders>
             <w:shd w:fill="D9E1EC"/>
           </w:tcPr>
           <w:p>
             <w:pPr>
-              <w:spacing w:before="0" w:after="0" w:line="240" w:lineRule="auto"/>
+              <w:spacing w:before="40" w:after="40" w:line="276" w:lineRule="auto"/>
               <w:jc w:val="center"/>
             </w:pPr>
-            <w:r/>
             <w:r>
               <w:rPr>
-                <w:rFonts w:ascii="NanumSquare" w:hAnsi="NanumSquare" w:eastAsia="NanumSquare"/>
-                <w:b/>
-                <w:sz w:val="16"/>
+                <w:rFonts w:ascii="맑은 고딕" w:hAnsi="맑은 고딕" w:eastAsia="맑은 고딕"/>
+                <w:b w:val="0"/>
+                <w:color w:val="222222"/>
+                <w:sz w:val="17"/>
+              </w:rPr>
+            </w:r>
+            <w:r>
+              <w:rPr>
+                <w:rFonts w:ascii="맑은 고딕" w:hAnsi="맑은 고딕" w:eastAsia="맑은 고딕"/>
+                <w:b w:val="0"/>
+                <w:color w:val="222222"/>
+                <w:sz w:val="17"/>
               </w:rPr>
               <w:t>활동점수</w:t>
             </w:r>
@@ -3110,25 +3950,35 @@
               <w:end w:w="70" w:type="dxa"/>
             </w:tcMar>
             <w:tcBorders>
-              <w:top w:val="single" w:sz="8" w:space="0" w:color="666666"/>
+              <w:top w:val="single" w:sz="4" w:space="0" w:color="B5C1CC"/>
               <w:start w:val="single" w:sz="8" w:space="0" w:color="666666"/>
-              <w:bottom w:val="single" w:sz="8" w:space="0" w:color="666666"/>
+              <w:bottom w:val="single" w:sz="4" w:space="0" w:color="B5C1CC"/>
               <w:end w:val="single" w:sz="8" w:space="0" w:color="666666"/>
               <w:insideH w:val="single" w:sz="8" w:space="0" w:color="666666"/>
               <w:insideV w:val="single" w:sz="8" w:space="0" w:color="666666"/>
+              <w:left w:val="single" w:sz="4" w:color="B5C1CC"/>
+              <w:right w:val="single" w:sz="4" w:color="B5C1CC"/>
             </w:tcBorders>
           </w:tcPr>
           <w:p>
             <w:pPr>
-              <w:spacing w:before="0" w:after="0" w:line="240" w:lineRule="auto"/>
+              <w:spacing w:before="40" w:after="40" w:line="276" w:lineRule="auto"/>
               <w:jc w:val="center"/>
             </w:pPr>
-            <w:r/>
             <w:r>
               <w:rPr>
-                <w:rFonts w:ascii="NanumSquare" w:hAnsi="NanumSquare" w:eastAsia="NanumSquare"/>
+                <w:rFonts w:ascii="맑은 고딕" w:hAnsi="맑은 고딕" w:eastAsia="맑은 고딕"/>
                 <w:b w:val="0"/>
-                <w:sz w:val="16"/>
+                <w:color w:val="222222"/>
+                <w:sz w:val="17"/>
+              </w:rPr>
+            </w:r>
+            <w:r>
+              <w:rPr>
+                <w:rFonts w:ascii="맑은 고딕" w:hAnsi="맑은 고딕" w:eastAsia="맑은 고딕"/>
+                <w:b w:val="0"/>
+                <w:color w:val="222222"/>
+                <w:sz w:val="17"/>
               </w:rPr>
               <w:t>{{활동점수}}</w:t>
             </w:r>
@@ -3147,26 +3997,36 @@
               <w:end w:w="70" w:type="dxa"/>
             </w:tcMar>
             <w:tcBorders>
-              <w:top w:val="single" w:sz="8" w:space="0" w:color="666666"/>
+              <w:top w:val="single" w:sz="4" w:space="0" w:color="B5C1CC"/>
               <w:start w:val="single" w:sz="8" w:space="0" w:color="666666"/>
-              <w:bottom w:val="single" w:sz="8" w:space="0" w:color="666666"/>
+              <w:bottom w:val="single" w:sz="4" w:space="0" w:color="B5C1CC"/>
               <w:end w:val="single" w:sz="8" w:space="0" w:color="666666"/>
               <w:insideH w:val="single" w:sz="8" w:space="0" w:color="666666"/>
               <w:insideV w:val="single" w:sz="8" w:space="0" w:color="666666"/>
+              <w:left w:val="single" w:sz="4" w:color="B5C1CC"/>
+              <w:right w:val="single" w:sz="4" w:color="B5C1CC"/>
             </w:tcBorders>
-            <w:shd w:fill="D9E1EC"/>
+            <w:shd w:fill="F2F5F8"/>
           </w:tcPr>
           <w:p>
             <w:pPr>
-              <w:spacing w:before="0" w:after="0" w:line="240" w:lineRule="auto"/>
+              <w:spacing w:before="40" w:after="40" w:line="276" w:lineRule="auto"/>
               <w:jc w:val="center"/>
             </w:pPr>
-            <w:r/>
             <w:r>
               <w:rPr>
-                <w:rFonts w:ascii="NanumSquare" w:hAnsi="NanumSquare" w:eastAsia="NanumSquare"/>
-                <w:b/>
-                <w:sz w:val="16"/>
+                <w:rFonts w:ascii="맑은 고딕" w:hAnsi="맑은 고딕" w:eastAsia="맑은 고딕"/>
+                <w:b w:val="0"/>
+                <w:color w:val="222222"/>
+                <w:sz w:val="17"/>
+              </w:rPr>
+            </w:r>
+            <w:r>
+              <w:rPr>
+                <w:rFonts w:ascii="맑은 고딕" w:hAnsi="맑은 고딕" w:eastAsia="맑은 고딕"/>
+                <w:b w:val="0"/>
+                <w:color w:val="222222"/>
+                <w:sz w:val="17"/>
               </w:rPr>
               <w:t>REBA 최종</w:t>
               <w:br/>
@@ -3185,25 +4045,35 @@
               <w:end w:w="70" w:type="dxa"/>
             </w:tcMar>
             <w:tcBorders>
-              <w:top w:val="single" w:sz="8" w:space="0" w:color="666666"/>
+              <w:top w:val="single" w:sz="4" w:space="0" w:color="B5C1CC"/>
               <w:start w:val="single" w:sz="8" w:space="0" w:color="666666"/>
-              <w:bottom w:val="single" w:sz="8" w:space="0" w:color="666666"/>
+              <w:bottom w:val="single" w:sz="4" w:space="0" w:color="B5C1CC"/>
               <w:end w:val="single" w:sz="8" w:space="0" w:color="666666"/>
               <w:insideH w:val="single" w:sz="8" w:space="0" w:color="666666"/>
               <w:insideV w:val="single" w:sz="8" w:space="0" w:color="666666"/>
+              <w:left w:val="single" w:sz="4" w:color="B5C1CC"/>
+              <w:right w:val="single" w:sz="4" w:color="B5C1CC"/>
             </w:tcBorders>
           </w:tcPr>
           <w:p>
             <w:pPr>
-              <w:spacing w:before="0" w:after="0" w:line="240" w:lineRule="auto"/>
+              <w:spacing w:before="40" w:after="40" w:line="276" w:lineRule="auto"/>
               <w:jc w:val="center"/>
             </w:pPr>
-            <w:r/>
             <w:r>
               <w:rPr>
-                <w:rFonts w:ascii="NanumSquare" w:hAnsi="NanumSquare" w:eastAsia="NanumSquare"/>
+                <w:rFonts w:ascii="맑은 고딕" w:hAnsi="맑은 고딕" w:eastAsia="맑은 고딕"/>
                 <w:b w:val="0"/>
-                <w:sz w:val="16"/>
+                <w:color w:val="222222"/>
+                <w:sz w:val="17"/>
+              </w:rPr>
+            </w:r>
+            <w:r>
+              <w:rPr>
+                <w:rFonts w:ascii="맑은 고딕" w:hAnsi="맑은 고딕" w:eastAsia="맑은 고딕"/>
+                <w:b w:val="0"/>
+                <w:color w:val="222222"/>
+                <w:sz w:val="17"/>
               </w:rPr>
               <w:t>{{REBA최종점수}}</w:t>
             </w:r>
@@ -3220,26 +4090,36 @@
               <w:end w:w="70" w:type="dxa"/>
             </w:tcMar>
             <w:tcBorders>
-              <w:top w:val="single" w:sz="8" w:space="0" w:color="666666"/>
+              <w:top w:val="single" w:sz="4" w:space="0" w:color="B5C1CC"/>
               <w:start w:val="single" w:sz="8" w:space="0" w:color="666666"/>
-              <w:bottom w:val="single" w:sz="8" w:space="0" w:color="666666"/>
+              <w:bottom w:val="single" w:sz="4" w:space="0" w:color="B5C1CC"/>
               <w:end w:val="single" w:sz="8" w:space="0" w:color="666666"/>
               <w:insideH w:val="single" w:sz="8" w:space="0" w:color="666666"/>
               <w:insideV w:val="single" w:sz="8" w:space="0" w:color="666666"/>
+              <w:left w:val="single" w:sz="4" w:color="B5C1CC"/>
+              <w:right w:val="single" w:sz="4" w:color="B5C1CC"/>
             </w:tcBorders>
             <w:shd w:fill="D9E1EC"/>
           </w:tcPr>
           <w:p>
             <w:pPr>
-              <w:spacing w:before="0" w:after="0" w:line="240" w:lineRule="auto"/>
+              <w:spacing w:before="40" w:after="40" w:line="276" w:lineRule="auto"/>
               <w:jc w:val="center"/>
             </w:pPr>
-            <w:r/>
             <w:r>
               <w:rPr>
-                <w:rFonts w:ascii="NanumSquare" w:hAnsi="NanumSquare" w:eastAsia="NanumSquare"/>
-                <w:b/>
-                <w:sz w:val="16"/>
+                <w:rFonts w:ascii="맑은 고딕" w:hAnsi="맑은 고딕" w:eastAsia="맑은 고딕"/>
+                <w:b w:val="0"/>
+                <w:color w:val="222222"/>
+                <w:sz w:val="17"/>
+              </w:rPr>
+            </w:r>
+            <w:r>
+              <w:rPr>
+                <w:rFonts w:ascii="맑은 고딕" w:hAnsi="맑은 고딕" w:eastAsia="맑은 고딕"/>
+                <w:b w:val="0"/>
+                <w:color w:val="222222"/>
+                <w:sz w:val="17"/>
               </w:rPr>
               <w:t>위험등급</w:t>
             </w:r>
@@ -3256,25 +4136,35 @@
               <w:end w:w="70" w:type="dxa"/>
             </w:tcMar>
             <w:tcBorders>
-              <w:top w:val="single" w:sz="8" w:space="0" w:color="666666"/>
+              <w:top w:val="single" w:sz="4" w:space="0" w:color="B5C1CC"/>
               <w:start w:val="single" w:sz="8" w:space="0" w:color="666666"/>
-              <w:bottom w:val="single" w:sz="8" w:space="0" w:color="666666"/>
+              <w:bottom w:val="single" w:sz="4" w:space="0" w:color="B5C1CC"/>
               <w:end w:val="single" w:sz="8" w:space="0" w:color="666666"/>
               <w:insideH w:val="single" w:sz="8" w:space="0" w:color="666666"/>
               <w:insideV w:val="single" w:sz="8" w:space="0" w:color="666666"/>
+              <w:left w:val="single" w:sz="4" w:color="B5C1CC"/>
+              <w:right w:val="single" w:sz="4" w:color="B5C1CC"/>
             </w:tcBorders>
           </w:tcPr>
           <w:p>
             <w:pPr>
-              <w:spacing w:before="0" w:after="0" w:line="240" w:lineRule="auto"/>
+              <w:spacing w:before="40" w:after="40" w:line="276" w:lineRule="auto"/>
               <w:jc w:val="center"/>
             </w:pPr>
-            <w:r/>
             <w:r>
               <w:rPr>
-                <w:rFonts w:ascii="NanumSquare" w:hAnsi="NanumSquare" w:eastAsia="NanumSquare"/>
+                <w:rFonts w:ascii="맑은 고딕" w:hAnsi="맑은 고딕" w:eastAsia="맑은 고딕"/>
                 <w:b w:val="0"/>
-                <w:sz w:val="16"/>
+                <w:color w:val="222222"/>
+                <w:sz w:val="17"/>
+              </w:rPr>
+            </w:r>
+            <w:r>
+              <w:rPr>
+                <w:rFonts w:ascii="맑은 고딕" w:hAnsi="맑은 고딕" w:eastAsia="맑은 고딕"/>
+                <w:b w:val="0"/>
+                <w:color w:val="222222"/>
+                <w:sz w:val="17"/>
               </w:rPr>
               <w:t>{{REBA위험등급}}</w:t>
             </w:r>
@@ -3306,26 +4196,36 @@
               <w:end w:w="70" w:type="dxa"/>
             </w:tcMar>
             <w:tcBorders>
-              <w:top w:val="single" w:sz="8" w:space="0" w:color="666666"/>
+              <w:top w:val="single" w:sz="4" w:space="0" w:color="B5C1CC"/>
               <w:start w:val="single" w:sz="8" w:space="0" w:color="666666"/>
-              <w:bottom w:val="single" w:sz="8" w:space="0" w:color="666666"/>
+              <w:bottom w:val="single" w:sz="4" w:space="0" w:color="B5C1CC"/>
               <w:end w:val="single" w:sz="8" w:space="0" w:color="666666"/>
               <w:insideH w:val="single" w:sz="8" w:space="0" w:color="666666"/>
               <w:insideV w:val="single" w:sz="8" w:space="0" w:color="666666"/>
+              <w:left w:val="single" w:sz="4" w:color="B5C1CC"/>
+              <w:right w:val="single" w:sz="4" w:color="B5C1CC"/>
             </w:tcBorders>
-            <w:shd w:fill="D9E1EC"/>
+            <w:shd w:fill="E8EFF6"/>
           </w:tcPr>
           <w:p>
             <w:pPr>
-              <w:spacing w:before="0" w:after="0" w:line="240" w:lineRule="auto"/>
+              <w:spacing w:before="40" w:after="40" w:line="276" w:lineRule="auto"/>
               <w:jc w:val="center"/>
             </w:pPr>
-            <w:r/>
             <w:r>
               <w:rPr>
-                <w:rFonts w:ascii="NanumSquare" w:hAnsi="NanumSquare" w:eastAsia="NanumSquare"/>
+                <w:rFonts w:ascii="맑은 고딕" w:hAnsi="맑은 고딕" w:eastAsia="맑은 고딕"/>
                 <w:b/>
-                <w:sz w:val="16"/>
+                <w:color w:val="24477E"/>
+                <w:sz w:val="17"/>
+              </w:rPr>
+            </w:r>
+            <w:r>
+              <w:rPr>
+                <w:rFonts w:ascii="맑은 고딕" w:hAnsi="맑은 고딕" w:eastAsia="맑은 고딕"/>
+                <w:b/>
+                <w:color w:val="24477E"/>
+                <w:sz w:val="17"/>
               </w:rPr>
               <w:t>조치 권고</w:t>
             </w:r>
@@ -3342,25 +4242,36 @@
               <w:end w:w="70" w:type="dxa"/>
             </w:tcMar>
             <w:tcBorders>
-              <w:top w:val="single" w:sz="8" w:space="0" w:color="666666"/>
+              <w:top w:val="single" w:sz="4" w:space="0" w:color="B5C1CC"/>
               <w:start w:val="single" w:sz="8" w:space="0" w:color="666666"/>
-              <w:bottom w:val="single" w:sz="8" w:space="0" w:color="666666"/>
+              <w:bottom w:val="single" w:sz="4" w:space="0" w:color="B5C1CC"/>
               <w:end w:val="single" w:sz="8" w:space="0" w:color="666666"/>
               <w:insideH w:val="single" w:sz="8" w:space="0" w:color="666666"/>
               <w:insideV w:val="single" w:sz="8" w:space="0" w:color="666666"/>
+              <w:left w:val="single" w:sz="4" w:color="B5C1CC"/>
+              <w:right w:val="single" w:sz="4" w:color="B5C1CC"/>
             </w:tcBorders>
+            <w:shd w:fill="E8EFF6"/>
           </w:tcPr>
           <w:p>
             <w:pPr>
-              <w:spacing w:before="0" w:after="0" w:line="240" w:lineRule="auto"/>
+              <w:spacing w:before="40" w:after="40" w:line="276" w:lineRule="auto"/>
               <w:jc w:val="center"/>
             </w:pPr>
-            <w:r/>
             <w:r>
               <w:rPr>
-                <w:rFonts w:ascii="NanumSquare" w:hAnsi="NanumSquare" w:eastAsia="NanumSquare"/>
+                <w:rFonts w:ascii="맑은 고딕" w:hAnsi="맑은 고딕" w:eastAsia="맑은 고딕"/>
                 <w:b/>
-                <w:sz w:val="16"/>
+                <w:color w:val="24477E"/>
+                <w:sz w:val="17"/>
+              </w:rPr>
+            </w:r>
+            <w:r>
+              <w:rPr>
+                <w:rFonts w:ascii="맑은 고딕" w:hAnsi="맑은 고딕" w:eastAsia="맑은 고딕"/>
+                <w:b/>
+                <w:color w:val="24477E"/>
+                <w:sz w:val="17"/>
               </w:rPr>
               <w:t>{{조치권고}}</w:t>
             </w:r>
@@ -3370,65 +4281,72 @@
     </w:tbl>
     <w:p>
       <w:pPr>
-        <w:spacing w:before="80" w:after="80" w:line="240" w:lineRule="auto"/>
+        <w:keepNext/>
+        <w:spacing w:before="180" w:after="100" w:line="300" w:lineRule="auto"/>
       </w:pPr>
       <w:r>
         <w:rPr>
-          <w:rFonts w:ascii="NanumSquare" w:hAnsi="NanumSquare" w:eastAsia="NanumSquare"/>
+          <w:rFonts w:ascii="맑은 고딕" w:hAnsi="맑은 고딕" w:eastAsia="맑은 고딕"/>
           <w:b/>
-          <w:sz w:val="21"/>
+          <w:color w:val="24477E"/>
+          <w:sz w:val="22"/>
         </w:rPr>
         <w:t>■ 근골격계 부담요인 분석</w:t>
       </w:r>
     </w:p>
     <w:p>
       <w:pPr>
-        <w:spacing w:before="0" w:after="40" w:line="240" w:lineRule="auto"/>
+        <w:spacing w:before="0" w:after="60" w:line="300" w:lineRule="auto"/>
       </w:pPr>
       <w:r>
         <w:rPr>
-          <w:rFonts w:ascii="NanumSquare" w:hAnsi="NanumSquare" w:eastAsia="NanumSquare"/>
+          <w:rFonts w:ascii="맑은 고딕" w:hAnsi="맑은 고딕" w:eastAsia="맑은 고딕"/>
           <w:b w:val="0"/>
-          <w:sz w:val="17"/>
+          <w:color w:val="222222"/>
+          <w:sz w:val="18"/>
         </w:rPr>
         <w:t>◎ 단위작업: {{단위작업명}}</w:t>
       </w:r>
     </w:p>
     <w:p>
       <w:pPr>
-        <w:spacing w:before="0" w:after="80" w:line="252" w:lineRule="auto"/>
+        <w:spacing w:before="0" w:after="60" w:line="300" w:lineRule="auto"/>
       </w:pPr>
       <w:r>
         <w:rPr>
-          <w:rFonts w:ascii="NanumSquare" w:hAnsi="NanumSquare" w:eastAsia="NanumSquare"/>
+          <w:rFonts w:ascii="맑은 고딕" w:hAnsi="맑은 고딕" w:eastAsia="맑은 고딕"/>
           <w:b w:val="0"/>
-          <w:sz w:val="16"/>
+          <w:color w:val="222222"/>
+          <w:sz w:val="18"/>
         </w:rPr>
         <w:t>{{부담요인분석}}</w:t>
       </w:r>
     </w:p>
     <w:p>
       <w:pPr>
-        <w:spacing w:before="80" w:after="80" w:line="240" w:lineRule="auto"/>
+        <w:keepNext/>
+        <w:spacing w:before="180" w:after="100" w:line="300" w:lineRule="auto"/>
       </w:pPr>
       <w:r>
         <w:rPr>
-          <w:rFonts w:ascii="NanumSquare" w:hAnsi="NanumSquare" w:eastAsia="NanumSquare"/>
+          <w:rFonts w:ascii="맑은 고딕" w:hAnsi="맑은 고딕" w:eastAsia="맑은 고딕"/>
           <w:b/>
-          <w:sz w:val="21"/>
+          <w:color w:val="24477E"/>
+          <w:sz w:val="22"/>
         </w:rPr>
         <w:t>■ 개선방안</w:t>
       </w:r>
     </w:p>
     <w:p>
       <w:pPr>
-        <w:spacing w:before="0" w:after="40" w:line="240" w:lineRule="auto"/>
+        <w:spacing w:before="0" w:after="60" w:line="300" w:lineRule="auto"/>
       </w:pPr>
       <w:r>
         <w:rPr>
-          <w:rFonts w:ascii="NanumSquare" w:hAnsi="NanumSquare" w:eastAsia="NanumSquare"/>
+          <w:rFonts w:ascii="맑은 고딕" w:hAnsi="맑은 고딕" w:eastAsia="맑은 고딕"/>
           <w:b w:val="0"/>
-          <w:sz w:val="17"/>
+          <w:color w:val="222222"/>
+          <w:sz w:val="18"/>
         </w:rPr>
         <w:t>◎ 단위작업: {{단위작업명}}</w:t>
       </w:r>
@@ -3457,26 +4375,36 @@
               <w:end w:w="70" w:type="dxa"/>
             </w:tcMar>
             <w:tcBorders>
-              <w:top w:val="single" w:sz="8" w:space="0" w:color="666666"/>
+              <w:top w:val="single" w:sz="4" w:space="0" w:color="B5C1CC"/>
               <w:start w:val="single" w:sz="8" w:space="0" w:color="666666"/>
-              <w:bottom w:val="single" w:sz="8" w:space="0" w:color="666666"/>
+              <w:bottom w:val="single" w:sz="4" w:space="0" w:color="B5C1CC"/>
               <w:end w:val="single" w:sz="8" w:space="0" w:color="666666"/>
               <w:insideH w:val="single" w:sz="8" w:space="0" w:color="666666"/>
               <w:insideV w:val="single" w:sz="8" w:space="0" w:color="666666"/>
+              <w:left w:val="single" w:sz="4" w:color="B5C1CC"/>
+              <w:right w:val="single" w:sz="4" w:color="B5C1CC"/>
             </w:tcBorders>
-            <w:shd w:fill="D9E1EC"/>
+            <w:shd w:fill="E8EFF6"/>
           </w:tcPr>
           <w:p>
             <w:pPr>
-              <w:spacing w:before="0" w:after="0" w:line="240" w:lineRule="auto"/>
+              <w:spacing w:before="40" w:after="40" w:line="276" w:lineRule="auto"/>
               <w:jc w:val="center"/>
             </w:pPr>
-            <w:r/>
             <w:r>
               <w:rPr>
-                <w:rFonts w:ascii="NanumSquare" w:hAnsi="NanumSquare" w:eastAsia="NanumSquare"/>
+                <w:rFonts w:ascii="맑은 고딕" w:hAnsi="맑은 고딕" w:eastAsia="맑은 고딕"/>
                 <w:b/>
-                <w:sz w:val="16"/>
+                <w:color w:val="24477E"/>
+                <w:sz w:val="17"/>
+              </w:rPr>
+            </w:r>
+            <w:r>
+              <w:rPr>
+                <w:rFonts w:ascii="맑은 고딕" w:hAnsi="맑은 고딕" w:eastAsia="맑은 고딕"/>
+                <w:b/>
+                <w:color w:val="24477E"/>
+                <w:sz w:val="17"/>
               </w:rPr>
               <w:t>구분</w:t>
             </w:r>
@@ -3493,26 +4421,36 @@
               <w:end w:w="70" w:type="dxa"/>
             </w:tcMar>
             <w:tcBorders>
-              <w:top w:val="single" w:sz="8" w:space="0" w:color="666666"/>
+              <w:top w:val="single" w:sz="4" w:space="0" w:color="B5C1CC"/>
               <w:start w:val="single" w:sz="8" w:space="0" w:color="666666"/>
-              <w:bottom w:val="single" w:sz="8" w:space="0" w:color="666666"/>
+              <w:bottom w:val="single" w:sz="4" w:space="0" w:color="B5C1CC"/>
               <w:end w:val="single" w:sz="8" w:space="0" w:color="666666"/>
               <w:insideH w:val="single" w:sz="8" w:space="0" w:color="666666"/>
               <w:insideV w:val="single" w:sz="8" w:space="0" w:color="666666"/>
+              <w:left w:val="single" w:sz="4" w:color="B5C1CC"/>
+              <w:right w:val="single" w:sz="4" w:color="B5C1CC"/>
             </w:tcBorders>
-            <w:shd w:fill="D9E1EC"/>
+            <w:shd w:fill="E8EFF6"/>
           </w:tcPr>
           <w:p>
             <w:pPr>
-              <w:spacing w:before="0" w:after="0" w:line="240" w:lineRule="auto"/>
+              <w:spacing w:before="40" w:after="40" w:line="276" w:lineRule="auto"/>
               <w:jc w:val="center"/>
             </w:pPr>
-            <w:r/>
             <w:r>
               <w:rPr>
-                <w:rFonts w:ascii="NanumSquare" w:hAnsi="NanumSquare" w:eastAsia="NanumSquare"/>
+                <w:rFonts w:ascii="맑은 고딕" w:hAnsi="맑은 고딕" w:eastAsia="맑은 고딕"/>
                 <w:b/>
-                <w:sz w:val="16"/>
+                <w:color w:val="24477E"/>
+                <w:sz w:val="17"/>
+              </w:rPr>
+            </w:r>
+            <w:r>
+              <w:rPr>
+                <w:rFonts w:ascii="맑은 고딕" w:hAnsi="맑은 고딕" w:eastAsia="맑은 고딕"/>
+                <w:b/>
+                <w:color w:val="24477E"/>
+                <w:sz w:val="17"/>
               </w:rPr>
               <w:t>개선방안</w:t>
             </w:r>
@@ -3531,25 +4469,36 @@
               <w:end w:w="70" w:type="dxa"/>
             </w:tcMar>
             <w:tcBorders>
-              <w:top w:val="single" w:sz="8" w:space="0" w:color="666666"/>
+              <w:top w:val="single" w:sz="4" w:space="0" w:color="B5C1CC"/>
               <w:start w:val="single" w:sz="8" w:space="0" w:color="666666"/>
-              <w:bottom w:val="single" w:sz="8" w:space="0" w:color="666666"/>
+              <w:bottom w:val="single" w:sz="4" w:space="0" w:color="B5C1CC"/>
               <w:end w:val="single" w:sz="8" w:space="0" w:color="666666"/>
               <w:insideH w:val="single" w:sz="8" w:space="0" w:color="666666"/>
               <w:insideV w:val="single" w:sz="8" w:space="0" w:color="666666"/>
+              <w:left w:val="single" w:sz="4" w:color="B5C1CC"/>
+              <w:right w:val="single" w:sz="4" w:color="B5C1CC"/>
             </w:tcBorders>
+            <w:shd w:fill="F2F5F8"/>
           </w:tcPr>
           <w:p>
             <w:pPr>
-              <w:spacing w:before="0" w:after="0" w:line="240" w:lineRule="auto"/>
+              <w:spacing w:before="40" w:after="40" w:line="276" w:lineRule="auto"/>
               <w:jc w:val="center"/>
             </w:pPr>
-            <w:r/>
             <w:r>
               <w:rPr>
-                <w:rFonts w:ascii="NanumSquare" w:hAnsi="NanumSquare" w:eastAsia="NanumSquare"/>
+                <w:rFonts w:ascii="맑은 고딕" w:hAnsi="맑은 고딕" w:eastAsia="맑은 고딕"/>
                 <w:b w:val="0"/>
-                <w:sz w:val="16"/>
+                <w:color w:val="222222"/>
+                <w:sz w:val="17"/>
+              </w:rPr>
+            </w:r>
+            <w:r>
+              <w:rPr>
+                <w:rFonts w:ascii="맑은 고딕" w:hAnsi="맑은 고딕" w:eastAsia="맑은 고딕"/>
+                <w:b w:val="0"/>
+                <w:color w:val="222222"/>
+                <w:sz w:val="17"/>
               </w:rPr>
               <w:t>공학적 개선</w:t>
             </w:r>
@@ -3566,25 +4515,35 @@
               <w:end w:w="70" w:type="dxa"/>
             </w:tcMar>
             <w:tcBorders>
-              <w:top w:val="single" w:sz="8" w:space="0" w:color="666666"/>
+              <w:top w:val="single" w:sz="4" w:space="0" w:color="B5C1CC"/>
               <w:start w:val="single" w:sz="8" w:space="0" w:color="666666"/>
-              <w:bottom w:val="single" w:sz="8" w:space="0" w:color="666666"/>
+              <w:bottom w:val="single" w:sz="4" w:space="0" w:color="B5C1CC"/>
               <w:end w:val="single" w:sz="8" w:space="0" w:color="666666"/>
               <w:insideH w:val="single" w:sz="8" w:space="0" w:color="666666"/>
               <w:insideV w:val="single" w:sz="8" w:space="0" w:color="666666"/>
+              <w:left w:val="single" w:sz="4" w:color="B5C1CC"/>
+              <w:right w:val="single" w:sz="4" w:color="B5C1CC"/>
             </w:tcBorders>
           </w:tcPr>
           <w:p>
             <w:pPr>
-              <w:spacing w:before="0" w:after="0" w:line="240" w:lineRule="auto"/>
+              <w:spacing w:before="40" w:after="40" w:line="276" w:lineRule="auto"/>
               <w:jc w:val="left"/>
             </w:pPr>
-            <w:r/>
             <w:r>
               <w:rPr>
-                <w:rFonts w:ascii="NanumSquare" w:hAnsi="NanumSquare" w:eastAsia="NanumSquare"/>
+                <w:rFonts w:ascii="맑은 고딕" w:hAnsi="맑은 고딕" w:eastAsia="맑은 고딕"/>
                 <w:b w:val="0"/>
-                <w:sz w:val="16"/>
+                <w:color w:val="222222"/>
+                <w:sz w:val="17"/>
+              </w:rPr>
+            </w:r>
+            <w:r>
+              <w:rPr>
+                <w:rFonts w:ascii="맑은 고딕" w:hAnsi="맑은 고딕" w:eastAsia="맑은 고딕"/>
+                <w:b w:val="0"/>
+                <w:color w:val="222222"/>
+                <w:sz w:val="17"/>
               </w:rPr>
               <w:t>{{공학적개선}}</w:t>
             </w:r>
@@ -3593,8 +4552,15 @@
       </w:tr>
     </w:tbl>
     <w:p>
-      <w:pPr/>
+      <w:pPr>
+        <w:spacing w:before="0" w:after="60" w:line="300" w:lineRule="auto"/>
+      </w:pPr>
       <w:r>
+        <w:rPr>
+          <w:rFonts w:ascii="맑은 고딕" w:hAnsi="맑은 고딕" w:eastAsia="맑은 고딕"/>
+          <w:color w:val="222222"/>
+          <w:sz w:val="18"/>
+        </w:rPr>
         <w:br w:type="page"/>
       </w:r>
     </w:p>
@@ -3622,25 +4588,36 @@
               <w:end w:w="70" w:type="dxa"/>
             </w:tcMar>
             <w:tcBorders>
-              <w:top w:val="single" w:sz="8" w:space="0" w:color="666666"/>
+              <w:top w:val="single" w:sz="4" w:space="0" w:color="B5C1CC"/>
               <w:start w:val="single" w:sz="8" w:space="0" w:color="666666"/>
-              <w:bottom w:val="single" w:sz="8" w:space="0" w:color="666666"/>
+              <w:bottom w:val="single" w:sz="4" w:space="0" w:color="B5C1CC"/>
               <w:end w:val="single" w:sz="8" w:space="0" w:color="666666"/>
               <w:insideH w:val="single" w:sz="8" w:space="0" w:color="666666"/>
               <w:insideV w:val="single" w:sz="8" w:space="0" w:color="666666"/>
+              <w:left w:val="single" w:sz="4" w:color="B5C1CC"/>
+              <w:right w:val="single" w:sz="4" w:color="B5C1CC"/>
             </w:tcBorders>
+            <w:shd w:fill="E8EFF6"/>
           </w:tcPr>
           <w:p>
             <w:pPr>
-              <w:spacing w:before="0" w:after="0" w:line="240" w:lineRule="auto"/>
+              <w:spacing w:before="40" w:after="40" w:line="276" w:lineRule="auto"/>
               <w:jc w:val="center"/>
             </w:pPr>
-            <w:r/>
             <w:r>
               <w:rPr>
-                <w:rFonts w:ascii="NanumSquare" w:hAnsi="NanumSquare" w:eastAsia="NanumSquare"/>
-                <w:b w:val="0"/>
-                <w:sz w:val="16"/>
+                <w:rFonts w:ascii="맑은 고딕" w:hAnsi="맑은 고딕" w:eastAsia="맑은 고딕"/>
+                <w:b/>
+                <w:color w:val="24477E"/>
+                <w:sz w:val="17"/>
+              </w:rPr>
+            </w:r>
+            <w:r>
+              <w:rPr>
+                <w:rFonts w:ascii="맑은 고딕" w:hAnsi="맑은 고딕" w:eastAsia="맑은 고딕"/>
+                <w:b/>
+                <w:color w:val="24477E"/>
+                <w:sz w:val="17"/>
               </w:rPr>
               <w:t>관리적 개선</w:t>
             </w:r>
@@ -3657,25 +4634,36 @@
               <w:end w:w="70" w:type="dxa"/>
             </w:tcMar>
             <w:tcBorders>
-              <w:top w:val="single" w:sz="8" w:space="0" w:color="666666"/>
+              <w:top w:val="single" w:sz="4" w:space="0" w:color="B5C1CC"/>
               <w:start w:val="single" w:sz="8" w:space="0" w:color="666666"/>
-              <w:bottom w:val="single" w:sz="8" w:space="0" w:color="666666"/>
+              <w:bottom w:val="single" w:sz="4" w:space="0" w:color="B5C1CC"/>
               <w:end w:val="single" w:sz="8" w:space="0" w:color="666666"/>
               <w:insideH w:val="single" w:sz="8" w:space="0" w:color="666666"/>
               <w:insideV w:val="single" w:sz="8" w:space="0" w:color="666666"/>
+              <w:left w:val="single" w:sz="4" w:color="B5C1CC"/>
+              <w:right w:val="single" w:sz="4" w:color="B5C1CC"/>
             </w:tcBorders>
+            <w:shd w:fill="E8EFF6"/>
           </w:tcPr>
           <w:p>
             <w:pPr>
-              <w:spacing w:before="0" w:after="0" w:line="240" w:lineRule="auto"/>
+              <w:spacing w:before="40" w:after="40" w:line="276" w:lineRule="auto"/>
               <w:jc w:val="left"/>
             </w:pPr>
-            <w:r/>
             <w:r>
               <w:rPr>
-                <w:rFonts w:ascii="NanumSquare" w:hAnsi="NanumSquare" w:eastAsia="NanumSquare"/>
-                <w:b w:val="0"/>
-                <w:sz w:val="16"/>
+                <w:rFonts w:ascii="맑은 고딕" w:hAnsi="맑은 고딕" w:eastAsia="맑은 고딕"/>
+                <w:b/>
+                <w:color w:val="24477E"/>
+                <w:sz w:val="17"/>
+              </w:rPr>
+            </w:r>
+            <w:r>
+              <w:rPr>
+                <w:rFonts w:ascii="맑은 고딕" w:hAnsi="맑은 고딕" w:eastAsia="맑은 고딕"/>
+                <w:b/>
+                <w:color w:val="24477E"/>
+                <w:sz w:val="17"/>
               </w:rPr>
               <w:t>{{관리적개선}}</w:t>
             </w:r>
@@ -3694,25 +4682,36 @@
               <w:end w:w="70" w:type="dxa"/>
             </w:tcMar>
             <w:tcBorders>
-              <w:top w:val="single" w:sz="8" w:space="0" w:color="666666"/>
+              <w:top w:val="single" w:sz="4" w:space="0" w:color="B5C1CC"/>
               <w:start w:val="single" w:sz="8" w:space="0" w:color="666666"/>
-              <w:bottom w:val="single" w:sz="8" w:space="0" w:color="666666"/>
+              <w:bottom w:val="single" w:sz="4" w:space="0" w:color="B5C1CC"/>
               <w:end w:val="single" w:sz="8" w:space="0" w:color="666666"/>
               <w:insideH w:val="single" w:sz="8" w:space="0" w:color="666666"/>
               <w:insideV w:val="single" w:sz="8" w:space="0" w:color="666666"/>
+              <w:left w:val="single" w:sz="4" w:color="B5C1CC"/>
+              <w:right w:val="single" w:sz="4" w:color="B5C1CC"/>
             </w:tcBorders>
+            <w:shd w:fill="F2F5F8"/>
           </w:tcPr>
           <w:p>
             <w:pPr>
-              <w:spacing w:before="0" w:after="0" w:line="240" w:lineRule="auto"/>
+              <w:spacing w:before="40" w:after="40" w:line="276" w:lineRule="auto"/>
               <w:jc w:val="center"/>
             </w:pPr>
-            <w:r/>
             <w:r>
               <w:rPr>
-                <w:rFonts w:ascii="NanumSquare" w:hAnsi="NanumSquare" w:eastAsia="NanumSquare"/>
+                <w:rFonts w:ascii="맑은 고딕" w:hAnsi="맑은 고딕" w:eastAsia="맑은 고딕"/>
                 <w:b w:val="0"/>
-                <w:sz w:val="16"/>
+                <w:color w:val="222222"/>
+                <w:sz w:val="17"/>
+              </w:rPr>
+            </w:r>
+            <w:r>
+              <w:rPr>
+                <w:rFonts w:ascii="맑은 고딕" w:hAnsi="맑은 고딕" w:eastAsia="맑은 고딕"/>
+                <w:b w:val="0"/>
+                <w:color w:val="222222"/>
+                <w:sz w:val="17"/>
               </w:rPr>
               <w:t>행동적 개선</w:t>
             </w:r>
@@ -3729,25 +4728,35 @@
               <w:end w:w="70" w:type="dxa"/>
             </w:tcMar>
             <w:tcBorders>
-              <w:top w:val="single" w:sz="8" w:space="0" w:color="666666"/>
+              <w:top w:val="single" w:sz="4" w:space="0" w:color="B5C1CC"/>
               <w:start w:val="single" w:sz="8" w:space="0" w:color="666666"/>
-              <w:bottom w:val="single" w:sz="8" w:space="0" w:color="666666"/>
+              <w:bottom w:val="single" w:sz="4" w:space="0" w:color="B5C1CC"/>
               <w:end w:val="single" w:sz="8" w:space="0" w:color="666666"/>
               <w:insideH w:val="single" w:sz="8" w:space="0" w:color="666666"/>
               <w:insideV w:val="single" w:sz="8" w:space="0" w:color="666666"/>
+              <w:left w:val="single" w:sz="4" w:color="B5C1CC"/>
+              <w:right w:val="single" w:sz="4" w:color="B5C1CC"/>
             </w:tcBorders>
           </w:tcPr>
           <w:p>
             <w:pPr>
-              <w:spacing w:before="0" w:after="0" w:line="240" w:lineRule="auto"/>
+              <w:spacing w:before="40" w:after="40" w:line="276" w:lineRule="auto"/>
               <w:jc w:val="left"/>
             </w:pPr>
-            <w:r/>
             <w:r>
               <w:rPr>
-                <w:rFonts w:ascii="NanumSquare" w:hAnsi="NanumSquare" w:eastAsia="NanumSquare"/>
+                <w:rFonts w:ascii="맑은 고딕" w:hAnsi="맑은 고딕" w:eastAsia="맑은 고딕"/>
                 <w:b w:val="0"/>
-                <w:sz w:val="16"/>
+                <w:color w:val="222222"/>
+                <w:sz w:val="17"/>
+              </w:rPr>
+            </w:r>
+            <w:r>
+              <w:rPr>
+                <w:rFonts w:ascii="맑은 고딕" w:hAnsi="맑은 고딕" w:eastAsia="맑은 고딕"/>
+                <w:b w:val="0"/>
+                <w:color w:val="222222"/>
+                <w:sz w:val="17"/>
               </w:rPr>
               <w:t>{{행동적개선}}</w:t>
             </w:r>
@@ -3766,25 +4775,36 @@
               <w:end w:w="70" w:type="dxa"/>
             </w:tcMar>
             <w:tcBorders>
-              <w:top w:val="single" w:sz="8" w:space="0" w:color="666666"/>
+              <w:top w:val="single" w:sz="4" w:space="0" w:color="B5C1CC"/>
               <w:start w:val="single" w:sz="8" w:space="0" w:color="666666"/>
-              <w:bottom w:val="single" w:sz="8" w:space="0" w:color="666666"/>
+              <w:bottom w:val="single" w:sz="4" w:space="0" w:color="B5C1CC"/>
               <w:end w:val="single" w:sz="8" w:space="0" w:color="666666"/>
               <w:insideH w:val="single" w:sz="8" w:space="0" w:color="666666"/>
               <w:insideV w:val="single" w:sz="8" w:space="0" w:color="666666"/>
+              <w:left w:val="single" w:sz="4" w:color="B5C1CC"/>
+              <w:right w:val="single" w:sz="4" w:color="B5C1CC"/>
             </w:tcBorders>
+            <w:shd w:fill="F2F5F8"/>
           </w:tcPr>
           <w:p>
             <w:pPr>
-              <w:spacing w:before="0" w:after="0" w:line="240" w:lineRule="auto"/>
+              <w:spacing w:before="40" w:after="40" w:line="276" w:lineRule="auto"/>
               <w:jc w:val="center"/>
             </w:pPr>
-            <w:r/>
             <w:r>
               <w:rPr>
-                <w:rFonts w:ascii="NanumSquare" w:hAnsi="NanumSquare" w:eastAsia="NanumSquare"/>
+                <w:rFonts w:ascii="맑은 고딕" w:hAnsi="맑은 고딕" w:eastAsia="맑은 고딕"/>
                 <w:b w:val="0"/>
-                <w:sz w:val="16"/>
+                <w:color w:val="222222"/>
+                <w:sz w:val="17"/>
+              </w:rPr>
+            </w:r>
+            <w:r>
+              <w:rPr>
+                <w:rFonts w:ascii="맑은 고딕" w:hAnsi="맑은 고딕" w:eastAsia="맑은 고딕"/>
+                <w:b w:val="0"/>
+                <w:color w:val="222222"/>
+                <w:sz w:val="17"/>
               </w:rPr>
               <w:t>개선 우선순위</w:t>
             </w:r>
@@ -3801,25 +4821,35 @@
               <w:end w:w="70" w:type="dxa"/>
             </w:tcMar>
             <w:tcBorders>
-              <w:top w:val="single" w:sz="8" w:space="0" w:color="666666"/>
+              <w:top w:val="single" w:sz="4" w:space="0" w:color="B5C1CC"/>
               <w:start w:val="single" w:sz="8" w:space="0" w:color="666666"/>
-              <w:bottom w:val="single" w:sz="8" w:space="0" w:color="666666"/>
+              <w:bottom w:val="single" w:sz="4" w:space="0" w:color="B5C1CC"/>
               <w:end w:val="single" w:sz="8" w:space="0" w:color="666666"/>
               <w:insideH w:val="single" w:sz="8" w:space="0" w:color="666666"/>
               <w:insideV w:val="single" w:sz="8" w:space="0" w:color="666666"/>
+              <w:left w:val="single" w:sz="4" w:color="B5C1CC"/>
+              <w:right w:val="single" w:sz="4" w:color="B5C1CC"/>
             </w:tcBorders>
           </w:tcPr>
           <w:p>
             <w:pPr>
-              <w:spacing w:before="0" w:after="0" w:line="240" w:lineRule="auto"/>
+              <w:spacing w:before="40" w:after="40" w:line="276" w:lineRule="auto"/>
               <w:jc w:val="center"/>
             </w:pPr>
-            <w:r/>
             <w:r>
               <w:rPr>
-                <w:rFonts w:ascii="NanumSquare" w:hAnsi="NanumSquare" w:eastAsia="NanumSquare"/>
-                <w:b/>
-                <w:sz w:val="16"/>
+                <w:rFonts w:ascii="맑은 고딕" w:hAnsi="맑은 고딕" w:eastAsia="맑은 고딕"/>
+                <w:b w:val="0"/>
+                <w:color w:val="222222"/>
+                <w:sz w:val="17"/>
+              </w:rPr>
+            </w:r>
+            <w:r>
+              <w:rPr>
+                <w:rFonts w:ascii="맑은 고딕" w:hAnsi="맑은 고딕" w:eastAsia="맑은 고딕"/>
+                <w:b w:val="0"/>
+                <w:color w:val="222222"/>
+                <w:sz w:val="17"/>
               </w:rPr>
               <w:t>{{개선우선순위}}</w:t>
             </w:r>
@@ -3829,26 +4859,29 @@
     </w:tbl>
     <w:p>
       <w:pPr>
-        <w:spacing w:before="80" w:after="80" w:line="240" w:lineRule="auto"/>
+        <w:keepNext/>
+        <w:spacing w:before="180" w:after="100" w:line="300" w:lineRule="auto"/>
       </w:pPr>
       <w:r>
         <w:rPr>
-          <w:rFonts w:ascii="NanumSquare" w:hAnsi="NanumSquare" w:eastAsia="NanumSquare"/>
+          <w:rFonts w:ascii="맑은 고딕" w:hAnsi="맑은 고딕" w:eastAsia="맑은 고딕"/>
           <w:b/>
-          <w:sz w:val="21"/>
+          <w:color w:val="24477E"/>
+          <w:sz w:val="22"/>
         </w:rPr>
         <w:t>■ 종합의견</w:t>
       </w:r>
     </w:p>
     <w:p>
       <w:pPr>
-        <w:spacing w:before="0" w:after="0" w:line="264" w:lineRule="auto"/>
+        <w:spacing w:before="0" w:after="60" w:line="300" w:lineRule="auto"/>
       </w:pPr>
       <w:r>
         <w:rPr>
-          <w:rFonts w:ascii="NanumSquare" w:hAnsi="NanumSquare" w:eastAsia="NanumSquare"/>
+          <w:rFonts w:ascii="맑은 고딕" w:hAnsi="맑은 고딕" w:eastAsia="맑은 고딕"/>
           <w:b w:val="0"/>
-          <w:sz w:val="16"/>
+          <w:color w:val="222222"/>
+          <w:sz w:val="18"/>
         </w:rPr>
         <w:t>{{종합의견}}</w:t>
       </w:r>
@@ -3857,7 +4890,7 @@
       <w:headerReference w:type="default" r:id="rId9"/>
       <w:footerReference w:type="default" r:id="rId10"/>
       <w:pgSz w:w="11906" w:h="16838"/>
-      <w:pgMar w:top="680" w:right="454" w:bottom="567" w:left="454" w:header="227" w:footer="283" w:gutter="0"/>
+      <w:pgMar w:top="1020" w:right="1020" w:bottom="964" w:left="1020" w:header="227" w:footer="283" w:gutter="0"/>
       <w:cols w:space="720"/>
       <w:docGrid w:linePitch="360"/>
     </w:sectPr>
@@ -3880,6 +4913,15 @@
         <w:sz w:val="14"/>
       </w:rPr>
     </w:r>
+    <w:r>
+      <w:rPr>
+        <w:rFonts w:ascii="맑은 고딕" w:hAnsi="맑은 고딕" w:eastAsia="맑은 고딕"/>
+        <w:color w:val="697A8C"/>
+        <w:sz w:val="16"/>
+      </w:rPr>
+      <w:t xml:space="preserve">안전보건 · 근골격계 유해요인 조사  |  </w:t>
+    </w:r>
+    <w:fldSimple w:instr="PAGE"/>
   </w:p>
 </w:ftr>
 </file>
@@ -4270,7 +5312,8 @@
     <w:qFormat/>
     <w:rsid w:val="00FC693F"/>
     <w:rPr>
-      <w:rFonts w:ascii="NanumSquare" w:hAnsi="NanumSquare" w:eastAsia="NanumSquare"/>
+      <w:rFonts w:ascii="맑은 고딕" w:hAnsi="맑은 고딕" w:eastAsia="NanumSquare"/>
+      <w:color w:val="222222"/>
       <w:sz w:val="18"/>
     </w:rPr>
   </w:style>

</xml_diff>